<commit_message>
Protocol: name second reviewer, confirm Embase and Scopus access
Co-Authored-By: Claude Opus 5.5 <noreply@anthropic.com>
Claude-Session: https://claude.ai/code/session_01FRD7etKqYN8v2bbXeeLMRW
</commit_message>
<xml_diff>
--- a/Systematic review protocol - PROSPERO draft.docx
+++ b/Systematic review protocol - PROSPERO draft.docx
@@ -89,7 +89,7 @@
           <w:sz w:val="22"/>
           <w:szCs w:val="22"/>
         </w:rPr>
-        <w:t xml:space="preserve">2. 黄色高亮处需要您填写或确认：第二位审阅人、各成员 ORCID、预计起止日期、所用软件等。</w:t>
+        <w:t xml:space="preserve">2. 黄色高亮处需要您填写或确认：第一位审阅人、统计负责人、各成员 ORCID、预计起止日期、所用软件等。</w:t>
       </w:r>
     </w:p>
     <w:p>
@@ -103,7 +103,7 @@
           <w:sz w:val="22"/>
           <w:szCs w:val="22"/>
         </w:rPr>
-        <w:t xml:space="preserve">3. Embase 和 Scopus 能否使用尚未确认。如果院内或学校无法访问，请在第 5 节和附录 A、B 中删去这两个库，再登记。</w:t>
+        <w:t xml:space="preserve">3. 附录 A 的检索式请图书馆老师在正式检索前核对两点：① MeSH、Emtree 和中文主题词是否存在，名称是否一致；② 知网、万方、SinoMed 当前界面的检索语法。检索完成后在附录 B 逐库记录日期和命中数，并导出全部题录（RIS 或 EndNote 格式）。</w:t>
       </w:r>
     </w:p>
     <w:p>
@@ -117,7 +117,7 @@
           <w:sz w:val="22"/>
           <w:szCs w:val="22"/>
         </w:rPr>
-        <w:t xml:space="preserve">4. 附录 A 的检索式请图书馆老师在正式检索前核对两点：① MeSH、Emtree 和中文主题词是否存在，名称是否一致；② 知网、万方、SinoMed 当前界面的检索语法。检索完成后在附录 B 逐库记录日期和命中数，并导出全部题录（RIS 或 EndNote 格式）。</w:t>
+        <w:t xml:space="preserve">4. “当前进度”一栏已按实情填写：做过初步检索和试点提取，正式筛选和数据提取尚未开始。PROSPERO 不受理数据提取已完成的综述；如被退回，用同一方案在 OSF Registries 登记。</w:t>
       </w:r>
     </w:p>
     <w:p>
@@ -131,7 +131,7 @@
           <w:sz w:val="22"/>
           <w:szCs w:val="22"/>
         </w:rPr>
-        <w:t xml:space="preserve">5. “当前进度”一栏已按实情填写：做过初步检索和试点提取，正式筛选和数据提取尚未开始。PROSPERO 不受理数据提取已完成的综述；如被退回，用同一方案在 OSF Registries 登记。</w:t>
+        <w:t xml:space="preserve">5. 拿到登记号之后再开始正式筛选。先前对 53 篇文献的试点提取不直接进入最终分析，要按本方案重新筛选、由两人独立提取。</w:t>
       </w:r>
     </w:p>
     <w:p>
@@ -145,21 +145,7 @@
           <w:sz w:val="22"/>
           <w:szCs w:val="22"/>
         </w:rPr>
-        <w:t xml:space="preserve">6. 拿到登记号之后再开始正式筛选。先前对 53 篇文献的试点提取不直接进入最终分析，要按本方案重新筛选、由两人独立提取。</w:t>
-      </w:r>
-    </w:p>
-    <w:p>
-      <w:pPr>
-        <w:spacing w:after="80" w:line="300"/>
-        <w:jc w:val="left"/>
-      </w:pPr>
-      <w:r>
-        <w:rPr>
-          <w:rFonts w:ascii="Times New Roman" w:cs="Times New Roman" w:eastAsia="SimSun" w:hAnsi="Times New Roman"/>
-          <w:sz w:val="22"/>
-          <w:szCs w:val="22"/>
-        </w:rPr>
-        <w:t xml:space="preserve">7. 附录 C 是数据提取手册，两位提取人使用同一版本。试提取 10 篇后如需修改，记录修改内容和日期，并在论文中说明。</w:t>
+        <w:t xml:space="preserve">6. 附录 C 是数据提取手册，两位提取人使用同一版本。试提取 10 篇后如需修改，记录修改内容和日期，并在论文中说明。</w:t>
       </w:r>
     </w:p>
     <w:p>
@@ -1427,24 +1413,7 @@
           <w:sz w:val="22"/>
           <w:szCs w:val="22"/>
         </w:rPr>
-        <w:t xml:space="preserve">; independent reviewer 2, </w:t>
-      </w:r>
-      <w:r>
-        <w:rPr>
-          <w:rFonts w:ascii="Times New Roman" w:cs="Times New Roman" w:eastAsia="SimSun" w:hAnsi="Times New Roman"/>
-          <w:sz w:val="22"/>
-          <w:szCs w:val="22"/>
-          <w:highlight w:val="yellow"/>
-        </w:rPr>
-        <w:t xml:space="preserve">[name]</w:t>
-      </w:r>
-      <w:r>
-        <w:rPr>
-          <w:rFonts w:ascii="Times New Roman" w:cs="Times New Roman" w:eastAsia="SimSun" w:hAnsi="Times New Roman"/>
-          <w:sz w:val="22"/>
-          <w:szCs w:val="22"/>
-        </w:rPr>
-        <w:t xml:space="preserve">; adjudicator, Jun Yang; statistical analysis, </w:t>
+        <w:t xml:space="preserve">; independent reviewer 2, Fei Peng; adjudicator, Jun Yang; statistical analysis, </w:t>
       </w:r>
       <w:r>
         <w:rPr>
@@ -1697,41 +1666,7 @@
           <w:sz w:val="22"/>
           <w:szCs w:val="22"/>
         </w:rPr>
-        <w:t xml:space="preserve">We will search MEDLINE (via PubMed), </w:t>
-      </w:r>
-      <w:r>
-        <w:rPr>
-          <w:rFonts w:ascii="Times New Roman" w:cs="Times New Roman" w:eastAsia="SimSun" w:hAnsi="Times New Roman"/>
-          <w:sz w:val="22"/>
-          <w:szCs w:val="22"/>
-          <w:highlight w:val="yellow"/>
-        </w:rPr>
-        <w:t xml:space="preserve">Embase (Embase.com)</w:t>
-      </w:r>
-      <w:r>
-        <w:rPr>
-          <w:rFonts w:ascii="Times New Roman" w:cs="Times New Roman" w:eastAsia="SimSun" w:hAnsi="Times New Roman"/>
-          <w:sz w:val="22"/>
-          <w:szCs w:val="22"/>
-        </w:rPr>
-        <w:t xml:space="preserve">, Web of Science Core Collection, </w:t>
-      </w:r>
-      <w:r>
-        <w:rPr>
-          <w:rFonts w:ascii="Times New Roman" w:cs="Times New Roman" w:eastAsia="SimSun" w:hAnsi="Times New Roman"/>
-          <w:sz w:val="22"/>
-          <w:szCs w:val="22"/>
-          <w:highlight w:val="yellow"/>
-        </w:rPr>
-        <w:t xml:space="preserve">Scopus</w:t>
-      </w:r>
-      <w:r>
-        <w:rPr>
-          <w:rFonts w:ascii="Times New Roman" w:cs="Times New Roman" w:eastAsia="SimSun" w:hAnsi="Times New Roman"/>
-          <w:sz w:val="22"/>
-          <w:szCs w:val="22"/>
-        </w:rPr>
-        <w:t xml:space="preserve">, China National Knowledge Infrastructure (CNKI), Wanfang Data and the China Biology Medicine database (CBM, via SinoMed) from inception to the date of search. Searches combine controlled vocabulary, where available, with free-text synonyms for wandering spleen, splenic torsion and splenopexy. No language, date, age or study-design limits will be applied to the searches. We will also screen the first 200 Google Scholar results sorted by relevance, check the reference lists of all included reports and of previous reviews [1, 5–8], and identify reports citing Ganarin et al. [1] through Web of Science or Google Scholar. Searches will be rerun before the final analysis if more than six months have passed. Full strategies are given in Appendix A, and the search log template in Appendix B.</w:t>
+        <w:t xml:space="preserve">We will search MEDLINE (via PubMed), Embase (Embase.com), Web of Science Core Collection, Scopus, China National Knowledge Infrastructure (CNKI), Wanfang Data and the China Biology Medicine database (CBM, via SinoMed) from inception to the date of search. Searches combine controlled vocabulary, where available, with free-text synonyms for wandering spleen, splenic torsion and splenopexy. No language, date, age or study-design limits will be applied to the searches. We will also screen the first 200 Google Scholar results sorted by relevance, check the reference lists of all included reports and of previous reviews [1, 5–8], and identify reports citing Ganarin et al. [1] through Web of Science or Google Scholar. Searches will be rerun before the final analysis if more than six months have passed. Full strategies are given in Appendix A, and the search log template in Appendix B.</w:t>
       </w:r>
     </w:p>
     <w:p>

</xml_diff>

<commit_message>
Protocol: name Jun Shu as first reviewer
Co-Authored-By: Claude Opus 5.5 <noreply@anthropic.com>
Claude-Session: https://claude.ai/code/session_01FRD7etKqYN8v2bbXeeLMRW
</commit_message>
<xml_diff>
--- a/Systematic review protocol - PROSPERO draft.docx
+++ b/Systematic review protocol - PROSPERO draft.docx
@@ -89,7 +89,7 @@
           <w:sz w:val="22"/>
           <w:szCs w:val="22"/>
         </w:rPr>
-        <w:t xml:space="preserve">2. 黄色高亮处需要您填写或确认：第一位审阅人、统计负责人、各成员 ORCID、预计起止日期、所用软件等。</w:t>
+        <w:t xml:space="preserve">2. 黄色高亮处需要您填写或确认：统计负责人、各成员 ORCID、预计起止日期、所用软件等。</w:t>
       </w:r>
     </w:p>
     <w:p>
@@ -1396,24 +1396,7 @@
           <w:sz w:val="22"/>
           <w:szCs w:val="22"/>
         </w:rPr>
-        <w:t xml:space="preserve">Roles: independent reviewer 1, </w:t>
-      </w:r>
-      <w:r>
-        <w:rPr>
-          <w:rFonts w:ascii="Times New Roman" w:cs="Times New Roman" w:eastAsia="SimSun" w:hAnsi="Times New Roman"/>
-          <w:sz w:val="22"/>
-          <w:szCs w:val="22"/>
-          <w:highlight w:val="yellow"/>
-        </w:rPr>
-        <w:t xml:space="preserve">[name]</w:t>
-      </w:r>
-      <w:r>
-        <w:rPr>
-          <w:rFonts w:ascii="Times New Roman" w:cs="Times New Roman" w:eastAsia="SimSun" w:hAnsi="Times New Roman"/>
-          <w:sz w:val="22"/>
-          <w:szCs w:val="22"/>
-        </w:rPr>
-        <w:t xml:space="preserve">; independent reviewer 2, Fei Peng; adjudicator, Jun Yang; statistical analysis, </w:t>
+        <w:t xml:space="preserve">Roles: independent reviewer 1, Jun Shu; independent reviewer 2, Fei Peng; adjudicator, Jun Yang; statistical analysis, </w:t>
       </w:r>
       <w:r>
         <w:rPr>

</xml_diff>

<commit_message>
Protocol: name Ji Wang for statistical analysis
Co-Authored-By: Claude Opus 5.5 <noreply@anthropic.com>
Claude-Session: https://claude.ai/code/session_01FRD7etKqYN8v2bbXeeLMRW
</commit_message>
<xml_diff>
--- a/Systematic review protocol - PROSPERO draft.docx
+++ b/Systematic review protocol - PROSPERO draft.docx
@@ -89,7 +89,7 @@
           <w:sz w:val="22"/>
           <w:szCs w:val="22"/>
         </w:rPr>
-        <w:t xml:space="preserve">2. 黄色高亮处需要您填写或确认：统计负责人、各成员 ORCID、预计起止日期、所用软件等。</w:t>
+        <w:t xml:space="preserve">2. 黄色高亮处需要您填写或确认：各成员 ORCID、预计起止日期、所用软件等。</w:t>
       </w:r>
     </w:p>
     <w:p>
@@ -1396,24 +1396,7 @@
           <w:sz w:val="22"/>
           <w:szCs w:val="22"/>
         </w:rPr>
-        <w:t xml:space="preserve">Roles: independent reviewer 1, Jun Shu; independent reviewer 2, Fei Peng; adjudicator, Jun Yang; statistical analysis, </w:t>
-      </w:r>
-      <w:r>
-        <w:rPr>
-          <w:rFonts w:ascii="Times New Roman" w:cs="Times New Roman" w:eastAsia="SimSun" w:hAnsi="Times New Roman"/>
-          <w:sz w:val="22"/>
-          <w:szCs w:val="22"/>
-          <w:highlight w:val="yellow"/>
-        </w:rPr>
-        <w:t xml:space="preserve">[name]</w:t>
-      </w:r>
-      <w:r>
-        <w:rPr>
-          <w:rFonts w:ascii="Times New Roman" w:cs="Times New Roman" w:eastAsia="SimSun" w:hAnsi="Times New Roman"/>
-          <w:sz w:val="22"/>
-          <w:szCs w:val="22"/>
-        </w:rPr>
-        <w:t xml:space="preserve">.</w:t>
+        <w:t xml:space="preserve">Roles: independent reviewer 1, Jun Shu; independent reviewer 2, Fei Peng; adjudicator, Jun Yang; statistical analysis, Ji Wang.</w:t>
       </w:r>
     </w:p>
     <w:p>

</xml_diff>

<commit_message>
Protocol: set EndNote for deduplication and R for analysis
Co-Authored-By: Claude Opus 5.5 <noreply@anthropic.com>
Claude-Session: https://claude.ai/code/session_01FRD7etKqYN8v2bbXeeLMRW
</commit_message>
<xml_diff>
--- a/Systematic review protocol - PROSPERO draft.docx
+++ b/Systematic review protocol - PROSPERO draft.docx
@@ -89,7 +89,7 @@
           <w:sz w:val="22"/>
           <w:szCs w:val="22"/>
         </w:rPr>
-        <w:t xml:space="preserve">2. 黄色高亮处需要您填写或确认：各成员 ORCID、预计起止日期、所用软件等。</w:t>
+        <w:t xml:space="preserve">2. 黄色高亮处需要您填写或确认：各成员 ORCID、预计起止日期、预筛校准篇数。</w:t>
       </w:r>
     </w:p>
     <w:p>
@@ -2315,24 +2315,7 @@
           <w:sz w:val="22"/>
           <w:szCs w:val="22"/>
         </w:rPr>
-        <w:t xml:space="preserve">Records will be deduplicated in </w:t>
-      </w:r>
-      <w:r>
-        <w:rPr>
-          <w:rFonts w:ascii="Times New Roman" w:cs="Times New Roman" w:eastAsia="SimSun" w:hAnsi="Times New Roman"/>
-          <w:sz w:val="22"/>
-          <w:szCs w:val="22"/>
-          <w:highlight w:val="yellow"/>
-        </w:rPr>
-        <w:t xml:space="preserve">[EndNote / Zotero]</w:t>
-      </w:r>
-      <w:r>
-        <w:rPr>
-          <w:rFonts w:ascii="Times New Roman" w:cs="Times New Roman" w:eastAsia="SimSun" w:hAnsi="Times New Roman"/>
-          <w:sz w:val="22"/>
-          <w:szCs w:val="22"/>
-        </w:rPr>
-        <w:t xml:space="preserve"> and screened in Rayyan. Two reviewers will independently screen titles and abstracts, then full texts, against the eligibility criteria; disagreements will be resolved by discussion or, if needed, by a third reviewer (JY). Chinese-language reports will be screened by reviewers fluent in Chinese. Before formal screening, both reviewers will screen a calibration set of </w:t>
+        <w:t xml:space="preserve">Records will be deduplicated in EndNote and screened in Rayyan. Two reviewers will independently screen titles and abstracts, then full texts, against the eligibility criteria; disagreements will be resolved by discussion or, if needed, by a third reviewer (JY). Chinese-language reports will be screened by reviewers fluent in Chinese. Before formal screening, both reviewers will screen a calibration set of </w:t>
       </w:r>
       <w:r>
         <w:rPr>
@@ -2590,17 +2573,8 @@
           <w:rFonts w:ascii="Times New Roman" w:cs="Times New Roman" w:eastAsia="SimSun" w:hAnsi="Times New Roman"/>
           <w:sz w:val="22"/>
           <w:szCs w:val="22"/>
-          <w:highlight w:val="yellow"/>
-        </w:rPr>
-        <w:t xml:space="preserve">[R version x.x / Stata version xx]</w:t>
-      </w:r>
-      <w:r>
-        <w:rPr>
-          <w:rFonts w:ascii="Times New Roman" w:cs="Times New Roman" w:eastAsia="SimSun" w:hAnsi="Times New Roman"/>
-          <w:sz w:val="22"/>
-          <w:szCs w:val="22"/>
-        </w:rPr>
-        <w:t xml:space="preserve">.</w:t>
+        </w:rPr>
+        <w:t xml:space="preserve">R (R Foundation for Statistical Computing, Vienna, Austria); the version used will be reported.</w:t>
       </w:r>
     </w:p>
     <w:p>

</xml_diff>

<commit_message>
Protocol: fix screening calibration set at 50 records
Co-Authored-By: Claude Opus 5.5 <noreply@anthropic.com>
Claude-Session: https://claude.ai/code/session_01FRD7etKqYN8v2bbXeeLMRW
</commit_message>
<xml_diff>
--- a/Systematic review protocol - PROSPERO draft.docx
+++ b/Systematic review protocol - PROSPERO draft.docx
@@ -89,7 +89,7 @@
           <w:sz w:val="22"/>
           <w:szCs w:val="22"/>
         </w:rPr>
-        <w:t xml:space="preserve">2. 黄色高亮处需要您填写或确认：各成员 ORCID、预计起止日期、预筛校准篇数。</w:t>
+        <w:t xml:space="preserve">2. 黄色高亮处需要您填写或确认：各成员 ORCID、预计起止日期。</w:t>
       </w:r>
     </w:p>
     <w:p>
@@ -2315,24 +2315,7 @@
           <w:sz w:val="22"/>
           <w:szCs w:val="22"/>
         </w:rPr>
-        <w:t xml:space="preserve">Records will be deduplicated in EndNote and screened in Rayyan. Two reviewers will independently screen titles and abstracts, then full texts, against the eligibility criteria; disagreements will be resolved by discussion or, if needed, by a third reviewer (JY). Chinese-language reports will be screened by reviewers fluent in Chinese. Before formal screening, both reviewers will screen a calibration set of </w:t>
-      </w:r>
-      <w:r>
-        <w:rPr>
-          <w:rFonts w:ascii="Times New Roman" w:cs="Times New Roman" w:eastAsia="SimSun" w:hAnsi="Times New Roman"/>
-          <w:sz w:val="22"/>
-          <w:szCs w:val="22"/>
-          <w:highlight w:val="yellow"/>
-        </w:rPr>
-        <w:t xml:space="preserve">[50]</w:t>
-      </w:r>
-      <w:r>
-        <w:rPr>
-          <w:rFonts w:ascii="Times New Roman" w:cs="Times New Roman" w:eastAsia="SimSun" w:hAnsi="Times New Roman"/>
-          <w:sz w:val="22"/>
-          <w:szCs w:val="22"/>
-        </w:rPr>
-        <w:t xml:space="preserve"> records and discuss discrepancies.</w:t>
+        <w:t xml:space="preserve">Records will be deduplicated in EndNote and screened in Rayyan. Two reviewers will independently screen titles and abstracts, then full texts, against the eligibility criteria; disagreements will be resolved by discussion or, if needed, by a third reviewer (JY). Chinese-language reports will be screened by reviewers fluent in Chinese. Before formal screening, both reviewers will screen a calibration set of 50 records and discuss discrepancies.</w:t>
       </w:r>
     </w:p>
     <w:p>

</xml_diff>

<commit_message>
Protocol: set start and completion dates
Co-Authored-By: Claude Sonnet 5 <noreply@anthropic.com>
Claude-Session: https://claude.ai/code/session_01FRD7etKqYN8v2bbXeeLMRW
</commit_message>
<xml_diff>
--- a/Systematic review protocol - PROSPERO draft.docx
+++ b/Systematic review protocol - PROSPERO draft.docx
@@ -221,33 +221,7 @@
           <w:sz w:val="22"/>
           <w:szCs w:val="22"/>
         </w:rPr>
-        <w:t xml:space="preserve">Start: </w:t>
-      </w:r>
-      <w:r>
-        <w:rPr>
-          <w:rFonts w:ascii="Times New Roman" w:cs="Times New Roman" w:eastAsia="SimSun" w:hAnsi="Times New Roman"/>
-          <w:sz w:val="22"/>
-          <w:szCs w:val="22"/>
-          <w:highlight w:val="yellow"/>
-        </w:rPr>
-        <w:t xml:space="preserve">[dd Month 2026]</w:t>
-      </w:r>
-      <w:r>
-        <w:rPr>
-          <w:rFonts w:ascii="Times New Roman" w:cs="Times New Roman" w:eastAsia="SimSun" w:hAnsi="Times New Roman"/>
-          <w:sz w:val="22"/>
-          <w:szCs w:val="22"/>
-        </w:rPr>
-        <w:t xml:space="preserve">    Completion: </w:t>
-      </w:r>
-      <w:r>
-        <w:rPr>
-          <w:rFonts w:ascii="Times New Roman" w:cs="Times New Roman" w:eastAsia="SimSun" w:hAnsi="Times New Roman"/>
-          <w:sz w:val="22"/>
-          <w:szCs w:val="22"/>
-          <w:highlight w:val="yellow"/>
-        </w:rPr>
-        <w:t xml:space="preserve">[dd Month 2027]</w:t>
+        <w:t xml:space="preserve">Start: 28 September 2026    Completion: 28 June 2027</w:t>
       </w:r>
     </w:p>
     <w:p>

</xml_diff>

<commit_message>
Protocol: clarify ORCID is mandatory only for the registering contact
Co-Authored-By: Claude Sonnet 5 <noreply@anthropic.com>
Claude-Session: https://claude.ai/code/session_01FRD7etKqYN8v2bbXeeLMRW
</commit_message>
<xml_diff>
--- a/Systematic review protocol - PROSPERO draft.docx
+++ b/Systematic review protocol - PROSPERO draft.docx
@@ -89,7 +89,7 @@
           <w:sz w:val="22"/>
           <w:szCs w:val="22"/>
         </w:rPr>
-        <w:t xml:space="preserve">2. 黄色高亮处需要您填写或确认：各成员 ORCID、预计起止日期。</w:t>
+        <w:t xml:space="preserve">2. 黄色高亮处需要您填写或确认：各成员 ORCID（注册账号的通讯人必须有 ORCID，其余成员可留空，见下方审阅团队表格后的说明）。</w:t>
       </w:r>
     </w:p>
     <w:p>
@@ -878,6 +878,22 @@
           <w:szCs w:val="22"/>
         </w:rPr>
         <w:t xml:space="preserve">Review team members</w:t>
+      </w:r>
+    </w:p>
+    <w:p>
+      <w:pPr>
+        <w:spacing w:after="120" w:line="300"/>
+        <w:jc w:val="left"/>
+      </w:pPr>
+      <w:r>
+        <w:rPr>
+          <w:rFonts w:ascii="Times New Roman" w:cs="Times New Roman" w:eastAsia="SimSun" w:hAnsi="Times New Roman"/>
+          <w:i/>
+          <w:iCs/>
+          <w:sz w:val="20"/>
+          <w:szCs w:val="20"/>
+        </w:rPr>
+        <w:t xml:space="preserve">Note: PROSPERO now requires the named contact who creates the account to hold an ORCID (a free, two-minute registration at orcid.org if not already held). ORCID for the other team members below is optional but recommended.</w:t>
       </w:r>
     </w:p>
     <w:tbl>

</xml_diff>

<commit_message>
Protocol: add ORCIDs for Jun Shu and Jun Yang
Co-Authored-By: Claude Sonnet 5 <noreply@anthropic.com>
Claude-Session: https://claude.ai/code/session_01FRD7etKqYN8v2bbXeeLMRW
</commit_message>
<xml_diff>
--- a/Systematic review protocol - PROSPERO draft.docx
+++ b/Systematic review protocol - PROSPERO draft.docx
@@ -1067,9 +1067,8 @@
                 <w:rFonts w:ascii="Times New Roman" w:cs="Times New Roman" w:eastAsia="SimSun" w:hAnsi="Times New Roman"/>
                 <w:sz w:val="18"/>
                 <w:szCs w:val="18"/>
-                <w:highlight w:val="yellow"/>
-              </w:rPr>
-              <w:t xml:space="preserve">[ORCID]</w:t>
+              </w:rPr>
+              <w:t xml:space="preserve">0009-0001-3003-1452</w:t>
             </w:r>
           </w:p>
         </w:tc>
@@ -1142,9 +1141,8 @@
                 <w:rFonts w:ascii="Times New Roman" w:cs="Times New Roman" w:eastAsia="SimSun" w:hAnsi="Times New Roman"/>
                 <w:sz w:val="18"/>
                 <w:szCs w:val="18"/>
-                <w:highlight w:val="yellow"/>
-              </w:rPr>
-              <w:t xml:space="preserve">[ORCID]</w:t>
+              </w:rPr>
+              <w:t xml:space="preserve">0009-0006-0669-4340</w:t>
             </w:r>
           </w:p>
         </w:tc>

</xml_diff>

<commit_message>
Protocol: leave remaining co-author ORCIDs blank; protocol now complete
Co-Authored-By: Claude Sonnet 5 <noreply@anthropic.com>
Claude-Session: https://claude.ai/code/session_01FRD7etKqYN8v2bbXeeLMRW
</commit_message>
<xml_diff>
--- a/Systematic review protocol - PROSPERO draft.docx
+++ b/Systematic review protocol - PROSPERO draft.docx
@@ -1215,9 +1215,8 @@
                 <w:rFonts w:ascii="Times New Roman" w:cs="Times New Roman" w:eastAsia="SimSun" w:hAnsi="Times New Roman"/>
                 <w:sz w:val="18"/>
                 <w:szCs w:val="18"/>
-                <w:highlight w:val="yellow"/>
-              </w:rPr>
-              <w:t xml:space="preserve">[ORCID]</w:t>
+              </w:rPr>
+              <w:t xml:space="preserve">—</w:t>
             </w:r>
           </w:p>
         </w:tc>
@@ -1290,9 +1289,8 @@
                 <w:rFonts w:ascii="Times New Roman" w:cs="Times New Roman" w:eastAsia="SimSun" w:hAnsi="Times New Roman"/>
                 <w:sz w:val="18"/>
                 <w:szCs w:val="18"/>
-                <w:highlight w:val="yellow"/>
-              </w:rPr>
-              <w:t xml:space="preserve">[ORCID]</w:t>
+              </w:rPr>
+              <w:t xml:space="preserve">—</w:t>
             </w:r>
           </w:p>
         </w:tc>
@@ -1365,9 +1363,8 @@
                 <w:rFonts w:ascii="Times New Roman" w:cs="Times New Roman" w:eastAsia="SimSun" w:hAnsi="Times New Roman"/>
                 <w:sz w:val="18"/>
                 <w:szCs w:val="18"/>
-                <w:highlight w:val="yellow"/>
-              </w:rPr>
-              <w:t xml:space="preserve">[ORCID]</w:t>
+              </w:rPr>
+              <w:t xml:space="preserve">—</w:t>
             </w:r>
           </w:p>
         </w:tc>

</xml_diff>

<commit_message>
Protocol: remove Chinese instructions page, ready for registration
Co-Authored-By: Claude Sonnet 5 <noreply@anthropic.com>
Claude-Session: https://claude.ai/code/session_01FRD7etKqYN8v2bbXeeLMRW
</commit_message>
<xml_diff>
--- a/Systematic review protocol - PROSPERO draft.docx
+++ b/Systematic review protocol - PROSPERO draft.docx
@@ -46,106 +46,6 @@
           <w:szCs w:val="22"/>
         </w:rPr>
         <w:t xml:space="preserve">Draft v0.1, 28 September 2026. Prepared for the review team of Wuhan Children's Hospital.</w:t>
-      </w:r>
-    </w:p>
-    <w:p>
-      <w:pPr>
-        <w:spacing w:after="140" w:before="320" w:line="300"/>
-        <w:jc w:val="left"/>
-      </w:pPr>
-      <w:r>
-        <w:rPr>
-          <w:rFonts w:ascii="Times New Roman" w:cs="Times New Roman" w:eastAsia="SimSun" w:hAnsi="Times New Roman"/>
-          <w:b/>
-          <w:bCs/>
-          <w:sz w:val="26"/>
-          <w:szCs w:val="26"/>
-        </w:rPr>
-        <w:t xml:space="preserve">使用说明（正式登记前删除本页）</w:t>
-      </w:r>
-    </w:p>
-    <w:p>
-      <w:pPr>
-        <w:spacing w:after="80" w:line="300"/>
-        <w:jc w:val="left"/>
-      </w:pPr>
-      <w:r>
-        <w:rPr>
-          <w:rFonts w:ascii="Times New Roman" w:cs="Times New Roman" w:eastAsia="SimSun" w:hAnsi="Times New Roman"/>
-          <w:sz w:val="22"/>
-          <w:szCs w:val="22"/>
-        </w:rPr>
-        <w:t xml:space="preserve">1. 本稿按 PROSPERO 登记表的内容组织。英文部分可以逐段复制到网站对应栏目；栏目名称和顺序以登记时网站表格为准。</w:t>
-      </w:r>
-    </w:p>
-    <w:p>
-      <w:pPr>
-        <w:spacing w:after="80" w:line="300"/>
-        <w:jc w:val="left"/>
-      </w:pPr>
-      <w:r>
-        <w:rPr>
-          <w:rFonts w:ascii="Times New Roman" w:cs="Times New Roman" w:eastAsia="SimSun" w:hAnsi="Times New Roman"/>
-          <w:sz w:val="22"/>
-          <w:szCs w:val="22"/>
-        </w:rPr>
-        <w:t xml:space="preserve">2. 黄色高亮处需要您填写或确认：各成员 ORCID（注册账号的通讯人必须有 ORCID，其余成员可留空，见下方审阅团队表格后的说明）。</w:t>
-      </w:r>
-    </w:p>
-    <w:p>
-      <w:pPr>
-        <w:spacing w:after="80" w:line="300"/>
-        <w:jc w:val="left"/>
-      </w:pPr>
-      <w:r>
-        <w:rPr>
-          <w:rFonts w:ascii="Times New Roman" w:cs="Times New Roman" w:eastAsia="SimSun" w:hAnsi="Times New Roman"/>
-          <w:sz w:val="22"/>
-          <w:szCs w:val="22"/>
-        </w:rPr>
-        <w:t xml:space="preserve">3. 附录 A 的检索式请图书馆老师在正式检索前核对两点：① MeSH、Emtree 和中文主题词是否存在，名称是否一致；② 知网、万方、SinoMed 当前界面的检索语法。检索完成后在附录 B 逐库记录日期和命中数，并导出全部题录（RIS 或 EndNote 格式）。</w:t>
-      </w:r>
-    </w:p>
-    <w:p>
-      <w:pPr>
-        <w:spacing w:after="80" w:line="300"/>
-        <w:jc w:val="left"/>
-      </w:pPr>
-      <w:r>
-        <w:rPr>
-          <w:rFonts w:ascii="Times New Roman" w:cs="Times New Roman" w:eastAsia="SimSun" w:hAnsi="Times New Roman"/>
-          <w:sz w:val="22"/>
-          <w:szCs w:val="22"/>
-        </w:rPr>
-        <w:t xml:space="preserve">4. “当前进度”一栏已按实情填写：做过初步检索和试点提取，正式筛选和数据提取尚未开始。PROSPERO 不受理数据提取已完成的综述；如被退回，用同一方案在 OSF Registries 登记。</w:t>
-      </w:r>
-    </w:p>
-    <w:p>
-      <w:pPr>
-        <w:spacing w:after="80" w:line="300"/>
-        <w:jc w:val="left"/>
-      </w:pPr>
-      <w:r>
-        <w:rPr>
-          <w:rFonts w:ascii="Times New Roman" w:cs="Times New Roman" w:eastAsia="SimSun" w:hAnsi="Times New Roman"/>
-          <w:sz w:val="22"/>
-          <w:szCs w:val="22"/>
-        </w:rPr>
-        <w:t xml:space="preserve">5. 拿到登记号之后再开始正式筛选。先前对 53 篇文献的试点提取不直接进入最终分析，要按本方案重新筛选、由两人独立提取。</w:t>
-      </w:r>
-    </w:p>
-    <w:p>
-      <w:pPr>
-        <w:spacing w:after="80" w:line="300"/>
-        <w:jc w:val="left"/>
-      </w:pPr>
-      <w:r>
-        <w:rPr>
-          <w:rFonts w:ascii="Times New Roman" w:cs="Times New Roman" w:eastAsia="SimSun" w:hAnsi="Times New Roman"/>
-          <w:sz w:val="22"/>
-          <w:szCs w:val="22"/>
-        </w:rPr>
-        <w:t xml:space="preserve">6. 附录 C 是数据提取手册，两位提取人使用同一版本。试提取 10 篇后如需修改，记录修改内容和日期，并在论文中说明。</w:t>
       </w:r>
     </w:p>
     <w:p>

</xml_diff>

<commit_message>
Protocol v1.1: apply librarian's revised search strategies
Replace Appendix A search strings for all seven databases with the
librarian-reviewed versions (PubMed proximity searches for phrases
missing from the phrase index, unified synonym lists, split
spleen*/splenic proximity lines, CNKI/Wanfang/CBM term additions),
update Section 5, Appendix B and supplementary sources, add five
verified references, and mark the document as version 1.1 of
PROSPERO CRD420261520329.

Co-Authored-By: Claude Opus 5.5 <noreply@anthropic.com>
Claude-Session: https://claude.ai/code/session_01FRD7etKqYN8v2bbXeeLMRW
</commit_message>
<xml_diff>
--- a/Systematic review protocol - PROSPERO draft.docx
+++ b/Systematic review protocol - PROSPERO draft.docx
@@ -15,7 +15,7 @@
           <w:sz w:val="30"/>
           <w:szCs w:val="30"/>
         </w:rPr>
-        <w:t xml:space="preserve">Systematic review protocol — draft for PROSPERO registration</w:t>
+        <w:t xml:space="preserve">Systematic review protocol — PROSPERO CRD420261520329</w:t>
       </w:r>
     </w:p>
     <w:p>
@@ -36,16 +36,40 @@
     </w:p>
     <w:p>
       <w:pPr>
+        <w:spacing w:after="120" w:line="300"/>
+        <w:jc w:val="left"/>
+      </w:pPr>
+      <w:r>
+        <w:rPr>
+          <w:rFonts w:ascii="Times New Roman" w:cs="Times New Roman" w:eastAsia="SimSun" w:hAnsi="Times New Roman"/>
+          <w:sz w:val="22"/>
+          <w:szCs w:val="22"/>
+        </w:rPr>
+        <w:t xml:space="preserve">Version 1.1, 28 September 2026. Prepared for the review team of Wuhan Children's Hospital.</w:t>
+      </w:r>
+    </w:p>
+    <w:p>
+      <w:pPr>
         <w:spacing w:after="240" w:line="300"/>
-        <w:jc w:val="left"/>
-      </w:pPr>
-      <w:r>
-        <w:rPr>
-          <w:rFonts w:ascii="Times New Roman" w:cs="Times New Roman" w:eastAsia="SimSun" w:hAnsi="Times New Roman"/>
-          <w:sz w:val="22"/>
-          <w:szCs w:val="22"/>
-        </w:rPr>
-        <w:t xml:space="preserve">Draft v0.1, 28 September 2026. Prepared for the review team of Wuhan Children's Hospital.</w:t>
+        <w:jc w:val="both"/>
+      </w:pPr>
+      <w:r>
+        <w:rPr>
+          <w:rFonts w:ascii="Times New Roman" w:cs="Times New Roman" w:eastAsia="SimSun" w:hAnsi="Times New Roman"/>
+          <w:b/>
+          <w:bCs/>
+          <w:sz w:val="20"/>
+          <w:szCs w:val="20"/>
+        </w:rPr>
+        <w:t xml:space="preserve">Version history. </w:t>
+      </w:r>
+      <w:r>
+        <w:rPr>
+          <w:rFonts w:ascii="Times New Roman" w:cs="Times New Roman" w:eastAsia="SimSun" w:hAnsi="Times New Roman"/>
+          <w:sz w:val="20"/>
+          <w:szCs w:val="20"/>
+        </w:rPr>
+        <w:t xml:space="preserve">Version 1.0 (uploaded at registration as draft v0.1). Version 1.1: search strategies (Section 5, Appendices A and B) revised after review by a medical librarian, before the formal searches were run; eligibility criteria, exposures, outcomes and analysis are unchanged.</w:t>
       </w:r>
     </w:p>
     <w:p>
@@ -1517,7 +1541,7 @@
           <w:sz w:val="22"/>
           <w:szCs w:val="22"/>
         </w:rPr>
-        <w:t xml:space="preserve">We will search MEDLINE (via PubMed), Embase (Embase.com), Web of Science Core Collection, Scopus, China National Knowledge Infrastructure (CNKI), Wanfang Data and the China Biology Medicine database (CBM, via SinoMed) from inception to the date of search. Searches combine controlled vocabulary, where available, with free-text synonyms for wandering spleen, splenic torsion and splenopexy. No language, date, age or study-design limits will be applied to the searches. We will also screen the first 200 Google Scholar results sorted by relevance, check the reference lists of all included reports and of previous reviews [1, 5–8], and identify reports citing Ganarin et al. [1] through Web of Science or Google Scholar. Searches will be rerun before the final analysis if more than six months have passed. Full strategies are given in Appendix A, and the search log template in Appendix B.</w:t>
+        <w:t xml:space="preserve">We will search MEDLINE (via PubMed), Embase (Embase.com), Web of Science Core Collection, Scopus, China National Knowledge Infrastructure (CNKI), Wanfang Data and the China Biology Medicine database (CBM, via SinoMed) from inception to the date of search. Searches combine controlled vocabulary, where available, with free-text synonyms for wandering spleen, splenic torsion and splenopexy. No language, date, age or study-design limits will be applied to the searches. The strategies were reviewed by a medical librarian before the formal searches, and the PubMed strategy was test-run on 28 September 2026. We will also screen the first 200 Google Scholar results for the query "wandering spleen" children, sorted by relevance, recording the date and the number of records actually browsed; check the reference lists of all included reports and of previous reviews and larger series [1, 5–12]; and identify reports citing Ganarin et al. [1] through Web of Science or Google Scholar. For each database, the search history page showing the date and the number of records will be saved as a screenshot, and the searches will be reported according to PRISMA-S [13]. Searches will be rerun before the final analysis if more than six months have passed. Full strategies are given in Appendix A, and the search log template in Appendix B.</w:t>
       </w:r>
     </w:p>
     <w:p>
@@ -3238,6 +3262,76 @@
     </w:p>
     <w:p>
       <w:pPr>
+        <w:spacing w:after="60" w:line="300"/>
+        <w:jc w:val="left"/>
+      </w:pPr>
+      <w:r>
+        <w:rPr>
+          <w:rFonts w:ascii="Times New Roman" w:cs="Times New Roman" w:eastAsia="SimSun" w:hAnsi="Times New Roman"/>
+          <w:sz w:val="22"/>
+          <w:szCs w:val="22"/>
+        </w:rPr>
+        <w:t xml:space="preserve">9. Allen KB, Andrews G. Pediatric wandering spleen—the case for splenopexy: review of 35 reported cases in the literature. J Pediatr Surg. 1989;24:432–5.</w:t>
+      </w:r>
+    </w:p>
+    <w:p>
+      <w:pPr>
+        <w:spacing w:after="60" w:line="300"/>
+        <w:jc w:val="left"/>
+      </w:pPr>
+      <w:r>
+        <w:rPr>
+          <w:rFonts w:ascii="Times New Roman" w:cs="Times New Roman" w:eastAsia="SimSun" w:hAnsi="Times New Roman"/>
+          <w:sz w:val="22"/>
+          <w:szCs w:val="22"/>
+        </w:rPr>
+        <w:t xml:space="preserve">10. Soleimani M, Mehrabi A, Kashfi A, et al. Surgical treatment of patients with wandering spleen: report of six cases with a review of the literature. Surg Today. 2007;37:261–9.</w:t>
+      </w:r>
+    </w:p>
+    <w:p>
+      <w:pPr>
+        <w:spacing w:after="60" w:line="300"/>
+        <w:jc w:val="left"/>
+      </w:pPr>
+      <w:r>
+        <w:rPr>
+          <w:rFonts w:ascii="Times New Roman" w:cs="Times New Roman" w:eastAsia="SimSun" w:hAnsi="Times New Roman"/>
+          <w:sz w:val="22"/>
+          <w:szCs w:val="22"/>
+        </w:rPr>
+        <w:t xml:space="preserve">11. Fiquet-Francois C, Belouadah M, Ludot H, et al. Wandering spleen in children: multicenter retrospective study. J Pediatr Surg. 2010;45:1519–24.</w:t>
+      </w:r>
+    </w:p>
+    <w:p>
+      <w:pPr>
+        <w:spacing w:after="60" w:line="300"/>
+        <w:jc w:val="left"/>
+      </w:pPr>
+      <w:r>
+        <w:rPr>
+          <w:rFonts w:ascii="Times New Roman" w:cs="Times New Roman" w:eastAsia="SimSun" w:hAnsi="Times New Roman"/>
+          <w:sz w:val="22"/>
+          <w:szCs w:val="22"/>
+        </w:rPr>
+        <w:t xml:space="preserve">12. Barabino M, Luigiano C, Pellicano R, et al. “Wandering spleen” as a rare cause of recurrent abdominal pain: a systematic review. Minerva Chir. 2019;74:359–63.</w:t>
+      </w:r>
+    </w:p>
+    <w:p>
+      <w:pPr>
+        <w:spacing w:after="60" w:line="300"/>
+        <w:jc w:val="left"/>
+      </w:pPr>
+      <w:r>
+        <w:rPr>
+          <w:rFonts w:ascii="Times New Roman" w:cs="Times New Roman" w:eastAsia="SimSun" w:hAnsi="Times New Roman"/>
+          <w:sz w:val="22"/>
+          <w:szCs w:val="22"/>
+        </w:rPr>
+        <w:t xml:space="preserve">13. Rethlefsen ML, Kirtley S, Waffenschmidt S, et al. PRISMA-S: an extension to the PRISMA Statement for Reporting Literature Searches in Systematic Reviews. Syst Rev. 2021;10:39.</w:t>
+      </w:r>
+    </w:p>
+    <w:p>
+      <w:pPr>
         <w:spacing w:after="140" w:before="320" w:line="300"/>
         <w:jc w:val="left"/>
       </w:pPr>
@@ -3263,7 +3357,7 @@
           <w:sz w:val="22"/>
           <w:szCs w:val="22"/>
         </w:rPr>
-        <w:t xml:space="preserve">Each strategy is the whole search: no language, date, age or publication-type limits. Lines marked “check” depend on a controlled-vocabulary term that must be confirmed in the database's thesaurus before the search is run; drop the line if the term does not exist.</w:t>
+        <w:t xml:space="preserve">Each strategy is the whole search: no language, date, age or publication-type limits. Lines marked “check” depend on a controlled-vocabulary term that must be confirmed in the database's thesaurus before the search is run; drop the line if the term does not exist. The strategies below were revised after review by a medical librarian (version 1.1). In every database, the expression actually displayed after the search is run is the one to record.</w:t>
       </w:r>
     </w:p>
     <w:p>
@@ -3294,7 +3388,7 @@
           <w:sz w:val="18"/>
           <w:szCs w:val="18"/>
         </w:rPr>
-        <w:t xml:space="preserve">#1  "Wandering Spleen"[Mesh]                                   (check)</w:t>
+        <w:t xml:space="preserve">#1  "Wandering Spleen"[Mesh]</w:t>
       </w:r>
     </w:p>
     <w:p>
@@ -3309,7 +3403,7 @@
           <w:sz w:val="18"/>
           <w:szCs w:val="18"/>
         </w:rPr>
-        <w:t xml:space="preserve">#2  "wandering spleen*"[tiab] OR "wandering splenic"[tiab] OR "ectopic spleen*"[tiab] OR "floating spleen*"[tiab] OR "mobile spleen*"[tiab] OR "displaced spleen*"[tiab] OR "migrating spleen*"[tiab] OR splenoptosis[tiab] OR "splenic ptosis"[tiab] OR "splenic ectopia"[tiab] OR "lien migrans"[tiab] OR "splen migrans"[tiab] OR "lien mobilis"[tiab]</w:t>
+        <w:t xml:space="preserve">#2  "wandering spleen*"[tiab] OR "ectopic spleen*"[tiab] OR "floating spleen*"[tiab] OR "mobile spleen*"[tiab] OR "movable spleen*"[tiab] OR "displaced spleen*"[tiab] OR "pelvic spleen*"[tiab] OR "dystopic spleen*"[tiab] OR splenoptosis[tiab] OR "splenic ptosis"[tiab] OR "splenic ectopia"[tiab]</w:t>
       </w:r>
     </w:p>
     <w:p>
@@ -3324,7 +3418,7 @@
           <w:sz w:val="18"/>
           <w:szCs w:val="18"/>
         </w:rPr>
-        <w:t xml:space="preserve">#3  "splenic torsion"[tiab] OR "spleen torsion"[tiab] OR "torsion of the spleen"[tiab] OR "torsion of spleen"[tiab] OR "splenic volvulus"[tiab] OR "volvulus of the spleen"[tiab] OR "splenic pedicle torsion"[tiab] OR "torsion of the splenic pedicle"[tiab]</w:t>
+        <w:t xml:space="preserve">#3  "splenic torsion"[tiab] OR "spleen torsion"[tiab] OR "torsion of spleen"[tiab] OR "splenic volvulus"[tiab] OR "splenic pedicle torsion"[tiab]</w:t>
       </w:r>
     </w:p>
     <w:p>
@@ -3369,23 +3463,7 @@
           <w:sz w:val="18"/>
           <w:szCs w:val="18"/>
         </w:rPr>
-        <w:t xml:space="preserve">#6  #1 OR #2 OR #3 OR #4 OR #5</w:t>
-      </w:r>
-    </w:p>
-    <w:p>
-      <w:pPr>
-        <w:spacing w:after="80" w:before="200" w:line="300"/>
-        <w:jc w:val="left"/>
-      </w:pPr>
-      <w:r>
-        <w:rPr>
-          <w:rFonts w:ascii="Times New Roman" w:cs="Times New Roman" w:eastAsia="SimSun" w:hAnsi="Times New Roman"/>
-          <w:b/>
-          <w:bCs/>
-          <w:sz w:val="22"/>
-          <w:szCs w:val="22"/>
-        </w:rPr>
-        <w:t xml:space="preserve">A2. Embase via Embase.com</w:t>
+        <w:t xml:space="preserve">#6  "spleen torsion"[tiab:~2] OR "splenic torsion"[tiab:~2] OR "spleen volvulus"[tiab:~2] OR "spleen twisted"[tiab:~2] OR "splenic twisted"[tiab:~2] OR "migrating spleen"[tiab:~0] OR "migrating spleens"[tiab:~0] OR "migratory spleen"[tiab:~0]</w:t>
       </w:r>
     </w:p>
     <w:p>
@@ -3400,7 +3478,38 @@
           <w:sz w:val="18"/>
           <w:szCs w:val="18"/>
         </w:rPr>
-        <w:t xml:space="preserve">#1  'wandering spleen'/exp                                     (check in Emtree)</w:t>
+        <w:t xml:space="preserve">#7  #1 OR #2 OR #3 OR #4 OR #5 OR #6</w:t>
+      </w:r>
+    </w:p>
+    <w:p>
+      <w:pPr>
+        <w:spacing w:after="120" w:line="300"/>
+        <w:ind w:left="360"/>
+        <w:jc w:val="both"/>
+      </w:pPr>
+      <w:r>
+        <w:rPr>
+          <w:rFonts w:ascii="Times New Roman" w:cs="Times New Roman" w:eastAsia="SimSun" w:hAnsi="Times New Roman"/>
+          <w:sz w:val="20"/>
+          <w:szCs w:val="20"/>
+        </w:rPr>
+        <w:t xml:space="preserve">“Wandering Spleen”, “Torsion Abnormality” and “Spleen” are confirmed MeSH headings; MeSH has no separate heading for splenic torsion, hence #5. Eight quoted phrases in version 1.0 (“wandering splenic”, “migrating spleen*”, “lien migrans”, “splen migrans”, “lien mobilis”, “torsion of the spleen”, “volvulus of the spleen”, “torsion of the splenic pedicle”) are not in the PubMed phrase index and were silently ignored; they are replaced by the proximity searches in #6. Proximity searching ([tiab:~N]) cannot be combined with truncation (*). A distance of 2, and no proximity term pairing splenic with volvulus, avoid retrieving splenic-flexure volvulus of the colon. In the librarian's test run on 28 September 2026, #7 retrieved 1263 records, against 1187 for version 1.0, with all 1187 retained. These figures served only to check the strategy; the formal search will be run on the PubMed website, with the History and Search Details page saved and all records exported.</w:t>
+      </w:r>
+    </w:p>
+    <w:p>
+      <w:pPr>
+        <w:spacing w:after="80" w:before="200" w:line="300"/>
+        <w:jc w:val="left"/>
+      </w:pPr>
+      <w:r>
+        <w:rPr>
+          <w:rFonts w:ascii="Times New Roman" w:cs="Times New Roman" w:eastAsia="SimSun" w:hAnsi="Times New Roman"/>
+          <w:b/>
+          <w:bCs/>
+          <w:sz w:val="22"/>
+          <w:szCs w:val="22"/>
+        </w:rPr>
+        <w:t xml:space="preserve">A2. Embase via Embase.com</w:t>
       </w:r>
     </w:p>
     <w:p>
@@ -3415,7 +3524,7 @@
           <w:sz w:val="18"/>
           <w:szCs w:val="18"/>
         </w:rPr>
-        <w:t xml:space="preserve">#2  ('wandering spleen*' OR 'wandering splenic' OR 'ectopic spleen*' OR 'floating spleen*' OR 'mobile spleen*' OR 'displaced spleen*' OR 'migrating spleen*' OR splenoptosis OR 'splenic ptosis' OR 'splenic ectopia' OR 'lien migrans' OR 'splen migrans' OR 'lien mobilis'):ti,ab,kw</w:t>
+        <w:t xml:space="preserve">#1  'wandering spleen'/exp                                     (check in Emtree)</w:t>
       </w:r>
     </w:p>
     <w:p>
@@ -3430,7 +3539,7 @@
           <w:sz w:val="18"/>
           <w:szCs w:val="18"/>
         </w:rPr>
-        <w:t xml:space="preserve">#3  ('splenic torsion' OR 'spleen torsion' OR 'torsion of the spleen' OR 'torsion of spleen' OR 'splenic volvulus' OR 'splenic pedicle torsion' OR 'torsion of the splenic pedicle'):ti,ab,kw</w:t>
+        <w:t xml:space="preserve">#2  ('wandering spleen*' OR 'wandering splenic' OR 'ectopic spleen*' OR 'floating spleen*' OR 'mobile spleen*' OR 'movable spleen*' OR 'displaced spleen*' OR 'migrating spleen*' OR 'pelvic spleen*' OR 'dystopic spleen*' OR splenoptosis OR 'splenic ptosis' OR 'splenic ectopia' OR 'lien migrans' OR 'splen migrans' OR 'lien mobilis'):ti,ab,kw</w:t>
       </w:r>
     </w:p>
     <w:p>
@@ -3445,7 +3554,7 @@
           <w:sz w:val="18"/>
           <w:szCs w:val="18"/>
         </w:rPr>
-        <w:t xml:space="preserve">#4  splenopex*:ti,ab,kw</w:t>
+        <w:t xml:space="preserve">#3  ('splenic torsion' OR 'spleen torsion' OR 'torsion of the spleen' OR 'torsion of spleen' OR 'splenic volvulus' OR 'volvulus of the spleen' OR 'splenic pedicle torsion' OR 'torsion of the splenic pedicle'):ti,ab,kw</w:t>
       </w:r>
     </w:p>
     <w:p>
@@ -3460,7 +3569,7 @@
           <w:sz w:val="18"/>
           <w:szCs w:val="18"/>
         </w:rPr>
-        <w:t xml:space="preserve">#5  (spleen* NEAR/3 (torsion* OR twist* OR volvul* OR wander* OR ectopi* OR float*)):ti,ab,kw</w:t>
+        <w:t xml:space="preserve">#4  splenopex*:ti,ab,kw</w:t>
       </w:r>
     </w:p>
     <w:p>
@@ -3475,38 +3584,7 @@
           <w:sz w:val="18"/>
           <w:szCs w:val="18"/>
         </w:rPr>
-        <w:t xml:space="preserve">#6  #1 OR #2 OR #3 OR #4 OR #5</w:t>
-      </w:r>
-    </w:p>
-    <w:p>
-      <w:pPr>
-        <w:spacing w:after="120" w:line="300"/>
-        <w:ind w:left="360"/>
-        <w:jc w:val="left"/>
-      </w:pPr>
-      <w:r>
-        <w:rPr>
-          <w:rFonts w:ascii="Times New Roman" w:cs="Times New Roman" w:eastAsia="SimSun" w:hAnsi="Times New Roman"/>
-          <w:sz w:val="20"/>
-          <w:szCs w:val="20"/>
-        </w:rPr>
-        <w:t xml:space="preserve">If Emtree also has a specific term for splenic torsion, add it to #1 with /exp. Conference abstracts are removed at screening, not by a search limit, so that their number can be reported.</w:t>
-      </w:r>
-    </w:p>
-    <w:p>
-      <w:pPr>
-        <w:spacing w:after="80" w:before="200" w:line="300"/>
-        <w:jc w:val="left"/>
-      </w:pPr>
-      <w:r>
-        <w:rPr>
-          <w:rFonts w:ascii="Times New Roman" w:cs="Times New Roman" w:eastAsia="SimSun" w:hAnsi="Times New Roman"/>
-          <w:b/>
-          <w:bCs/>
-          <w:sz w:val="22"/>
-          <w:szCs w:val="22"/>
-        </w:rPr>
-        <w:t xml:space="preserve">A3. Web of Science Core Collection (Advanced Search)</w:t>
+        <w:t xml:space="preserve">#5  ((spleen* NEAR/3 (torsion* OR twist* OR volvul* OR wander* OR ectopi* OR float* OR dystop* OR ptos*)) OR (splenic NEAR/3 (torsion* OR twist* OR wander* OR dystop*))):ti,ab,kw</w:t>
       </w:r>
     </w:p>
     <w:p>
@@ -3521,7 +3599,22 @@
           <w:sz w:val="18"/>
           <w:szCs w:val="18"/>
         </w:rPr>
-        <w:t xml:space="preserve">TS=("wandering spleen*" OR "wandering splenic" OR "ectopic spleen*" OR "floating spleen*" OR "mobile spleen*" OR "displaced spleen*" OR "migrating spleen*" OR splenoptosis OR "splenic ptosis" OR "splenic ectopia" OR "lien migrans" OR "splen migrans" OR "splenic torsion" OR "spleen torsion" OR "torsion of the spleen" OR "splenic volvulus" OR splenopex* OR (spleen* NEAR/3 (torsion* OR twist* OR volvul* OR wander* OR ectopi* OR float*)))</w:t>
+        <w:t xml:space="preserve">#6  #1 OR #2 OR #3 OR #4 OR #5</w:t>
+      </w:r>
+    </w:p>
+    <w:p>
+      <w:pPr>
+        <w:spacing w:after="120" w:line="300"/>
+        <w:ind w:left="360"/>
+        <w:jc w:val="both"/>
+      </w:pPr>
+      <w:r>
+        <w:rPr>
+          <w:rFonts w:ascii="Times New Roman" w:cs="Times New Roman" w:eastAsia="SimSun" w:hAnsi="Times New Roman"/>
+          <w:sz w:val="20"/>
+          <w:szCs w:val="20"/>
+        </w:rPr>
+        <w:t xml:space="preserve">Before searching, confirm in Emtree that ‘wandering spleen’ is a preferred term; if it maps to another preferred term, use that term with /exp. Then look up spleen torsion, splenic torsion and splenopexy: any that is a separate preferred term is added to #1 with OR and /exp; any that is only a synonym of wandering spleen is not added. Conference abstracts are removed at screening, not by a search limit, so that their number can be reported.</w:t>
       </w:r>
     </w:p>
     <w:p>
@@ -3537,7 +3630,7 @@
           <w:sz w:val="22"/>
           <w:szCs w:val="22"/>
         </w:rPr>
-        <w:t xml:space="preserve">A4. Scopus (Advanced Search)</w:t>
+        <w:t xml:space="preserve">A3. Web of Science Core Collection (Advanced Search)</w:t>
       </w:r>
     </w:p>
     <w:p>
@@ -3552,7 +3645,22 @@
           <w:sz w:val="18"/>
           <w:szCs w:val="18"/>
         </w:rPr>
-        <w:t xml:space="preserve">TITLE-ABS-KEY("wandering spleen*" OR "wandering splenic" OR "ectopic spleen*" OR "floating spleen*" OR "mobile spleen*" OR "displaced spleen*" OR "migrating spleen*" OR splenoptosis OR "splenic ptosis" OR "splenic ectopia" OR "lien migrans" OR "splen migrans" OR "splenic torsion" OR "spleen torsion" OR "torsion of the spleen" OR "splenic volvulus" OR splenopex* OR (spleen* W/3 (torsion* OR twist* OR volvul* OR wander* OR ectopi* OR float*)))</w:t>
+        <w:t xml:space="preserve">TS=("wandering spleen*" OR "wandering splenic" OR "ectopic spleen*" OR "floating spleen*" OR "mobile spleen*" OR "movable spleen*" OR "displaced spleen*" OR "migrating spleen*" OR "pelvic spleen*" OR "dystopic spleen*" OR splenoptosis OR "splenic ptosis" OR "splenic ectopia" OR "lien migrans" OR "splen migrans" OR "lien mobilis" OR "splenic torsion" OR "spleen torsion" OR "torsion of the spleen" OR "torsion of spleen" OR "splenic volvulus" OR "volvulus of the spleen" OR "splenic pedicle torsion" OR "torsion of the splenic pedicle" OR splenopex* OR (spleen* NEAR/3 (torsion* OR twist* OR volvul* OR wander* OR ectopi* OR float* OR dystop* OR ptos*)) OR (splenic NEAR/3 (torsion* OR twist* OR wander* OR dystop*)))</w:t>
+      </w:r>
+    </w:p>
+    <w:p>
+      <w:pPr>
+        <w:spacing w:after="120" w:line="300"/>
+        <w:ind w:left="360"/>
+        <w:jc w:val="both"/>
+      </w:pPr>
+      <w:r>
+        <w:rPr>
+          <w:rFonts w:ascii="Times New Roman" w:cs="Times New Roman" w:eastAsia="SimSun" w:hAnsi="Times New Roman"/>
+          <w:sz w:val="20"/>
+          <w:szCs w:val="20"/>
+        </w:rPr>
+        <w:t xml:space="preserve">Record the Core Collection indexes searched (for example SCI-EXPANDED, ESCI, CPCI-S) and their year coverage, because institutional subscriptions differ.</w:t>
       </w:r>
     </w:p>
     <w:p>
@@ -3568,7 +3676,7 @@
           <w:sz w:val="22"/>
           <w:szCs w:val="22"/>
         </w:rPr>
-        <w:t xml:space="preserve">A5. CNKI 中国知网（专业检索）</w:t>
+        <w:t xml:space="preserve">A4. Scopus (Advanced Search)</w:t>
       </w:r>
     </w:p>
     <w:p>
@@ -3583,14 +3691,14 @@
           <w:sz w:val="18"/>
           <w:szCs w:val="18"/>
         </w:rPr>
-        <w:t xml:space="preserve">TKA=('游走脾'+'异位脾'+'漂浮脾'+'脾下垂'+'脾异位'+'脾脏异位'+'脾扭转'+'脾脏扭转'+'脾蒂扭转'+'脾固定术'+'脾脏固定术')</w:t>
+        <w:t xml:space="preserve">TITLE-ABS-KEY("wandering spleen*" OR "wandering splenic" OR "ectopic spleen*" OR "floating spleen*" OR "mobile spleen*" OR "movable spleen*" OR "displaced spleen*" OR "migrating spleen*" OR "pelvic spleen*" OR "dystopic spleen*" OR splenoptosis OR "splenic ptosis" OR "splenic ectopia" OR "lien migrans" OR "splen migrans" OR "lien mobilis" OR "splenic torsion" OR "spleen torsion" OR "torsion of the spleen" OR "torsion of spleen" OR "splenic volvulus" OR "volvulus of the spleen" OR "splenic pedicle torsion" OR "torsion of the splenic pedicle" OR splenopex* OR (spleen* W/3 (torsion* OR twist* OR volvul* OR wander* OR ectopi* OR float* OR dystop* OR ptos*)) OR (splenic W/3 (torsion* OR twist* OR wander* OR dystop*)))</w:t>
       </w:r>
     </w:p>
     <w:p>
       <w:pPr>
         <w:spacing w:after="120" w:line="300"/>
         <w:ind w:left="360"/>
-        <w:jc w:val="left"/>
+        <w:jc w:val="both"/>
       </w:pPr>
       <w:r>
         <w:rPr>
@@ -3598,7 +3706,7 @@
           <w:sz w:val="20"/>
           <w:szCs w:val="20"/>
         </w:rPr>
-        <w:t xml:space="preserve">TKA 为“篇关摘”（篇名、关键词、摘要）。如当前界面不接受括号内“+”的写法，改为逐词用 OR 连接：TKA='游走脾' OR TKA='异位脾' OR …。不用“游离脾”，因为它在手术描述中常指游离脾脏，会带来大量无关文献。</w:t>
+        <w:t xml:space="preserve">In the proximity terms of A2–A4, spleen* does not match splenic, so splenic is searched separately; it is paired only with torsion*, twist*, wander* and dystop*, because pairing it with volvul* retrieves splenic-flexure volvulus of the colon.</w:t>
       </w:r>
     </w:p>
     <w:p>
@@ -3614,7 +3722,7 @@
           <w:sz w:val="22"/>
           <w:szCs w:val="22"/>
         </w:rPr>
-        <w:t xml:space="preserve">A6. 万方数据（专业检索）</w:t>
+        <w:t xml:space="preserve">A5. CNKI 中国知网（专业检索）</w:t>
       </w:r>
     </w:p>
     <w:p>
@@ -3629,7 +3737,22 @@
           <w:sz w:val="18"/>
           <w:szCs w:val="18"/>
         </w:rPr>
-        <w:t xml:space="preserve">主题:("游走脾" or "异位脾" or "漂浮脾" or "脾下垂" or "脾异位" or "脾脏异位" or "脾扭转" or "脾脏扭转" or "脾蒂扭转" or "脾固定术" or "脾脏固定术")</w:t>
+        <w:t xml:space="preserve">TKA=('游走脾'+'异位脾'+'漂浮脾'+'脾下垂'+'脾异位'+'脾脏异位'+'脾扭转'+'脾脏扭转'+'脾蒂扭转'+'脾固定术'+'脾脏固定术'+'脾固定'+'脾脏固定')</w:t>
+      </w:r>
+    </w:p>
+    <w:p>
+      <w:pPr>
+        <w:spacing w:after="120" w:line="300"/>
+        <w:ind w:left="360"/>
+        <w:jc w:val="both"/>
+      </w:pPr>
+      <w:r>
+        <w:rPr>
+          <w:rFonts w:ascii="Times New Roman" w:cs="Times New Roman" w:eastAsia="SimSun" w:hAnsi="Times New Roman"/>
+          <w:sz w:val="20"/>
+          <w:szCs w:val="20"/>
+        </w:rPr>
+        <w:t xml:space="preserve">TKA 为“篇关摘”（篇名、关键词、摘要）；符号一律用英文半角。如运行时报错，改为逐词用 OR 连接（OR 前后留空格）：TKA='游走脾' OR TKA='异位脾' OR …。不用“游离脾”：它大量命中脾切除、肝移植、胃癌手术中“游离脾脏”的操作描述，而“游离脾扭转”“游离脾蒂扭转”已被‘脾扭转’‘脾蒂扭转’覆盖。正式检索时另单独运行 TKA='游离脾'，只记录命中数并浏览前 100 条，不并入结果；确认基本为无关文献后，在方法部分写明排除理由。</w:t>
       </w:r>
     </w:p>
     <w:p>
@@ -3645,7 +3768,7 @@
           <w:sz w:val="22"/>
           <w:szCs w:val="22"/>
         </w:rPr>
-        <w:t xml:space="preserve">A7. 中国生物医学文献数据库 CBM（SinoMed）</w:t>
+        <w:t xml:space="preserve">A6. 万方数据（专业检索）</w:t>
       </w:r>
     </w:p>
     <w:p>
@@ -3660,14 +3783,14 @@
           <w:sz w:val="18"/>
           <w:szCs w:val="18"/>
         </w:rPr>
-        <w:t xml:space="preserve">"游走脾"[常用字段:智能] OR "异位脾"[常用字段:智能] OR "漂浮脾"[常用字段:智能] OR "脾下垂"[常用字段:智能] OR "脾异位"[常用字段:智能] OR "脾扭转"[常用字段:智能] OR "脾蒂扭转"[常用字段:智能] OR "脾固定术"[常用字段:智能]</w:t>
+        <w:t xml:space="preserve">主题:("游走脾" or "异位脾" or "漂浮脾" or "脾下垂" or "脾异位" or "脾脏异位" or "脾扭转" or "脾脏扭转" or "脾蒂扭转" or "脾固定术" or "脾脏固定术" or "脾固定" or "脾脏固定")</w:t>
       </w:r>
     </w:p>
     <w:p>
       <w:pPr>
         <w:spacing w:after="120" w:line="300"/>
         <w:ind w:left="360"/>
-        <w:jc w:val="left"/>
+        <w:jc w:val="both"/>
       </w:pPr>
       <w:r>
         <w:rPr>
@@ -3675,7 +3798,7 @@
           <w:sz w:val="20"/>
           <w:szCs w:val="20"/>
         </w:rPr>
-        <w:t xml:space="preserve">如 CBM 主题词表中有“游走脾”，加上："游走脾"[不加权:扩展]（check）。</w:t>
+        <w:t xml:space="preserve">“主题”字段包括题名、关键词和摘要；双引号表示精确匹配；冒号、括号、引号均用英文半角。</w:t>
       </w:r>
     </w:p>
     <w:p>
@@ -3691,6 +3814,82 @@
           <w:sz w:val="22"/>
           <w:szCs w:val="22"/>
         </w:rPr>
+        <w:t xml:space="preserve">A7. 中国生物医学文献数据库 CBM（SinoMed）</w:t>
+      </w:r>
+    </w:p>
+    <w:p>
+      <w:pPr>
+        <w:spacing w:after="60" w:line="260"/>
+        <w:ind w:left="360"/>
+        <w:jc w:val="left"/>
+      </w:pPr>
+      <w:r>
+        <w:rPr>
+          <w:rFonts w:ascii="Consolas" w:cs="Consolas" w:eastAsia="SimSun" w:hAnsi="Consolas"/>
+          <w:sz w:val="18"/>
+          <w:szCs w:val="18"/>
+        </w:rPr>
+        <w:t xml:space="preserve">#1  "游走脾"[常用字段:智能] OR "异位脾"[常用字段:智能] OR "漂浮脾"[常用字段:智能] OR "脾下垂"[常用字段:智能] OR "脾异位"[常用字段:智能] OR "脾脏异位"[常用字段:智能] OR "脾扭转"[常用字段:智能] OR "脾脏扭转"[常用字段:智能] OR "脾蒂扭转"[常用字段:智能] OR "脾固定术"[常用字段:智能] OR "脾脏固定术"[常用字段:智能] OR "脾固定"[常用字段:智能] OR "脾脏固定"[常用字段:智能]</w:t>
+      </w:r>
+    </w:p>
+    <w:p>
+      <w:pPr>
+        <w:spacing w:after="60" w:line="260"/>
+        <w:ind w:left="360"/>
+        <w:jc w:val="left"/>
+      </w:pPr>
+      <w:r>
+        <w:rPr>
+          <w:rFonts w:ascii="Consolas" w:cs="Consolas" w:eastAsia="SimSun" w:hAnsi="Consolas"/>
+          <w:sz w:val="18"/>
+          <w:szCs w:val="18"/>
+        </w:rPr>
+        <w:t xml:space="preserve">#2  "游走脾"[不加权:扩展]                                     (check)</w:t>
+      </w:r>
+    </w:p>
+    <w:p>
+      <w:pPr>
+        <w:spacing w:after="60" w:line="260"/>
+        <w:ind w:left="360"/>
+        <w:jc w:val="left"/>
+      </w:pPr>
+      <w:r>
+        <w:rPr>
+          <w:rFonts w:ascii="Consolas" w:cs="Consolas" w:eastAsia="SimSun" w:hAnsi="Consolas"/>
+          <w:sz w:val="18"/>
+          <w:szCs w:val="18"/>
+        </w:rPr>
+        <w:t xml:space="preserve">#3  #1 OR #2</w:t>
+      </w:r>
+    </w:p>
+    <w:p>
+      <w:pPr>
+        <w:spacing w:after="120" w:line="300"/>
+        <w:ind w:left="360"/>
+        <w:jc w:val="both"/>
+      </w:pPr>
+      <w:r>
+        <w:rPr>
+          <w:rFonts w:ascii="Times New Roman" w:cs="Times New Roman" w:eastAsia="SimSun" w:hAnsi="Times New Roman"/>
+          <w:sz w:val="20"/>
+          <w:szCs w:val="20"/>
+        </w:rPr>
+        <w:t xml:space="preserve">#1 在高级检索中用构建器逐词生成，再从检索史复制表达式，以保证语法与当前界面一致。#2：在“主题检索”中输入“游走脾”，选择“不加权、扩展、全部副主题词”后发送到检索框，检索史中会生成 "游走脾"[不加权:扩展]；名称以主题词表显示为准，查不到则删去 #2，#3 改为仅 #1。</w:t>
+      </w:r>
+    </w:p>
+    <w:p>
+      <w:pPr>
+        <w:spacing w:after="80" w:before="200" w:line="300"/>
+        <w:jc w:val="left"/>
+      </w:pPr>
+      <w:r>
+        <w:rPr>
+          <w:rFonts w:ascii="Times New Roman" w:cs="Times New Roman" w:eastAsia="SimSun" w:hAnsi="Times New Roman"/>
+          <w:b/>
+          <w:bCs/>
+          <w:sz w:val="22"/>
+          <w:szCs w:val="22"/>
+        </w:rPr>
         <w:t xml:space="preserve">A8. Supplementary sources</w:t>
       </w:r>
     </w:p>
@@ -3714,7 +3913,7 @@
           <w:sz w:val="22"/>
           <w:szCs w:val="22"/>
         </w:rPr>
-        <w:t xml:space="preserve">Google Scholar: wandering spleen children — first 200 records sorted by relevance.</w:t>
+        <w:t xml:space="preserve">Google Scholar: query "wandering spleen" children (with the quotation marks) — first 200 records sorted by relevance; record the date of the search and the number of records actually browsed.</w:t>
       </w:r>
     </w:p>
     <w:p>
@@ -3737,7 +3936,7 @@
           <w:sz w:val="22"/>
           <w:szCs w:val="22"/>
         </w:rPr>
-        <w:t xml:space="preserve">Backward citation searching: reference lists of all included reports and of previous reviews [1, 5–8].</w:t>
+        <w:t xml:space="preserve">Backward citation searching: reference lists of all included reports and of previous reviews and larger series — Allen and Andrews 1989 [9], Brown et al. 2003 [5], Soleimani et al. 2007 [10], Fiquet-Francois et al. 2010 [11], Lombardi et al. 2014 [6], Alqadi and Saxena 2019 [7], Barabino et al. 2019 [12], Ganarin et al. 2021 [1] and Moore et al. 2023 [8]. Ganarin et al. searched English-language reports from 1990 to 2018 with the single term wandering spleen, so its included studies serve only as a supplementary source.</w:t>
       </w:r>
     </w:p>
     <w:p>
@@ -3813,7 +4012,7 @@
           <w:sz w:val="22"/>
           <w:szCs w:val="22"/>
         </w:rPr>
-        <w:t xml:space="preserve">Complete one row per source on the day of the search. These figures feed the PRISMA flow diagram.</w:t>
+        <w:t xml:space="preserve">Complete one row per source on the day of the search, and save a screenshot of each database's search history page showing the date and the number of records. These records feed the PRISMA flow diagram and the PRISMA-S checklist [13].</w:t>
       </w:r>
     </w:p>
     <w:tbl>
@@ -4340,7 +4539,7 @@
                 <w:sz w:val="18"/>
                 <w:szCs w:val="18"/>
               </w:rPr>
-              <w:t xml:space="preserve">Clarivate</w:t>
+              <w:t xml:space="preserve">Clarivate (list indexes searched)</w:t>
             </w:r>
           </w:p>
         </w:tc>
@@ -4754,7 +4953,7 @@
                 <w:sz w:val="18"/>
                 <w:szCs w:val="18"/>
               </w:rPr>
-              <w:t xml:space="preserve">万方数据</w:t>
+              <w:t xml:space="preserve">CNKI check: TKA='游离脾'</w:t>
             </w:r>
           </w:p>
         </w:tc>
@@ -4778,7 +4977,7 @@
                 <w:sz w:val="18"/>
                 <w:szCs w:val="18"/>
               </w:rPr>
-              <w:t xml:space="preserve">wanfangdata.com.cn</w:t>
+              <w:t xml:space="preserve">not merged; first 100 browsed</w:t>
             </w:r>
           </w:p>
         </w:tc>
@@ -4900,7 +5099,7 @@
                 <w:sz w:val="18"/>
                 <w:szCs w:val="18"/>
               </w:rPr>
-              <w:t xml:space="preserve">CBM</w:t>
+              <w:t xml:space="preserve">万方数据</w:t>
             </w:r>
           </w:p>
         </w:tc>
@@ -4924,7 +5123,7 @@
                 <w:sz w:val="18"/>
                 <w:szCs w:val="18"/>
               </w:rPr>
-              <w:t xml:space="preserve">SinoMed</w:t>
+              <w:t xml:space="preserve">wanfangdata.com.cn</w:t>
             </w:r>
           </w:p>
         </w:tc>
@@ -5046,6 +5245,152 @@
                 <w:sz w:val="18"/>
                 <w:szCs w:val="18"/>
               </w:rPr>
+              <w:t xml:space="preserve">CBM</w:t>
+            </w:r>
+          </w:p>
+        </w:tc>
+        <w:tc>
+          <w:tcPr>
+            <w:tcW w:type="dxa" w:w="1500"/>
+            <w:tcMar>
+              <w:top w:type="dxa" w:w="40"/>
+              <w:left w:type="dxa" w:w="80"/>
+              <w:bottom w:type="dxa" w:w="40"/>
+              <w:right w:type="dxa" w:w="80"/>
+            </w:tcMar>
+          </w:tcPr>
+          <w:p>
+            <w:pPr>
+              <w:spacing w:after="0" w:line="240"/>
+            </w:pPr>
+            <w:r>
+              <w:rPr>
+                <w:rFonts w:ascii="Times New Roman" w:cs="Times New Roman" w:eastAsia="SimSun" w:hAnsi="Times New Roman"/>
+                <w:sz w:val="18"/>
+                <w:szCs w:val="18"/>
+              </w:rPr>
+              <w:t xml:space="preserve">SinoMed</w:t>
+            </w:r>
+          </w:p>
+        </w:tc>
+        <w:tc>
+          <w:tcPr>
+            <w:tcW w:type="dxa" w:w="1200"/>
+            <w:tcMar>
+              <w:top w:type="dxa" w:w="40"/>
+              <w:left w:type="dxa" w:w="80"/>
+              <w:bottom w:type="dxa" w:w="40"/>
+              <w:right w:type="dxa" w:w="80"/>
+            </w:tcMar>
+          </w:tcPr>
+          <w:p>
+            <w:pPr>
+              <w:spacing w:after="0" w:line="240"/>
+            </w:pPr>
+            <w:r>
+              <w:rPr>
+                <w:rFonts w:ascii="Times New Roman" w:cs="Times New Roman" w:eastAsia="SimSun" w:hAnsi="Times New Roman"/>
+                <w:sz w:val="18"/>
+                <w:szCs w:val="18"/>
+              </w:rPr>
+              <w:t xml:space="preserve"/>
+            </w:r>
+          </w:p>
+        </w:tc>
+        <w:tc>
+          <w:tcPr>
+            <w:tcW w:type="dxa" w:w="1300"/>
+            <w:tcMar>
+              <w:top w:type="dxa" w:w="40"/>
+              <w:left w:type="dxa" w:w="80"/>
+              <w:bottom w:type="dxa" w:w="40"/>
+              <w:right w:type="dxa" w:w="80"/>
+            </w:tcMar>
+          </w:tcPr>
+          <w:p>
+            <w:pPr>
+              <w:spacing w:after="0" w:line="240"/>
+            </w:pPr>
+            <w:r>
+              <w:rPr>
+                <w:rFonts w:ascii="Times New Roman" w:cs="Times New Roman" w:eastAsia="SimSun" w:hAnsi="Times New Roman"/>
+                <w:sz w:val="18"/>
+                <w:szCs w:val="18"/>
+              </w:rPr>
+              <w:t xml:space="preserve"/>
+            </w:r>
+          </w:p>
+        </w:tc>
+        <w:tc>
+          <w:tcPr>
+            <w:tcW w:type="dxa" w:w="1300"/>
+            <w:tcMar>
+              <w:top w:type="dxa" w:w="40"/>
+              <w:left w:type="dxa" w:w="80"/>
+              <w:bottom w:type="dxa" w:w="40"/>
+              <w:right w:type="dxa" w:w="80"/>
+            </w:tcMar>
+          </w:tcPr>
+          <w:p>
+            <w:pPr>
+              <w:spacing w:after="0" w:line="240"/>
+            </w:pPr>
+            <w:r>
+              <w:rPr>
+                <w:rFonts w:ascii="Times New Roman" w:cs="Times New Roman" w:eastAsia="SimSun" w:hAnsi="Times New Roman"/>
+                <w:sz w:val="18"/>
+                <w:szCs w:val="18"/>
+              </w:rPr>
+              <w:t xml:space="preserve"/>
+            </w:r>
+          </w:p>
+        </w:tc>
+        <w:tc>
+          <w:tcPr>
+            <w:tcW w:type="dxa" w:w="1300"/>
+            <w:tcMar>
+              <w:top w:type="dxa" w:w="40"/>
+              <w:left w:type="dxa" w:w="80"/>
+              <w:bottom w:type="dxa" w:w="40"/>
+              <w:right w:type="dxa" w:w="80"/>
+            </w:tcMar>
+          </w:tcPr>
+          <w:p>
+            <w:pPr>
+              <w:spacing w:after="0" w:line="240"/>
+            </w:pPr>
+            <w:r>
+              <w:rPr>
+                <w:rFonts w:ascii="Times New Roman" w:cs="Times New Roman" w:eastAsia="SimSun" w:hAnsi="Times New Roman"/>
+                <w:sz w:val="18"/>
+                <w:szCs w:val="18"/>
+              </w:rPr>
+              <w:t xml:space="preserve"/>
+            </w:r>
+          </w:p>
+        </w:tc>
+      </w:tr>
+      <w:tr>
+        <w:tc>
+          <w:tcPr>
+            <w:tcW w:type="dxa" w:w="2000"/>
+            <w:tcMar>
+              <w:top w:type="dxa" w:w="40"/>
+              <w:left w:type="dxa" w:w="80"/>
+              <w:bottom w:type="dxa" w:w="40"/>
+              <w:right w:type="dxa" w:w="80"/>
+            </w:tcMar>
+          </w:tcPr>
+          <w:p>
+            <w:pPr>
+              <w:spacing w:after="0" w:line="240"/>
+            </w:pPr>
+            <w:r>
+              <w:rPr>
+                <w:rFonts w:ascii="Times New Roman" w:cs="Times New Roman" w:eastAsia="SimSun" w:hAnsi="Times New Roman"/>
+                <w:sz w:val="18"/>
+                <w:szCs w:val="18"/>
+              </w:rPr>
               <w:t xml:space="preserve">Google Scholar</w:t>
             </w:r>
           </w:p>
@@ -5070,7 +5415,7 @@
                 <w:sz w:val="18"/>
                 <w:szCs w:val="18"/>
               </w:rPr>
-              <w:t xml:space="preserve">first 200 records</w:t>
+              <w:t xml:space="preserve">first 200 records (number browsed: ___)</w:t>
             </w:r>
           </w:p>
         </w:tc>

</xml_diff>

<commit_message>
Complete CNKI search record; fill Appendix B with as-run data
CNKI database search fully documented: 486 records, exclusion check
for TKA='游离脾' (153 hits, confirmed unrelated — colonic splenic-
flexure mobilisation in colorectal surgery, not splenectomy alone as
originally guessed). Protocol's Appendix A5 note and Appendix B rows
for PubMed and CNKI updated with the actual dates, hit counts and
searcher, replacing blank template rows.

Co-Authored-By: Claude Opus 5.5 <noreply@anthropic.com>
Claude-Session: https://claude.ai/code/session_01FRD7etKqYN8v2bbXeeLMRW
</commit_message>
<xml_diff>
--- a/Systematic review protocol - PROSPERO draft.docx
+++ b/Systematic review protocol - PROSPERO draft.docx
@@ -3752,7 +3752,7 @@
           <w:sz w:val="20"/>
           <w:szCs w:val="20"/>
         </w:rPr>
-        <w:t xml:space="preserve">TKA 为“篇关摘”（篇名、关键词、摘要）；符号一律用英文半角。如运行时报错，改为逐词用 OR 连接（OR 前后留空格）：TKA='游走脾' OR TKA='异位脾' OR …。不用“游离脾”：它大量命中脾切除、肝移植、胃癌手术中“游离脾脏”的操作描述，而“游离脾扭转”“游离脾蒂扭转”已被‘脾扭转’‘脾蒂扭转’覆盖。正式检索时另单独运行 TKA='游离脾'，只记录命中数并浏览前 100 条，不并入结果；确认基本为无关文献后，在方法部分写明排除理由。</w:t>
+        <w:t xml:space="preserve">TKA 为“篇关摘”（篇名、关键词、摘要）；符号一律用英文半角。如运行时报错，改为逐词用 OR 连接（OR 前后留空格）：TKA='游走脾' OR TKA='异位脾' OR …。不用“游离脾”：“游离脾扭转”“游离脾蒂扭转”已被‘脾扭转’‘脾蒂扭转’覆盖，且单独检索显示“游离脾”这一字符串主要命中两类无关文献——结直肠癌手术中“游离结肠脾曲”（脾曲为解剖部位，非脾脏本身）的操作表述，以及脾切除、肝移植、胃癌手术中“脾脏游离”的操作描述。正式检索时另单独运行 TKA='游离脾'（2026-09-28，舒俊检索，共153条），浏览全部标题确认均为上述两类无关文献，不并入正式结果。</w:t>
       </w:r>
     </w:p>
     <w:p>
@@ -4271,7 +4271,7 @@
                 <w:sz w:val="18"/>
                 <w:szCs w:val="18"/>
               </w:rPr>
-              <w:t xml:space="preserve"/>
+              <w:t xml:space="preserve">2026-09-28</w:t>
             </w:r>
           </w:p>
         </w:tc>
@@ -4295,7 +4295,7 @@
                 <w:sz w:val="18"/>
                 <w:szCs w:val="18"/>
               </w:rPr>
-              <w:t xml:space="preserve"/>
+              <w:t xml:space="preserve">inception–2026-09-28</w:t>
             </w:r>
           </w:p>
         </w:tc>
@@ -4319,7 +4319,7 @@
                 <w:sz w:val="18"/>
                 <w:szCs w:val="18"/>
               </w:rPr>
-              <w:t xml:space="preserve"/>
+              <w:t xml:space="preserve">1263</w:t>
             </w:r>
           </w:p>
         </w:tc>
@@ -4343,7 +4343,7 @@
                 <w:sz w:val="18"/>
                 <w:szCs w:val="18"/>
               </w:rPr>
-              <w:t xml:space="preserve"/>
+              <w:t xml:space="preserve">Jun Shu</w:t>
             </w:r>
           </w:p>
         </w:tc>
@@ -4855,7 +4855,7 @@
                 <w:sz w:val="18"/>
                 <w:szCs w:val="18"/>
               </w:rPr>
-              <w:t xml:space="preserve"/>
+              <w:t xml:space="preserve">2026-09-28</w:t>
             </w:r>
           </w:p>
         </w:tc>
@@ -4879,7 +4879,7 @@
                 <w:sz w:val="18"/>
                 <w:szCs w:val="18"/>
               </w:rPr>
-              <w:t xml:space="preserve"/>
+              <w:t xml:space="preserve">inception–2026-09-28</w:t>
             </w:r>
           </w:p>
         </w:tc>
@@ -4903,7 +4903,7 @@
                 <w:sz w:val="18"/>
                 <w:szCs w:val="18"/>
               </w:rPr>
-              <w:t xml:space="preserve"/>
+              <w:t xml:space="preserve">486</w:t>
             </w:r>
           </w:p>
         </w:tc>
@@ -4927,7 +4927,7 @@
                 <w:sz w:val="18"/>
                 <w:szCs w:val="18"/>
               </w:rPr>
-              <w:t xml:space="preserve"/>
+              <w:t xml:space="preserve">Jun Shu</w:t>
             </w:r>
           </w:p>
         </w:tc>
@@ -4977,7 +4977,7 @@
                 <w:sz w:val="18"/>
                 <w:szCs w:val="18"/>
               </w:rPr>
-              <w:t xml:space="preserve">not merged; first 100 browsed</w:t>
+              <w:t xml:space="preserve">153 records, not merged; all titles browsed — mostly "结肠脾曲" (colonic splenic flexure) mobilisation in colorectal surgery, and splenectomy/transplant "脾脏游离" operative steps, none on wandering spleen</w:t>
             </w:r>
           </w:p>
         </w:tc>
@@ -5001,6 +5001,30 @@
                 <w:sz w:val="18"/>
                 <w:szCs w:val="18"/>
               </w:rPr>
+              <w:t xml:space="preserve">2026-09-28</w:t>
+            </w:r>
+          </w:p>
+        </w:tc>
+        <w:tc>
+          <w:tcPr>
+            <w:tcW w:type="dxa" w:w="1300"/>
+            <w:tcMar>
+              <w:top w:type="dxa" w:w="40"/>
+              <w:left w:type="dxa" w:w="80"/>
+              <w:bottom w:type="dxa" w:w="40"/>
+              <w:right w:type="dxa" w:w="80"/>
+            </w:tcMar>
+          </w:tcPr>
+          <w:p>
+            <w:pPr>
+              <w:spacing w:after="0" w:line="240"/>
+            </w:pPr>
+            <w:r>
+              <w:rPr>
+                <w:rFonts w:ascii="Times New Roman" w:cs="Times New Roman" w:eastAsia="SimSun" w:hAnsi="Times New Roman"/>
+                <w:sz w:val="18"/>
+                <w:szCs w:val="18"/>
+              </w:rPr>
               <w:t xml:space="preserve"/>
             </w:r>
           </w:p>
@@ -5025,7 +5049,7 @@
                 <w:sz w:val="18"/>
                 <w:szCs w:val="18"/>
               </w:rPr>
-              <w:t xml:space="preserve"/>
+              <w:t xml:space="preserve">153</w:t>
             </w:r>
           </w:p>
         </w:tc>
@@ -5049,31 +5073,7 @@
                 <w:sz w:val="18"/>
                 <w:szCs w:val="18"/>
               </w:rPr>
-              <w:t xml:space="preserve"/>
-            </w:r>
-          </w:p>
-        </w:tc>
-        <w:tc>
-          <w:tcPr>
-            <w:tcW w:type="dxa" w:w="1300"/>
-            <w:tcMar>
-              <w:top w:type="dxa" w:w="40"/>
-              <w:left w:type="dxa" w:w="80"/>
-              <w:bottom w:type="dxa" w:w="40"/>
-              <w:right w:type="dxa" w:w="80"/>
-            </w:tcMar>
-          </w:tcPr>
-          <w:p>
-            <w:pPr>
-              <w:spacing w:after="0" w:line="240"/>
-            </w:pPr>
-            <w:r>
-              <w:rPr>
-                <w:rFonts w:ascii="Times New Roman" w:cs="Times New Roman" w:eastAsia="SimSun" w:hAnsi="Times New Roman"/>
-                <w:sz w:val="18"/>
-                <w:szCs w:val="18"/>
-              </w:rPr>
-              <w:t xml:space="preserve"/>
+              <w:t xml:space="preserve">Jun Shu</w:t>
             </w:r>
           </w:p>
         </w:tc>

</xml_diff>

<commit_message>
Complete Wanfang search record (423 records)
Save the full export, confirmed complete (423 unique %0 records,
matches the results-page total). Records the document-type-filter
catch (author accidentally restricted to journal/conference papers
on the first run, corrected to 全部) and the patent-hit category not
seen in CNKI/PubMed. Wanfang row of Appendix B filled in, protocol
rebuilt and schema-validated.

Co-Authored-By: Claude Opus 5.5 <noreply@anthropic.com>
Claude-Session: https://claude.ai/code/session_01FRD7etKqYN8v2bbXeeLMRW
</commit_message>
<xml_diff>
--- a/Systematic review protocol - PROSPERO draft.docx
+++ b/Systematic review protocol - PROSPERO draft.docx
@@ -5147,7 +5147,7 @@
                 <w:sz w:val="18"/>
                 <w:szCs w:val="18"/>
               </w:rPr>
-              <w:t xml:space="preserve"/>
+              <w:t xml:space="preserve">2026-09-28</w:t>
             </w:r>
           </w:p>
         </w:tc>
@@ -5171,7 +5171,7 @@
                 <w:sz w:val="18"/>
                 <w:szCs w:val="18"/>
               </w:rPr>
-              <w:t xml:space="preserve"/>
+              <w:t xml:space="preserve">inception–2026-09-28</w:t>
             </w:r>
           </w:p>
         </w:tc>
@@ -5195,7 +5195,7 @@
                 <w:sz w:val="18"/>
                 <w:szCs w:val="18"/>
               </w:rPr>
-              <w:t xml:space="preserve"/>
+              <w:t xml:space="preserve">423</w:t>
             </w:r>
           </w:p>
         </w:tc>
@@ -5219,7 +5219,7 @@
                 <w:sz w:val="18"/>
                 <w:szCs w:val="18"/>
               </w:rPr>
-              <w:t xml:space="preserve"/>
+              <w:t xml:space="preserve">Jun Shu</w:t>
             </w:r>
           </w:p>
         </w:tc>

</xml_diff>

<commit_message>
Add CBM export (421 records) and fill CBM row in the protocol
Save the SinoMed export as plain-text tagged records; verified 421
unique records matching the 421 search hits, 6/6 Chinese pilot papers
present. Rewrite Appendix A7 in the as-run order and fill the CBM row
of Appendix B; protocol rebuilt and schema-validated.

Co-Authored-By: Claude Sonnet 5.5 <noreply@anthropic.com>
Claude-Session: https://claude.ai/code/session_01FRD7etKqYN8v2bbXeeLMRW
</commit_message>
<xml_diff>
--- a/Systematic review protocol - PROSPERO draft.docx
+++ b/Systematic review protocol - PROSPERO draft.docx
@@ -3829,7 +3829,7 @@
           <w:sz w:val="18"/>
           <w:szCs w:val="18"/>
         </w:rPr>
-        <w:t xml:space="preserve">#1  "游走脾"[常用字段:智能] OR "异位脾"[常用字段:智能] OR "漂浮脾"[常用字段:智能] OR "脾下垂"[常用字段:智能] OR "脾异位"[常用字段:智能] OR "脾脏异位"[常用字段:智能] OR "脾扭转"[常用字段:智能] OR "脾脏扭转"[常用字段:智能] OR "脾蒂扭转"[常用字段:智能] OR "脾固定术"[常用字段:智能] OR "脾脏固定术"[常用字段:智能] OR "脾固定"[常用字段:智能] OR "脾脏固定"[常用字段:智能]</w:t>
+        <w:t xml:space="preserve">#1  "游走脾"[不加权:扩展]</w:t>
       </w:r>
     </w:p>
     <w:p>
@@ -3844,7 +3844,7 @@
           <w:sz w:val="18"/>
           <w:szCs w:val="18"/>
         </w:rPr>
-        <w:t xml:space="preserve">#2  "游走脾"[不加权:扩展]                                     (check)</w:t>
+        <w:t xml:space="preserve">#2  "游走脾"[常用字段:智能] OR "异位脾"[常用字段:智能] OR "漂浮脾"[常用字段:智能] OR "脾下垂"[常用字段:智能] OR "脾异位"[常用字段:智能] OR "脾脏异位"[常用字段:智能] OR "脾扭转"[常用字段:智能] OR "脾脏扭转"[常用字段:智能] OR "脾蒂扭转"[常用字段:智能] OR "脾固定术"[常用字段:智能] OR "脾脏固定术"[常用字段:智能] OR "脾固定"[常用字段:智能] OR "脾脏固定"[常用字段:智能]</w:t>
       </w:r>
     </w:p>
     <w:p>
@@ -3859,7 +3859,7 @@
           <w:sz w:val="18"/>
           <w:szCs w:val="18"/>
         </w:rPr>
-        <w:t xml:space="preserve">#3  #1 OR #2</w:t>
+        <w:t xml:space="preserve">#3  (#2) OR (#1)</w:t>
       </w:r>
     </w:p>
     <w:p>
@@ -3874,7 +3874,7 @@
           <w:sz w:val="20"/>
           <w:szCs w:val="20"/>
         </w:rPr>
-        <w:t xml:space="preserve">#1 在高级检索中用构建器逐词生成，再从检索史复制表达式，以保证语法与当前界面一致。#2：在“主题检索”中输入“游走脾”，选择“不加权、扩展、全部副主题词”后发送到检索框，检索史中会生成 "游走脾"[不加权:扩展]；名称以主题词表显示为准，查不到则删去 #2，#3 改为仅 #1。</w:t>
+        <w:t xml:space="preserve">按实际检索顺序列出（2026-09-29，舒俊）：#1 为主题词“游走脾”，于 SinoMed“主题检索”中确认存在（款目词与主题词均为“游走脾”，主题词表显示 61 篇），检索史中生成 "游走脾"[不加权:扩展]，61 条；#2 为自由词，在高级检索中输入，421 条；#3 为二者合并，421 条。主题词一行未增加任何记录（其 61 条均已包含在 #2 中）。年代栏为空，未勾选二次检索。</w:t>
       </w:r>
     </w:p>
     <w:p>
@@ -5293,7 +5293,7 @@
                 <w:sz w:val="18"/>
                 <w:szCs w:val="18"/>
               </w:rPr>
-              <w:t xml:space="preserve"/>
+              <w:t xml:space="preserve">2026-09-29</w:t>
             </w:r>
           </w:p>
         </w:tc>
@@ -5317,7 +5317,7 @@
                 <w:sz w:val="18"/>
                 <w:szCs w:val="18"/>
               </w:rPr>
-              <w:t xml:space="preserve"/>
+              <w:t xml:space="preserve">inception–2026-09-29</w:t>
             </w:r>
           </w:p>
         </w:tc>
@@ -5341,7 +5341,7 @@
                 <w:sz w:val="18"/>
                 <w:szCs w:val="18"/>
               </w:rPr>
-              <w:t xml:space="preserve"/>
+              <w:t xml:space="preserve">421</w:t>
             </w:r>
           </w:p>
         </w:tc>
@@ -5365,7 +5365,7 @@
                 <w:sz w:val="18"/>
                 <w:szCs w:val="18"/>
               </w:rPr>
-              <w:t xml:space="preserve"/>
+              <w:t xml:space="preserve">Jun Shu</w:t>
             </w:r>
           </w:p>
         </w:tc>

</xml_diff>

<commit_message>
Add WoS export (750 records), recall check and protocol A3/Appendix B WoS entries
Co-Authored-By: Claude Sonnet 5.5 <noreply@anthropic.com>
Claude-Session: https://claude.ai/code/session_01FRD7etKqYN8v2bbXeeLMRW
</commit_message>
<xml_diff>
--- a/Systematic review protocol - PROSPERO draft.docx
+++ b/Systematic review protocol - PROSPERO draft.docx
@@ -3660,7 +3660,7 @@
           <w:sz w:val="20"/>
           <w:szCs w:val="20"/>
         </w:rPr>
-        <w:t xml:space="preserve">Record the Core Collection indexes searched (for example SCI-EXPANDED, ESCI, CPCI-S) and their year coverage, because institutional subscriptions differ.</w:t>
+        <w:t xml:space="preserve">As run on 29 September 2026 (Jun Shu; institutional account; Advanced Search; Web of Science Core Collection, Editions = All, no date range set): 750 records. The subscription covers eight indexes, each from the year shown: SCI-EXPANDED 1997, SSCI 2000, A&amp;HCI 2005, CPCI-S 1998, CPCI-SSH 2001, ESCI 2021, CCR-EXPANDED 1985 and IC 1993 (no Book Citation Index). Coverage is therefore limited by the licence and is not "inception". All 750 records were exported in RIS format (unique accession numbers 750); the export count equals the hit count. Recall check against the 47 English-language pilot reports (first author and year ±1): 40 found; the other 7 (Steinberg 2002, Parisinos 2011, Goyal 2014, Rellum 2014, Torri 2015, Cantone 2016, Umeda 2020) are indexed in PubMed but are not in the Web of Science result set.</w:t>
       </w:r>
     </w:p>
     <w:p>
@@ -4539,7 +4539,7 @@
                 <w:sz w:val="18"/>
                 <w:szCs w:val="18"/>
               </w:rPr>
-              <w:t xml:space="preserve">Clarivate (list indexes searched)</w:t>
+              <w:t xml:space="preserve">Clarivate, institutional account; Editions = All: SCI-EXPANDED 1997–, SSCI 2000–, A&amp;HCI 2005–, CPCI-S 1998–, CPCI-SSH 2001–, ESCI 2021–, CCR-EXPANDED 1985–, IC 1993–</w:t>
             </w:r>
           </w:p>
         </w:tc>
@@ -4563,7 +4563,7 @@
                 <w:sz w:val="18"/>
                 <w:szCs w:val="18"/>
               </w:rPr>
-              <w:t xml:space="preserve"/>
+              <w:t xml:space="preserve">2026-09-29</w:t>
             </w:r>
           </w:p>
         </w:tc>
@@ -4587,7 +4587,7 @@
                 <w:sz w:val="18"/>
                 <w:szCs w:val="18"/>
               </w:rPr>
-              <w:t xml:space="preserve"/>
+              <w:t xml:space="preserve">by index (see left)–2026-09-29</w:t>
             </w:r>
           </w:p>
         </w:tc>
@@ -4611,7 +4611,7 @@
                 <w:sz w:val="18"/>
                 <w:szCs w:val="18"/>
               </w:rPr>
-              <w:t xml:space="preserve"/>
+              <w:t xml:space="preserve">750</w:t>
             </w:r>
           </w:p>
         </w:tc>
@@ -4635,7 +4635,7 @@
                 <w:sz w:val="18"/>
                 <w:szCs w:val="18"/>
               </w:rPr>
-              <w:t xml:space="preserve"/>
+              <w:t xml:space="preserve">Jun Shu</w:t>
             </w:r>
           </w:p>
         </w:tc>

</xml_diff>

<commit_message>
Close Scopus: title check shows the 4 recall misses are a coverage gap; add protocol A4 note and Appendix B row
Co-Authored-By: Claude Sonnet 5.5 <noreply@anthropic.com>
Claude-Session: https://claude.ai/code/session_01FRD7etKqYN8v2bbXeeLMRW
</commit_message>
<xml_diff>
--- a/Systematic review protocol - PROSPERO draft.docx
+++ b/Systematic review protocol - PROSPERO draft.docx
@@ -3707,6 +3707,21 @@
           <w:szCs w:val="20"/>
         </w:rPr>
         <w:t xml:space="preserve">In the proximity terms of A2–A4, spleen* does not match splenic, so splenic is searched separately; it is paired only with torsion*, twist*, wander* and dystop*, because pairing it with volvul* retrieves splenic-flexure volvulus of the colon.</w:t>
+      </w:r>
+    </w:p>
+    <w:p>
+      <w:pPr>
+        <w:spacing w:after="120" w:line="300"/>
+        <w:ind w:left="360"/>
+        <w:jc w:val="both"/>
+      </w:pPr>
+      <w:r>
+        <w:rPr>
+          <w:rFonts w:ascii="Times New Roman" w:cs="Times New Roman" w:eastAsia="SimSun" w:hAnsi="Times New Roman"/>
+          <w:sz w:val="20"/>
+          <w:szCs w:val="20"/>
+        </w:rPr>
+        <w:t xml:space="preserve">As run on 29 September 2026 (Jun Shu; accessed through VPN; Scopus advanced query, Documents tab only; no date, language, document-type or other limits set): 1,563 records. The Preprints and Secondary documents tabs were not searched. All 1,563 records were exported in RIS format (1,563 unique Scopus identifiers); the export count equals the hit count. Recall check against the 47 English-language pilot reports (first author and year ±1): 43 found; the other 4 (Goyal 2014, Rellum 2014, Cantone 2016, Bhambu 2023) are indexed in PubMed but are not in the Scopus result set. A title-phrase search for the four papers on 29 September 2026, together with one control title known to be in the export, retrieved only the control, so the four are not covered by Scopus (Documents) and the gap is one of coverage, not of the search string.</w:t>
       </w:r>
     </w:p>
     <w:p>
@@ -4685,7 +4700,7 @@
                 <w:sz w:val="18"/>
                 <w:szCs w:val="18"/>
               </w:rPr>
-              <w:t xml:space="preserve">Elsevier</w:t>
+              <w:t xml:space="preserve">Elsevier, VPN; advanced query, Documents tab only (Preprints and Secondary documents not searched); no filters</w:t>
             </w:r>
           </w:p>
         </w:tc>
@@ -4709,7 +4724,7 @@
                 <w:sz w:val="18"/>
                 <w:szCs w:val="18"/>
               </w:rPr>
-              <w:t xml:space="preserve"/>
+              <w:t xml:space="preserve">2026-09-29</w:t>
             </w:r>
           </w:p>
         </w:tc>
@@ -4733,7 +4748,7 @@
                 <w:sz w:val="18"/>
                 <w:szCs w:val="18"/>
               </w:rPr>
-              <w:t xml:space="preserve"/>
+              <w:t xml:space="preserve">no date limit–2026-09-29</w:t>
             </w:r>
           </w:p>
         </w:tc>
@@ -4757,7 +4772,7 @@
                 <w:sz w:val="18"/>
                 <w:szCs w:val="18"/>
               </w:rPr>
-              <w:t xml:space="preserve"/>
+              <w:t xml:space="preserve">1563</w:t>
             </w:r>
           </w:p>
         </w:tc>
@@ -4781,7 +4796,7 @@
                 <w:sz w:val="18"/>
                 <w:szCs w:val="18"/>
               </w:rPr>
-              <w:t xml:space="preserve"/>
+              <w:t xml:space="preserve">Jun Shu</w:t>
             </w:r>
           </w:p>
         </w:tc>

</xml_diff>

<commit_message>
Document Embase as not searched (access lost) in protocol A2/Appendix B and project log
Co-Authored-By: Claude Sonnet 5.5 <noreply@anthropic.com>
Claude-Session: https://claude.ai/code/session_01FRD7etKqYN8v2bbXeeLMRW
</commit_message>
<xml_diff>
--- a/Systematic review protocol - PROSPERO draft.docx
+++ b/Systematic review protocol - PROSPERO draft.docx
@@ -3615,6 +3615,21 @@
           <w:szCs w:val="20"/>
         </w:rPr>
         <w:t xml:space="preserve">Before searching, confirm in Emtree that ‘wandering spleen’ is a preferred term; if it maps to another preferred term, use that term with /exp. Then look up spleen torsion, splenic torsion and splenopexy: any that is a separate preferred term is added to #1 with OR and /exp; any that is only a synonym of wandering spleen is not added. Conference abstracts are removed at screening, not by a search limit, so that their number can be reported.</w:t>
+      </w:r>
+    </w:p>
+    <w:p>
+      <w:pPr>
+        <w:spacing w:after="120" w:line="300"/>
+        <w:ind w:left="360"/>
+        <w:jc w:val="both"/>
+      </w:pPr>
+      <w:r>
+        <w:rPr>
+          <w:rFonts w:ascii="Times New Roman" w:cs="Times New Roman" w:eastAsia="SimSun" w:hAnsi="Times New Roman"/>
+          <w:sz w:val="20"/>
+          <w:szCs w:val="20"/>
+        </w:rPr>
+        <w:t xml:space="preserve">Status on 4 October 2026: Embase was not searched. On 29 September 2026 the Embase.com site was reached through the institutional route and the Emtree check described above was done (wandering spleen and splenopexy are preferred terms, with synonyms; spleen torsion and splenic torsion are candidate terms only), but no search was run in that session. On 4 October 2026 the site no longer recognised the institutional entitlement (the page stated that the account did not have direct access to Embase, and the Check access button did not lead to a login), and access could not be restored. No records were retrieved from Embase. If access is obtained later through a librarian or a colleague with a licence, the first line should read 'wandering spleen'/exp OR 'splenopexy'/exp, followed by lines #2 to #5 above and a final OR line, and the date, searcher and route must be logged. Otherwise this is reported as a deviation from the registered protocol, in the PROSPERO amendment, the Methods and the Limitations.</w:t>
       </w:r>
     </w:p>
     <w:p>
@@ -4408,7 +4423,7 @@
                 <w:sz w:val="18"/>
                 <w:szCs w:val="18"/>
               </w:rPr>
-              <w:t xml:space="preserve">Embase.com</w:t>
+              <w:t xml:space="preserve">Embase.com — NOT SEARCHED: institutional access not available on 4 October 2026 (Emtree check only, 29 September 2026); see note under A2</w:t>
             </w:r>
           </w:p>
         </w:tc>
@@ -4480,7 +4495,7 @@
                 <w:sz w:val="18"/>
                 <w:szCs w:val="18"/>
               </w:rPr>
-              <w:t xml:space="preserve"/>
+              <w:t xml:space="preserve">0</w:t>
             </w:r>
           </w:p>
         </w:tc>

</xml_diff>

<commit_message>
Close the search phase: record Google Scholar and citation-searching omissions in protocol A8/Appendix B
Co-Authored-By: Claude Sonnet 5.5 <noreply@anthropic.com>
Claude-Session: https://claude.ai/code/session_01FRD7etKqYN8v2bbXeeLMRW
</commit_message>
<xml_diff>
--- a/Systematic review protocol - PROSPERO draft.docx
+++ b/Systematic review protocol - PROSPERO draft.docx
@@ -4013,6 +4013,21 @@
           <w:szCs w:val="22"/>
         </w:rPr>
         <w:t xml:space="preserve">Authors of series reported only in aggregate: individual data requested by email (Section 14).</w:t>
+      </w:r>
+    </w:p>
+    <w:p>
+      <w:pPr>
+        <w:spacing w:after="120" w:line="300"/>
+        <w:ind w:left="360"/>
+        <w:jc w:val="both"/>
+      </w:pPr>
+      <w:r>
+        <w:rPr>
+          <w:rFonts w:ascii="Times New Roman" w:cs="Times New Roman" w:eastAsia="SimSun" w:hAnsi="Times New Roman"/>
+          <w:sz w:val="20"/>
+          <w:szCs w:val="20"/>
+        </w:rPr>
+        <w:t xml:space="preserve">Status on 4 October 2026: the supplementary sources were not completed. (1) Google Scholar was not searched: Google returned its unusual-traffic block page and no results were seen. (2) Forward citation searching of Ganarin et al. 2021 was started on 4 October 2026 (Jun Shu): the cited-by lists in Web of Science and in Scopus each showed 13 documents, but the lists were not exported and therefore were not screened. (3) Backward citation searching of the reference lists of the previous reviews listed above was not done. (4) Backward citation searching of the included reports depends on the final included set and has not started. No record from these sources entered the screening set, which consists of the six database searches in A1 and A3 to A7. The omissions are reported as deviations from the registered protocol in the PROSPERO amendment, the Methods and the Limitations.</w:t>
       </w:r>
     </w:p>
     <w:p>
@@ -5445,7 +5460,7 @@
                 <w:sz w:val="18"/>
                 <w:szCs w:val="18"/>
               </w:rPr>
-              <w:t xml:space="preserve">first 200 records (number browsed: ___)</w:t>
+              <w:t xml:space="preserve">NOT SEARCHED — blocked by Google (unusual-traffic page); no results seen</w:t>
             </w:r>
           </w:p>
         </w:tc>
@@ -5469,6 +5484,30 @@
                 <w:sz w:val="18"/>
                 <w:szCs w:val="18"/>
               </w:rPr>
+              <w:t xml:space="preserve">2026-10-04</w:t>
+            </w:r>
+          </w:p>
+        </w:tc>
+        <w:tc>
+          <w:tcPr>
+            <w:tcW w:type="dxa" w:w="1300"/>
+            <w:tcMar>
+              <w:top w:type="dxa" w:w="40"/>
+              <w:left w:type="dxa" w:w="80"/>
+              <w:bottom w:type="dxa" w:w="40"/>
+              <w:right w:type="dxa" w:w="80"/>
+            </w:tcMar>
+          </w:tcPr>
+          <w:p>
+            <w:pPr>
+              <w:spacing w:after="0" w:line="240"/>
+            </w:pPr>
+            <w:r>
+              <w:rPr>
+                <w:rFonts w:ascii="Times New Roman" w:cs="Times New Roman" w:eastAsia="SimSun" w:hAnsi="Times New Roman"/>
+                <w:sz w:val="18"/>
+                <w:szCs w:val="18"/>
+              </w:rPr>
               <w:t xml:space="preserve"/>
             </w:r>
           </w:p>
@@ -5493,31 +5532,7 @@
                 <w:sz w:val="18"/>
                 <w:szCs w:val="18"/>
               </w:rPr>
-              <w:t xml:space="preserve"/>
-            </w:r>
-          </w:p>
-        </w:tc>
-        <w:tc>
-          <w:tcPr>
-            <w:tcW w:type="dxa" w:w="1300"/>
-            <w:tcMar>
-              <w:top w:type="dxa" w:w="40"/>
-              <w:left w:type="dxa" w:w="80"/>
-              <w:bottom w:type="dxa" w:w="40"/>
-              <w:right w:type="dxa" w:w="80"/>
-            </w:tcMar>
-          </w:tcPr>
-          <w:p>
-            <w:pPr>
-              <w:spacing w:after="0" w:line="240"/>
-            </w:pPr>
-            <w:r>
-              <w:rPr>
-                <w:rFonts w:ascii="Times New Roman" w:cs="Times New Roman" w:eastAsia="SimSun" w:hAnsi="Times New Roman"/>
-                <w:sz w:val="18"/>
-                <w:szCs w:val="18"/>
-              </w:rPr>
-              <w:t xml:space="preserve"/>
+              <w:t xml:space="preserve">0</w:t>
             </w:r>
           </w:p>
         </w:tc>
@@ -5591,7 +5606,7 @@
                 <w:sz w:val="18"/>
                 <w:szCs w:val="18"/>
               </w:rPr>
-              <w:t xml:space="preserve">backward / forward</w:t>
+              <w:t xml:space="preserve">Forward (Ganarin 2021 cited-by): lists viewed in WoS (13) and Scopus (13), not exported or screened; backward: not done</w:t>
             </w:r>
           </w:p>
         </w:tc>
@@ -5615,6 +5630,30 @@
                 <w:sz w:val="18"/>
                 <w:szCs w:val="18"/>
               </w:rPr>
+              <w:t xml:space="preserve">2026-10-04</w:t>
+            </w:r>
+          </w:p>
+        </w:tc>
+        <w:tc>
+          <w:tcPr>
+            <w:tcW w:type="dxa" w:w="1300"/>
+            <w:tcMar>
+              <w:top w:type="dxa" w:w="40"/>
+              <w:left w:type="dxa" w:w="80"/>
+              <w:bottom w:type="dxa" w:w="40"/>
+              <w:right w:type="dxa" w:w="80"/>
+            </w:tcMar>
+          </w:tcPr>
+          <w:p>
+            <w:pPr>
+              <w:spacing w:after="0" w:line="240"/>
+            </w:pPr>
+            <w:r>
+              <w:rPr>
+                <w:rFonts w:ascii="Times New Roman" w:cs="Times New Roman" w:eastAsia="SimSun" w:hAnsi="Times New Roman"/>
+                <w:sz w:val="18"/>
+                <w:szCs w:val="18"/>
+              </w:rPr>
               <w:t xml:space="preserve"/>
             </w:r>
           </w:p>
@@ -5639,7 +5678,7 @@
                 <w:sz w:val="18"/>
                 <w:szCs w:val="18"/>
               </w:rPr>
-              <w:t xml:space="preserve"/>
+              <w:t xml:space="preserve">0</w:t>
             </w:r>
           </w:p>
         </w:tc>
@@ -5663,31 +5702,7 @@
                 <w:sz w:val="18"/>
                 <w:szCs w:val="18"/>
               </w:rPr>
-              <w:t xml:space="preserve"/>
-            </w:r>
-          </w:p>
-        </w:tc>
-        <w:tc>
-          <w:tcPr>
-            <w:tcW w:type="dxa" w:w="1300"/>
-            <w:tcMar>
-              <w:top w:type="dxa" w:w="40"/>
-              <w:left w:type="dxa" w:w="80"/>
-              <w:bottom w:type="dxa" w:w="40"/>
-              <w:right w:type="dxa" w:w="80"/>
-            </w:tcMar>
-          </w:tcPr>
-          <w:p>
-            <w:pPr>
-              <w:spacing w:after="0" w:line="240"/>
-            </w:pPr>
-            <w:r>
-              <w:rPr>
-                <w:rFonts w:ascii="Times New Roman" w:cs="Times New Roman" w:eastAsia="SimSun" w:hAnsi="Times New Roman"/>
-                <w:sz w:val="18"/>
-                <w:szCs w:val="18"/>
-              </w:rPr>
-              <w:t xml:space="preserve"/>
+              <w:t xml:space="preserve">Jun Shu</w:t>
             </w:r>
           </w:p>
         </w:tc>

</xml_diff>

<commit_message>
Protocol v1.2 and draft PROSPERO amendment note
Co-Authored-By: Claude Sonnet 5.5 <noreply@anthropic.com>
Claude-Session: https://claude.ai/code/session_01FRD7etKqYN8v2bbXeeLMRW
</commit_message>
<xml_diff>
--- a/Systematic review protocol - PROSPERO draft.docx
+++ b/Systematic review protocol - PROSPERO draft.docx
@@ -45,7 +45,7 @@
           <w:sz w:val="22"/>
           <w:szCs w:val="22"/>
         </w:rPr>
-        <w:t xml:space="preserve">Version 1.1, 28 September 2026. Prepared for the review team of Wuhan Children's Hospital.</w:t>
+        <w:t xml:space="preserve">Version 1.2, 4 October 2026. Prepared for the review team of Wuhan Children's Hospital.</w:t>
       </w:r>
     </w:p>
     <w:p>
@@ -69,7 +69,7 @@
           <w:sz w:val="20"/>
           <w:szCs w:val="20"/>
         </w:rPr>
-        <w:t xml:space="preserve">Version 1.0 (uploaded at registration as draft v0.1). Version 1.1: search strategies (Section 5, Appendices A and B) revised after review by a medical librarian, before the formal searches were run; eligibility criteria, exposures, outcomes and analysis are unchanged.</w:t>
+        <w:t xml:space="preserve">Version 1.0 (uploaded at registration as draft v0.1). Version 1.1: search strategies (Section 5, Appendices A and B) revised after review by a medical librarian, before the formal searches were run; eligibility criteria, exposures, outcomes and analysis are unchanged. Version 1.2 (4 October 2026): as-run details of the formal searches added to Appendices A and B; Embase and Google Scholar were not searched and citation searching was not completed (see Appendices A2, A8 and B); eligibility criteria, exposures, outcomes and analysis are unchanged.</w:t>
       </w:r>
     </w:p>
     <w:p>
@@ -1541,7 +1541,7 @@
           <w:sz w:val="22"/>
           <w:szCs w:val="22"/>
         </w:rPr>
-        <w:t xml:space="preserve">We will search MEDLINE (via PubMed), Embase (Embase.com), Web of Science Core Collection, Scopus, China National Knowledge Infrastructure (CNKI), Wanfang Data and the China Biology Medicine database (CBM, via SinoMed) from inception to the date of search. Searches combine controlled vocabulary, where available, with free-text synonyms for wandering spleen, splenic torsion and splenopexy. No language, date, age or study-design limits will be applied to the searches. The strategies were reviewed by a medical librarian before the formal searches, and the PubMed strategy was test-run on 28 September 2026. We will also screen the first 200 Google Scholar results for the query "wandering spleen" children, sorted by relevance, recording the date and the number of records actually browsed; check the reference lists of all included reports and of previous reviews and larger series [1, 5–12]; and identify reports citing Ganarin et al. [1] through Web of Science or Google Scholar. For each database, the search history page showing the date and the number of records will be saved as a screenshot, and the searches will be reported according to PRISMA-S [13]. Searches will be rerun before the final analysis if more than six months have passed. Full strategies are given in Appendix A, and the search log template in Appendix B.</w:t>
+        <w:t xml:space="preserve">We will search MEDLINE (via PubMed), Embase (Embase.com), Web of Science Core Collection, Scopus, China National Knowledge Infrastructure (CNKI), Wanfang Data and the China Biology Medicine database (CBM, via SinoMed) from inception to the date of search. Searches combine controlled vocabulary, where available, with free-text synonyms for wandering spleen, splenic torsion and splenopexy. No language, date, age or study-design limits will be applied to the searches. The strategies were reviewed by a medical librarian before the formal searches, and the PubMed strategy was test-run on 28 September 2026. We will also screen the first 200 Google Scholar results for the query "wandering spleen" children, sorted by relevance, recording the date and the number of records actually browsed; check the reference lists of all included reports and of previous reviews and larger series [1, 5–12]; and identify reports citing Ganarin et al. [1] through Web of Science or Google Scholar. For each database, the search history page showing the date and the number of records will be saved as a screenshot, and the searches will be reported according to PRISMA-S [13]. Searches will be rerun before the final analysis if more than six months have passed. Deviations from this plan: Embase and Google Scholar were not searched and citation searching was not completed (see Appendices A2, A8 and B). Full strategies are given in Appendix A, and the search log template in Appendix B.</w:t>
       </w:r>
     </w:p>
     <w:p>

</xml_diff>

<commit_message>
Scripted deduplication: 4,906 -> 2,555 unique records, Rayyan-ready RIS and audit trail
Co-Authored-By: Claude Sonnet 5.5 <noreply@anthropic.com>
Claude-Session: https://claude.ai/code/session_01FRD7etKqYN8v2bbXeeLMRW
</commit_message>
<xml_diff>
--- a/Systematic review protocol - PROSPERO draft.docx
+++ b/Systematic review protocol - PROSPERO draft.docx
@@ -5752,36 +5752,60 @@
                 <w:sz w:val="18"/>
                 <w:szCs w:val="18"/>
               </w:rPr>
+              <w:t xml:space="preserve">Rule-based script (tools/dedup.py; tiers: DOI, title+author+year, similar title, author+year+volume+page, title+volume+pages), 4 October 2026; 4,906 identified, 2,351 duplicates removed; EndNote check pending</w:t>
+            </w:r>
+          </w:p>
+        </w:tc>
+        <w:tc>
+          <w:tcPr>
+            <w:tcW w:type="dxa" w:w="1200"/>
+            <w:tcMar>
+              <w:top w:type="dxa" w:w="40"/>
+              <w:left w:type="dxa" w:w="80"/>
+              <w:bottom w:type="dxa" w:w="40"/>
+              <w:right w:type="dxa" w:w="80"/>
+            </w:tcMar>
+          </w:tcPr>
+          <w:p>
+            <w:pPr>
+              <w:spacing w:after="0" w:line="240"/>
+            </w:pPr>
+            <w:r>
+              <w:rPr>
+                <w:rFonts w:ascii="Times New Roman" w:cs="Times New Roman" w:eastAsia="SimSun" w:hAnsi="Times New Roman"/>
+                <w:sz w:val="18"/>
+                <w:szCs w:val="18"/>
+              </w:rPr>
+              <w:t xml:space="preserve">2026-10-04</w:t>
+            </w:r>
+          </w:p>
+        </w:tc>
+        <w:tc>
+          <w:tcPr>
+            <w:tcW w:type="dxa" w:w="1300"/>
+            <w:tcMar>
+              <w:top w:type="dxa" w:w="40"/>
+              <w:left w:type="dxa" w:w="80"/>
+              <w:bottom w:type="dxa" w:w="40"/>
+              <w:right w:type="dxa" w:w="80"/>
+            </w:tcMar>
+          </w:tcPr>
+          <w:p>
+            <w:pPr>
+              <w:spacing w:after="0" w:line="240"/>
+            </w:pPr>
+            <w:r>
+              <w:rPr>
+                <w:rFonts w:ascii="Times New Roman" w:cs="Times New Roman" w:eastAsia="SimSun" w:hAnsi="Times New Roman"/>
+                <w:sz w:val="18"/>
+                <w:szCs w:val="18"/>
+              </w:rPr>
               <w:t xml:space="preserve"/>
             </w:r>
           </w:p>
         </w:tc>
         <w:tc>
           <w:tcPr>
-            <w:tcW w:type="dxa" w:w="1200"/>
-            <w:tcMar>
-              <w:top w:type="dxa" w:w="40"/>
-              <w:left w:type="dxa" w:w="80"/>
-              <w:bottom w:type="dxa" w:w="40"/>
-              <w:right w:type="dxa" w:w="80"/>
-            </w:tcMar>
-          </w:tcPr>
-          <w:p>
-            <w:pPr>
-              <w:spacing w:after="0" w:line="240"/>
-            </w:pPr>
-            <w:r>
-              <w:rPr>
-                <w:rFonts w:ascii="Times New Roman" w:cs="Times New Roman" w:eastAsia="SimSun" w:hAnsi="Times New Roman"/>
-                <w:sz w:val="18"/>
-                <w:szCs w:val="18"/>
-              </w:rPr>
-              <w:t xml:space="preserve"/>
-            </w:r>
-          </w:p>
-        </w:tc>
-        <w:tc>
-          <w:tcPr>
             <w:tcW w:type="dxa" w:w="1300"/>
             <w:tcMar>
               <w:top w:type="dxa" w:w="40"/>
@@ -5800,31 +5824,7 @@
                 <w:sz w:val="18"/>
                 <w:szCs w:val="18"/>
               </w:rPr>
-              <w:t xml:space="preserve"/>
-            </w:r>
-          </w:p>
-        </w:tc>
-        <w:tc>
-          <w:tcPr>
-            <w:tcW w:type="dxa" w:w="1300"/>
-            <w:tcMar>
-              <w:top w:type="dxa" w:w="40"/>
-              <w:left w:type="dxa" w:w="80"/>
-              <w:bottom w:type="dxa" w:w="40"/>
-              <w:right w:type="dxa" w:w="80"/>
-            </w:tcMar>
-          </w:tcPr>
-          <w:p>
-            <w:pPr>
-              <w:spacing w:after="0" w:line="240"/>
-            </w:pPr>
-            <w:r>
-              <w:rPr>
-                <w:rFonts w:ascii="Times New Roman" w:cs="Times New Roman" w:eastAsia="SimSun" w:hAnsi="Times New Roman"/>
-                <w:sz w:val="18"/>
-                <w:szCs w:val="18"/>
-              </w:rPr>
-              <w:t xml:space="preserve"/>
+              <w:t xml:space="preserve">2555</w:t>
             </w:r>
           </w:p>
         </w:tc>

</xml_diff>

<commit_message>
Protocol Section 14: describe scripted deduplication with EndNote check
Co-Authored-By: Claude Sonnet 5.5 <noreply@anthropic.com>
Claude-Session: https://claude.ai/code/session_01FRD7etKqYN8v2bbXeeLMRW
</commit_message>
<xml_diff>
--- a/Systematic review protocol - PROSPERO draft.docx
+++ b/Systematic review protocol - PROSPERO draft.docx
@@ -69,7 +69,7 @@
           <w:sz w:val="20"/>
           <w:szCs w:val="20"/>
         </w:rPr>
-        <w:t xml:space="preserve">Version 1.0 (uploaded at registration as draft v0.1). Version 1.1: search strategies (Section 5, Appendices A and B) revised after review by a medical librarian, before the formal searches were run; eligibility criteria, exposures, outcomes and analysis are unchanged. Version 1.2 (4 October 2026): as-run details of the formal searches added to Appendices A and B; Embase and Google Scholar were not searched and citation searching was not completed (see Appendices A2, A8 and B); eligibility criteria, exposures, outcomes and analysis are unchanged.</w:t>
+        <w:t xml:space="preserve">Version 1.0 (uploaded at registration as draft v0.1). Version 1.1: search strategies (Section 5, Appendices A and B) revised after review by a medical librarian, before the formal searches were run; eligibility criteria, exposures, outcomes and analysis are unchanged. Version 1.2 (4 October 2026): as-run details of the formal searches added to Appendices A and B; deduplication done with a documented script and checked in EndNote (Section 14, Appendix B); Embase and Google Scholar were not searched and citation searching was not completed (see Appendices A2, A8 and B); eligibility criteria, exposures, outcomes and analysis are unchanged.</w:t>
       </w:r>
     </w:p>
     <w:p>
@@ -2224,7 +2224,7 @@
           <w:sz w:val="22"/>
           <w:szCs w:val="22"/>
         </w:rPr>
-        <w:t xml:space="preserve">Records will be deduplicated in EndNote and screened in Rayyan. Two reviewers will independently screen titles and abstracts, then full texts, against the eligibility criteria; disagreements will be resolved by discussion or, if needed, by a third reviewer (JY). Chinese-language reports will be screened by reviewers fluent in Chinese. Before formal screening, both reviewers will screen a calibration set of 50 records and discuss discrepancies.</w:t>
+        <w:t xml:space="preserve">Records were deduplicated with a documented, rule-based script (identical DOI; identical title with the same first author and year; similar title with the same first author; same first author, year, volume and first page; and further rules for Chinese-language records and for differently written author names; the tiers are listed in Appendix B), and EndNote’s duplicate finder was then run on the result as a check. The deduplicated records will be screened in Rayyan. Two reviewers will independently screen titles and abstracts, then full texts, against the eligibility criteria; disagreements will be resolved by discussion or, if needed, by a third reviewer (JY). Chinese-language reports will be screened by reviewers fluent in Chinese. Before formal screening, both reviewers will screen a calibration set of 50 records and discuss discrepancies.</w:t>
       </w:r>
     </w:p>
     <w:p>

</xml_diff>

<commit_message>
PROSPERO amendment: protocol v1.3 (screening procedure, stage at amendment) and final amendment text
Protocol Section 14 now records the screening procedure as set up (calibration
result, guide rules, handling of disagreements, title/abstract kappa); a
stage-of-review table at amendment is added; eligibility, exposures, outcomes
and analysis unchanged. Amendment note rewritten with no open items and renamed.

Co-Authored-By: Claude Sonnet 5.5 <noreply@anthropic.com>
Claude-Session: https://claude.ai/code/session_01FRD7etKqYN8v2bbXeeLMRW
</commit_message>
<xml_diff>
--- a/Systematic review protocol - PROSPERO draft.docx
+++ b/Systematic review protocol - PROSPERO draft.docx
@@ -45,7 +45,7 @@
           <w:sz w:val="22"/>
           <w:szCs w:val="22"/>
         </w:rPr>
-        <w:t xml:space="preserve">Version 1.2, 4 October 2026. Prepared for the review team of Wuhan Children's Hospital.</w:t>
+        <w:t xml:space="preserve">Version 1.3, 7 October 2026. Prepared for the review team of Wuhan Children's Hospital.</w:t>
       </w:r>
     </w:p>
     <w:p>
@@ -69,7 +69,7 @@
           <w:sz w:val="20"/>
           <w:szCs w:val="20"/>
         </w:rPr>
-        <w:t xml:space="preserve">Version 1.0 (uploaded at registration as draft v0.1). Version 1.1: search strategies (Section 5, Appendices A and B) revised after review by a medical librarian, before the formal searches were run; eligibility criteria, exposures, outcomes and analysis are unchanged. Version 1.2 (4 October 2026): as-run details of the formal searches added to Appendices A and B; deduplication done with a documented script and checked in EndNote (Section 14, Appendix B); Embase and Google Scholar were not searched and citation searching was not completed (see Appendices A2, A8 and B); eligibility criteria, exposures, outcomes and analysis are unchanged.</w:t>
+        <w:t xml:space="preserve">Version 1.0 (uploaded at registration as draft v0.1). Version 1.1: search strategies (Section 5, Appendices A and B) revised after review by a medical librarian, before the formal searches were run; eligibility criteria, exposures, outcomes and analysis are unchanged. Version 1.2 (4 October 2026): as-run details of the formal searches added to Appendices A and B; deduplication done with a documented script and checked in EndNote (Section 14, Appendix B); Embase and Google Scholar were not searched and citation searching was not completed (see Appendices A2, A8 and B); eligibility criteria, exposures, outcomes and analysis are unchanged. Version 1.3 (7 October 2026, before formal screening started): the screening procedure actually set up (calibration result, screening guide rules, handling of disagreements, agreement reporting) added to Section 14, and the stage of review at amendment added to Section 1; eligibility criteria, exposures, outcomes and analysis are unchanged.</w:t>
       </w:r>
     </w:p>
     <w:p>
@@ -725,6 +725,570 @@
           <w:sz w:val="22"/>
           <w:szCs w:val="22"/>
         </w:rPr>
+        <w:t xml:space="preserve">Stage of review at the time of amendment (version 1.3, 7 October 2026)</w:t>
+      </w:r>
+    </w:p>
+    <w:tbl>
+      <w:tblPr>
+        <w:tblW w:type="dxa" w:w="8600"/>
+        <w:tblBorders>
+          <w:top w:val="single" w:color="auto" w:sz="4"/>
+          <w:left w:val="single" w:color="auto" w:sz="4"/>
+          <w:bottom w:val="single" w:color="auto" w:sz="4"/>
+          <w:right w:val="single" w:color="auto" w:sz="4"/>
+          <w:insideH w:val="single" w:color="auto" w:sz="4"/>
+          <w:insideV w:val="single" w:color="auto" w:sz="4"/>
+        </w:tblBorders>
+      </w:tblPr>
+      <w:tblGrid>
+        <w:gridCol w:w="5200"/>
+        <w:gridCol w:w="1700"/>
+        <w:gridCol w:w="1700"/>
+      </w:tblGrid>
+      <w:tr>
+        <w:trPr>
+          <w:tblHeader/>
+        </w:trPr>
+        <w:tc>
+          <w:tcPr>
+            <w:tcW w:type="dxa" w:w="5200"/>
+            <w:shd w:fill="E7E6E6" w:val="clear"/>
+            <w:tcMar>
+              <w:top w:type="dxa" w:w="40"/>
+              <w:left w:type="dxa" w:w="80"/>
+              <w:bottom w:type="dxa" w:w="40"/>
+              <w:right w:type="dxa" w:w="80"/>
+            </w:tcMar>
+          </w:tcPr>
+          <w:p>
+            <w:pPr>
+              <w:spacing w:after="0" w:line="240"/>
+            </w:pPr>
+            <w:r>
+              <w:rPr>
+                <w:rFonts w:ascii="Times New Roman" w:cs="Times New Roman" w:eastAsia="SimSun" w:hAnsi="Times New Roman"/>
+                <w:b/>
+                <w:bCs/>
+                <w:sz w:val="18"/>
+                <w:szCs w:val="18"/>
+              </w:rPr>
+              <w:t xml:space="preserve">Review stage</w:t>
+            </w:r>
+          </w:p>
+        </w:tc>
+        <w:tc>
+          <w:tcPr>
+            <w:tcW w:type="dxa" w:w="1700"/>
+            <w:shd w:fill="E7E6E6" w:val="clear"/>
+            <w:tcMar>
+              <w:top w:type="dxa" w:w="40"/>
+              <w:left w:type="dxa" w:w="80"/>
+              <w:bottom w:type="dxa" w:w="40"/>
+              <w:right w:type="dxa" w:w="80"/>
+            </w:tcMar>
+          </w:tcPr>
+          <w:p>
+            <w:pPr>
+              <w:spacing w:after="0" w:line="240"/>
+            </w:pPr>
+            <w:r>
+              <w:rPr>
+                <w:rFonts w:ascii="Times New Roman" w:cs="Times New Roman" w:eastAsia="SimSun" w:hAnsi="Times New Roman"/>
+                <w:b/>
+                <w:bCs/>
+                <w:sz w:val="18"/>
+                <w:szCs w:val="18"/>
+              </w:rPr>
+              <w:t xml:space="preserve">Started</w:t>
+            </w:r>
+          </w:p>
+        </w:tc>
+        <w:tc>
+          <w:tcPr>
+            <w:tcW w:type="dxa" w:w="1700"/>
+            <w:shd w:fill="E7E6E6" w:val="clear"/>
+            <w:tcMar>
+              <w:top w:type="dxa" w:w="40"/>
+              <w:left w:type="dxa" w:w="80"/>
+              <w:bottom w:type="dxa" w:w="40"/>
+              <w:right w:type="dxa" w:w="80"/>
+            </w:tcMar>
+          </w:tcPr>
+          <w:p>
+            <w:pPr>
+              <w:spacing w:after="0" w:line="240"/>
+            </w:pPr>
+            <w:r>
+              <w:rPr>
+                <w:rFonts w:ascii="Times New Roman" w:cs="Times New Roman" w:eastAsia="SimSun" w:hAnsi="Times New Roman"/>
+                <w:b/>
+                <w:bCs/>
+                <w:sz w:val="18"/>
+                <w:szCs w:val="18"/>
+              </w:rPr>
+              <w:t xml:space="preserve">Completed</w:t>
+            </w:r>
+          </w:p>
+        </w:tc>
+      </w:tr>
+      <w:tr>
+        <w:tc>
+          <w:tcPr>
+            <w:tcW w:type="dxa" w:w="5200"/>
+            <w:tcMar>
+              <w:top w:type="dxa" w:w="40"/>
+              <w:left w:type="dxa" w:w="80"/>
+              <w:bottom w:type="dxa" w:w="40"/>
+              <w:right w:type="dxa" w:w="80"/>
+            </w:tcMar>
+          </w:tcPr>
+          <w:p>
+            <w:pPr>
+              <w:spacing w:after="0" w:line="240"/>
+            </w:pPr>
+            <w:r>
+              <w:rPr>
+                <w:rFonts w:ascii="Times New Roman" w:cs="Times New Roman" w:eastAsia="SimSun" w:hAnsi="Times New Roman"/>
+                <w:sz w:val="18"/>
+                <w:szCs w:val="18"/>
+              </w:rPr>
+              <w:t xml:space="preserve">Preliminary searches</w:t>
+            </w:r>
+          </w:p>
+        </w:tc>
+        <w:tc>
+          <w:tcPr>
+            <w:tcW w:type="dxa" w:w="1700"/>
+            <w:tcMar>
+              <w:top w:type="dxa" w:w="40"/>
+              <w:left w:type="dxa" w:w="80"/>
+              <w:bottom w:type="dxa" w:w="40"/>
+              <w:right w:type="dxa" w:w="80"/>
+            </w:tcMar>
+          </w:tcPr>
+          <w:p>
+            <w:pPr>
+              <w:spacing w:after="0" w:line="240"/>
+            </w:pPr>
+            <w:r>
+              <w:rPr>
+                <w:rFonts w:ascii="Times New Roman" w:cs="Times New Roman" w:eastAsia="SimSun" w:hAnsi="Times New Roman"/>
+                <w:sz w:val="18"/>
+                <w:szCs w:val="18"/>
+              </w:rPr>
+              <w:t xml:space="preserve">Yes</w:t>
+            </w:r>
+          </w:p>
+        </w:tc>
+        <w:tc>
+          <w:tcPr>
+            <w:tcW w:type="dxa" w:w="1700"/>
+            <w:tcMar>
+              <w:top w:type="dxa" w:w="40"/>
+              <w:left w:type="dxa" w:w="80"/>
+              <w:bottom w:type="dxa" w:w="40"/>
+              <w:right w:type="dxa" w:w="80"/>
+            </w:tcMar>
+          </w:tcPr>
+          <w:p>
+            <w:pPr>
+              <w:spacing w:after="0" w:line="240"/>
+            </w:pPr>
+            <w:r>
+              <w:rPr>
+                <w:rFonts w:ascii="Times New Roman" w:cs="Times New Roman" w:eastAsia="SimSun" w:hAnsi="Times New Roman"/>
+                <w:sz w:val="18"/>
+                <w:szCs w:val="18"/>
+              </w:rPr>
+              <w:t xml:space="preserve">Yes</w:t>
+            </w:r>
+          </w:p>
+        </w:tc>
+      </w:tr>
+      <w:tr>
+        <w:tc>
+          <w:tcPr>
+            <w:tcW w:type="dxa" w:w="5200"/>
+            <w:tcMar>
+              <w:top w:type="dxa" w:w="40"/>
+              <w:left w:type="dxa" w:w="80"/>
+              <w:bottom w:type="dxa" w:w="40"/>
+              <w:right w:type="dxa" w:w="80"/>
+            </w:tcMar>
+          </w:tcPr>
+          <w:p>
+            <w:pPr>
+              <w:spacing w:after="0" w:line="240"/>
+            </w:pPr>
+            <w:r>
+              <w:rPr>
+                <w:rFonts w:ascii="Times New Roman" w:cs="Times New Roman" w:eastAsia="SimSun" w:hAnsi="Times New Roman"/>
+                <w:sz w:val="18"/>
+                <w:szCs w:val="18"/>
+              </w:rPr>
+              <w:t xml:space="preserve">Piloting of the study selection process (calibration on 50 records)</w:t>
+            </w:r>
+          </w:p>
+        </w:tc>
+        <w:tc>
+          <w:tcPr>
+            <w:tcW w:type="dxa" w:w="1700"/>
+            <w:tcMar>
+              <w:top w:type="dxa" w:w="40"/>
+              <w:left w:type="dxa" w:w="80"/>
+              <w:bottom w:type="dxa" w:w="40"/>
+              <w:right w:type="dxa" w:w="80"/>
+            </w:tcMar>
+          </w:tcPr>
+          <w:p>
+            <w:pPr>
+              <w:spacing w:after="0" w:line="240"/>
+            </w:pPr>
+            <w:r>
+              <w:rPr>
+                <w:rFonts w:ascii="Times New Roman" w:cs="Times New Roman" w:eastAsia="SimSun" w:hAnsi="Times New Roman"/>
+                <w:sz w:val="18"/>
+                <w:szCs w:val="18"/>
+              </w:rPr>
+              <w:t xml:space="preserve">Yes</w:t>
+            </w:r>
+          </w:p>
+        </w:tc>
+        <w:tc>
+          <w:tcPr>
+            <w:tcW w:type="dxa" w:w="1700"/>
+            <w:tcMar>
+              <w:top w:type="dxa" w:w="40"/>
+              <w:left w:type="dxa" w:w="80"/>
+              <w:bottom w:type="dxa" w:w="40"/>
+              <w:right w:type="dxa" w:w="80"/>
+            </w:tcMar>
+          </w:tcPr>
+          <w:p>
+            <w:pPr>
+              <w:spacing w:after="0" w:line="240"/>
+            </w:pPr>
+            <w:r>
+              <w:rPr>
+                <w:rFonts w:ascii="Times New Roman" w:cs="Times New Roman" w:eastAsia="SimSun" w:hAnsi="Times New Roman"/>
+                <w:sz w:val="18"/>
+                <w:szCs w:val="18"/>
+              </w:rPr>
+              <w:t xml:space="preserve">Yes</w:t>
+            </w:r>
+          </w:p>
+        </w:tc>
+      </w:tr>
+      <w:tr>
+        <w:tc>
+          <w:tcPr>
+            <w:tcW w:type="dxa" w:w="5200"/>
+            <w:tcMar>
+              <w:top w:type="dxa" w:w="40"/>
+              <w:left w:type="dxa" w:w="80"/>
+              <w:bottom w:type="dxa" w:w="40"/>
+              <w:right w:type="dxa" w:w="80"/>
+            </w:tcMar>
+          </w:tcPr>
+          <w:p>
+            <w:pPr>
+              <w:spacing w:after="0" w:line="240"/>
+            </w:pPr>
+            <w:r>
+              <w:rPr>
+                <w:rFonts w:ascii="Times New Roman" w:cs="Times New Roman" w:eastAsia="SimSun" w:hAnsi="Times New Roman"/>
+                <w:sz w:val="18"/>
+                <w:szCs w:val="18"/>
+              </w:rPr>
+              <w:t xml:space="preserve">Formal screening of search results against eligibility criteria</w:t>
+            </w:r>
+          </w:p>
+        </w:tc>
+        <w:tc>
+          <w:tcPr>
+            <w:tcW w:type="dxa" w:w="1700"/>
+            <w:tcMar>
+              <w:top w:type="dxa" w:w="40"/>
+              <w:left w:type="dxa" w:w="80"/>
+              <w:bottom w:type="dxa" w:w="40"/>
+              <w:right w:type="dxa" w:w="80"/>
+            </w:tcMar>
+          </w:tcPr>
+          <w:p>
+            <w:pPr>
+              <w:spacing w:after="0" w:line="240"/>
+            </w:pPr>
+            <w:r>
+              <w:rPr>
+                <w:rFonts w:ascii="Times New Roman" w:cs="Times New Roman" w:eastAsia="SimSun" w:hAnsi="Times New Roman"/>
+                <w:sz w:val="18"/>
+                <w:szCs w:val="18"/>
+              </w:rPr>
+              <w:t xml:space="preserve">No</w:t>
+            </w:r>
+          </w:p>
+        </w:tc>
+        <w:tc>
+          <w:tcPr>
+            <w:tcW w:type="dxa" w:w="1700"/>
+            <w:tcMar>
+              <w:top w:type="dxa" w:w="40"/>
+              <w:left w:type="dxa" w:w="80"/>
+              <w:bottom w:type="dxa" w:w="40"/>
+              <w:right w:type="dxa" w:w="80"/>
+            </w:tcMar>
+          </w:tcPr>
+          <w:p>
+            <w:pPr>
+              <w:spacing w:after="0" w:line="240"/>
+            </w:pPr>
+            <w:r>
+              <w:rPr>
+                <w:rFonts w:ascii="Times New Roman" w:cs="Times New Roman" w:eastAsia="SimSun" w:hAnsi="Times New Roman"/>
+                <w:sz w:val="18"/>
+                <w:szCs w:val="18"/>
+              </w:rPr>
+              <w:t xml:space="preserve">No</w:t>
+            </w:r>
+          </w:p>
+        </w:tc>
+      </w:tr>
+      <w:tr>
+        <w:tc>
+          <w:tcPr>
+            <w:tcW w:type="dxa" w:w="5200"/>
+            <w:tcMar>
+              <w:top w:type="dxa" w:w="40"/>
+              <w:left w:type="dxa" w:w="80"/>
+              <w:bottom w:type="dxa" w:w="40"/>
+              <w:right w:type="dxa" w:w="80"/>
+            </w:tcMar>
+          </w:tcPr>
+          <w:p>
+            <w:pPr>
+              <w:spacing w:after="0" w:line="240"/>
+            </w:pPr>
+            <w:r>
+              <w:rPr>
+                <w:rFonts w:ascii="Times New Roman" w:cs="Times New Roman" w:eastAsia="SimSun" w:hAnsi="Times New Roman"/>
+                <w:sz w:val="18"/>
+                <w:szCs w:val="18"/>
+              </w:rPr>
+              <w:t xml:space="preserve">Data extraction</w:t>
+            </w:r>
+          </w:p>
+        </w:tc>
+        <w:tc>
+          <w:tcPr>
+            <w:tcW w:type="dxa" w:w="1700"/>
+            <w:tcMar>
+              <w:top w:type="dxa" w:w="40"/>
+              <w:left w:type="dxa" w:w="80"/>
+              <w:bottom w:type="dxa" w:w="40"/>
+              <w:right w:type="dxa" w:w="80"/>
+            </w:tcMar>
+          </w:tcPr>
+          <w:p>
+            <w:pPr>
+              <w:spacing w:after="0" w:line="240"/>
+            </w:pPr>
+            <w:r>
+              <w:rPr>
+                <w:rFonts w:ascii="Times New Roman" w:cs="Times New Roman" w:eastAsia="SimSun" w:hAnsi="Times New Roman"/>
+                <w:sz w:val="18"/>
+                <w:szCs w:val="18"/>
+              </w:rPr>
+              <w:t xml:space="preserve">No</w:t>
+            </w:r>
+          </w:p>
+        </w:tc>
+        <w:tc>
+          <w:tcPr>
+            <w:tcW w:type="dxa" w:w="1700"/>
+            <w:tcMar>
+              <w:top w:type="dxa" w:w="40"/>
+              <w:left w:type="dxa" w:w="80"/>
+              <w:bottom w:type="dxa" w:w="40"/>
+              <w:right w:type="dxa" w:w="80"/>
+            </w:tcMar>
+          </w:tcPr>
+          <w:p>
+            <w:pPr>
+              <w:spacing w:after="0" w:line="240"/>
+            </w:pPr>
+            <w:r>
+              <w:rPr>
+                <w:rFonts w:ascii="Times New Roman" w:cs="Times New Roman" w:eastAsia="SimSun" w:hAnsi="Times New Roman"/>
+                <w:sz w:val="18"/>
+                <w:szCs w:val="18"/>
+              </w:rPr>
+              <w:t xml:space="preserve">No</w:t>
+            </w:r>
+          </w:p>
+        </w:tc>
+      </w:tr>
+      <w:tr>
+        <w:tc>
+          <w:tcPr>
+            <w:tcW w:type="dxa" w:w="5200"/>
+            <w:tcMar>
+              <w:top w:type="dxa" w:w="40"/>
+              <w:left w:type="dxa" w:w="80"/>
+              <w:bottom w:type="dxa" w:w="40"/>
+              <w:right w:type="dxa" w:w="80"/>
+            </w:tcMar>
+          </w:tcPr>
+          <w:p>
+            <w:pPr>
+              <w:spacing w:after="0" w:line="240"/>
+            </w:pPr>
+            <w:r>
+              <w:rPr>
+                <w:rFonts w:ascii="Times New Roman" w:cs="Times New Roman" w:eastAsia="SimSun" w:hAnsi="Times New Roman"/>
+                <w:sz w:val="18"/>
+                <w:szCs w:val="18"/>
+              </w:rPr>
+              <w:t xml:space="preserve">Risk of bias (quality) assessment</w:t>
+            </w:r>
+          </w:p>
+        </w:tc>
+        <w:tc>
+          <w:tcPr>
+            <w:tcW w:type="dxa" w:w="1700"/>
+            <w:tcMar>
+              <w:top w:type="dxa" w:w="40"/>
+              <w:left w:type="dxa" w:w="80"/>
+              <w:bottom w:type="dxa" w:w="40"/>
+              <w:right w:type="dxa" w:w="80"/>
+            </w:tcMar>
+          </w:tcPr>
+          <w:p>
+            <w:pPr>
+              <w:spacing w:after="0" w:line="240"/>
+            </w:pPr>
+            <w:r>
+              <w:rPr>
+                <w:rFonts w:ascii="Times New Roman" w:cs="Times New Roman" w:eastAsia="SimSun" w:hAnsi="Times New Roman"/>
+                <w:sz w:val="18"/>
+                <w:szCs w:val="18"/>
+              </w:rPr>
+              <w:t xml:space="preserve">No</w:t>
+            </w:r>
+          </w:p>
+        </w:tc>
+        <w:tc>
+          <w:tcPr>
+            <w:tcW w:type="dxa" w:w="1700"/>
+            <w:tcMar>
+              <w:top w:type="dxa" w:w="40"/>
+              <w:left w:type="dxa" w:w="80"/>
+              <w:bottom w:type="dxa" w:w="40"/>
+              <w:right w:type="dxa" w:w="80"/>
+            </w:tcMar>
+          </w:tcPr>
+          <w:p>
+            <w:pPr>
+              <w:spacing w:after="0" w:line="240"/>
+            </w:pPr>
+            <w:r>
+              <w:rPr>
+                <w:rFonts w:ascii="Times New Roman" w:cs="Times New Roman" w:eastAsia="SimSun" w:hAnsi="Times New Roman"/>
+                <w:sz w:val="18"/>
+                <w:szCs w:val="18"/>
+              </w:rPr>
+              <w:t xml:space="preserve">No</w:t>
+            </w:r>
+          </w:p>
+        </w:tc>
+      </w:tr>
+      <w:tr>
+        <w:tc>
+          <w:tcPr>
+            <w:tcW w:type="dxa" w:w="5200"/>
+            <w:tcMar>
+              <w:top w:type="dxa" w:w="40"/>
+              <w:left w:type="dxa" w:w="80"/>
+              <w:bottom w:type="dxa" w:w="40"/>
+              <w:right w:type="dxa" w:w="80"/>
+            </w:tcMar>
+          </w:tcPr>
+          <w:p>
+            <w:pPr>
+              <w:spacing w:after="0" w:line="240"/>
+            </w:pPr>
+            <w:r>
+              <w:rPr>
+                <w:rFonts w:ascii="Times New Roman" w:cs="Times New Roman" w:eastAsia="SimSun" w:hAnsi="Times New Roman"/>
+                <w:sz w:val="18"/>
+                <w:szCs w:val="18"/>
+              </w:rPr>
+              <w:t xml:space="preserve">Data analysis</w:t>
+            </w:r>
+          </w:p>
+        </w:tc>
+        <w:tc>
+          <w:tcPr>
+            <w:tcW w:type="dxa" w:w="1700"/>
+            <w:tcMar>
+              <w:top w:type="dxa" w:w="40"/>
+              <w:left w:type="dxa" w:w="80"/>
+              <w:bottom w:type="dxa" w:w="40"/>
+              <w:right w:type="dxa" w:w="80"/>
+            </w:tcMar>
+          </w:tcPr>
+          <w:p>
+            <w:pPr>
+              <w:spacing w:after="0" w:line="240"/>
+            </w:pPr>
+            <w:r>
+              <w:rPr>
+                <w:rFonts w:ascii="Times New Roman" w:cs="Times New Roman" w:eastAsia="SimSun" w:hAnsi="Times New Roman"/>
+                <w:sz w:val="18"/>
+                <w:szCs w:val="18"/>
+              </w:rPr>
+              <w:t xml:space="preserve">No</w:t>
+            </w:r>
+          </w:p>
+        </w:tc>
+        <w:tc>
+          <w:tcPr>
+            <w:tcW w:type="dxa" w:w="1700"/>
+            <w:tcMar>
+              <w:top w:type="dxa" w:w="40"/>
+              <w:left w:type="dxa" w:w="80"/>
+              <w:bottom w:type="dxa" w:w="40"/>
+              <w:right w:type="dxa" w:w="80"/>
+            </w:tcMar>
+          </w:tcPr>
+          <w:p>
+            <w:pPr>
+              <w:spacing w:after="0" w:line="240"/>
+            </w:pPr>
+            <w:r>
+              <w:rPr>
+                <w:rFonts w:ascii="Times New Roman" w:cs="Times New Roman" w:eastAsia="SimSun" w:hAnsi="Times New Roman"/>
+                <w:sz w:val="18"/>
+                <w:szCs w:val="18"/>
+              </w:rPr>
+              <w:t xml:space="preserve">No</w:t>
+            </w:r>
+          </w:p>
+        </w:tc>
+      </w:tr>
+    </w:tbl>
+    <w:p>
+      <w:pPr>
+        <w:spacing w:after="80" w:before="200" w:line="300"/>
+        <w:jc w:val="left"/>
+      </w:pPr>
+      <w:r>
+        <w:rPr>
+          <w:rFonts w:ascii="Times New Roman" w:cs="Times New Roman" w:eastAsia="SimSun" w:hAnsi="Times New Roman"/>
+          <w:b/>
+          <w:bCs/>
+          <w:sz w:val="22"/>
+          <w:szCs w:val="22"/>
+        </w:rPr>
         <w:t xml:space="preserve">Pilot work before registration</w:t>
       </w:r>
     </w:p>
@@ -2225,6 +2789,30 @@
           <w:szCs w:val="22"/>
         </w:rPr>
         <w:t xml:space="preserve">Records were deduplicated with a documented, rule-based script (identical DOI; identical title with the same first author and year; similar title with the same first author; same first author, year, volume and first page; and further rules for Chinese-language records and for differently written author names; the tiers are listed in Appendix B), and EndNote’s duplicate finder was then run on the result as a check. The deduplicated records will be screened in Rayyan. Two reviewers will independently screen titles and abstracts, then full texts, against the eligibility criteria; disagreements will be resolved by discussion or, if needed, by a third reviewer (JY). Chinese-language reports will be screened by reviewers fluent in Chinese. Before formal screening, both reviewers will screen a calibration set of 50 records and discuss discrepancies.</w:t>
+      </w:r>
+    </w:p>
+    <w:p>
+      <w:pPr>
+        <w:spacing w:after="120" w:line="300"/>
+        <w:jc w:val="both"/>
+      </w:pPr>
+      <w:r>
+        <w:rPr>
+          <w:rFonts w:ascii="Times New Roman" w:cs="Times New Roman" w:eastAsia="SimSun" w:hAnsi="Times New Roman"/>
+          <w:b/>
+          <w:bCs/>
+          <w:sz w:val="22"/>
+          <w:szCs w:val="22"/>
+        </w:rPr>
+        <w:t xml:space="preserve">Screening procedure as set up (added in version 1.3). </w:t>
+      </w:r>
+      <w:r>
+        <w:rPr>
+          <w:rFonts w:ascii="Times New Roman" w:cs="Times New Roman" w:eastAsia="SimSun" w:hAnsi="Times New Roman"/>
+          <w:sz w:val="22"/>
+          <w:szCs w:val="22"/>
+        </w:rPr>
+        <w:t xml:space="preserve">Screening is done in Rayyan with its blind mode on until both reviewers have finished a stage; author and journal details are hidden. Before formal screening, the two reviewers independently screened a random calibration set of 50 of the 2,548 deduplicated records (random seed 20261004) and compared their decisions (Include, Maybe, Exclude): they agreed on 45 of 50 records (90.0%; Cohen's kappa 0.83), and all five disagreements were among the 11 records without an abstract. Author and journal details were visible to both reviewers during part of the calibration. A written screening guide, revised after the calibration, applies the eligibility criteria above without changing them. Its main rules are: when in doubt, choose Maybe; an Exclude decision at the title and abstract stage must carry one of six fixed reasons (not human; not wandering spleen; adults only; no original patient data; not a formal article; other); records without an abstract are judged on the title and may be rated Maybe or Exclude only; conference papers with an abstract only are excluded as not a formal article; theses with clinical data and series that mix children and adults are kept as Maybe for full-text assessment. Rayyan's artificial-intelligence functions, its automatic duplicate detection and its automatic conflict resolution are not used. Where one reviewer excludes and the other includes or marks Maybe, the two reviewers discuss the record and, if they do not agree, the adjudicator (JY) decides from an exported list outside Rayyan; each step is recorded and the completed list is kept with the review files. Differences between Include and Maybe, which both lead to full-text assessment, are counted and reported but not adjudicated. Agreement at the title and abstract stage will be reported as Cohen's kappa, in addition to the kappa for data extraction.</w:t>
       </w:r>
     </w:p>
     <w:p>

</xml_diff>

<commit_message>
Protocol v1.4 and amendment note: formal screening has started (stage of review corrected)
Fei Peng's account carries formal-screening decisions (confirmed by the author: Fei Peng operated it)
and the first reviewer recorded four decisions on 7 October to create the exclusion reasons, so the
stage table now reads Formal screening Started / Not completed. New Section 14 paragraph states the
status and dates (between 7 and 11 October for the second reviewer; exact dates later from the Rayyan
log). Amendment note: HOLD removed, reason, ticks and timing paragraph rewritten; amendment still not
submitted. Eligibility, exposures, outcomes, analysis and dates unchanged.

Co-Authored-By: Claude Sonnet 5.5 <noreply@anthropic.com>
Claude-Session: https://claude.ai/code/session_01FRD7etKqYN8v2bbXeeLMRW
</commit_message>
<xml_diff>
--- a/Systematic review protocol - PROSPERO draft.docx
+++ b/Systematic review protocol - PROSPERO draft.docx
@@ -45,7 +45,7 @@
           <w:sz w:val="22"/>
           <w:szCs w:val="22"/>
         </w:rPr>
-        <w:t xml:space="preserve">Version 1.3, 7 October 2026. Prepared for the review team of Wuhan Children's Hospital.</w:t>
+        <w:t xml:space="preserve">Version 1.4, 11 October 2026. Prepared for the review team of Wuhan Children's Hospital.</w:t>
       </w:r>
     </w:p>
     <w:p>
@@ -69,7 +69,7 @@
           <w:sz w:val="20"/>
           <w:szCs w:val="20"/>
         </w:rPr>
-        <w:t xml:space="preserve">Version 1.0 (uploaded at registration as draft v0.1). Version 1.1: search strategies (Section 5, Appendices A and B) revised after review by a medical librarian, before the formal searches were run; eligibility criteria, exposures, outcomes and analysis are unchanged. Version 1.2 (4 October 2026): as-run details of the formal searches added to Appendices A and B; deduplication done with a documented script and checked in EndNote (Section 14, Appendix B); Embase and Google Scholar were not searched and citation searching was not completed (see Appendices A2, A8 and B); eligibility criteria, exposures, outcomes and analysis are unchanged. Version 1.3 (7 October 2026, before formal screening started): the screening procedure actually set up (calibration result, screening guide rules, handling of disagreements, agreement reporting) added to Section 14, and the stage of review at amendment added to Section 1; eligibility criteria, exposures, outcomes and analysis are unchanged.</w:t>
+        <w:t xml:space="preserve">Version 1.0 (uploaded at registration as draft v0.1). Version 1.1: search strategies (Section 5, Appendices A and B) revised after review by a medical librarian, before the formal searches were run; eligibility criteria, exposures, outcomes and analysis are unchanged. Version 1.2 (4 October 2026): as-run details of the formal searches added to Appendices A and B; deduplication done with a documented script and checked in EndNote (Section 14, Appendix B); Embase and Google Scholar were not searched and citation searching was not completed (see Appendices A2, A8 and B); eligibility criteria, exposures, outcomes and analysis are unchanged. Version 1.3 (7 October 2026): the screening procedure actually set up (calibration result, screening guide rules, handling of disagreements, agreement reporting) added to Section 14, and the stage of review at amendment added to Section 1; eligibility criteria, exposures, outcomes and analysis are unchanged. Version 1.4 (11 October 2026): the stage of review at amendment corrected, because formal screening in Rayyan had already started (according to the project log, the first reviewer recorded four decisions on 7 October 2026 to create exclusion reasons, and the second reviewer's first decisions were recorded between 7 and 11 October 2026), and the status of formal screening added to Section 14; the screening procedure, eligibility criteria, exposures, outcomes and analysis are unchanged.</w:t>
       </w:r>
     </w:p>
     <w:p>
@@ -725,7 +725,7 @@
           <w:sz w:val="22"/>
           <w:szCs w:val="22"/>
         </w:rPr>
-        <w:t xml:space="preserve">Stage of review at the time of amendment (version 1.3, 7 October 2026)</w:t>
+        <w:t xml:space="preserve">Stage of review at the time of amendment (version 1.4, 11 October 2026)</w:t>
       </w:r>
     </w:p>
     <w:tbl>
@@ -1024,7 +1024,7 @@
                 <w:sz w:val="18"/>
                 <w:szCs w:val="18"/>
               </w:rPr>
-              <w:t xml:space="preserve">No</w:t>
+              <w:t xml:space="preserve">Yes</w:t>
             </w:r>
           </w:p>
         </w:tc>
@@ -2813,6 +2813,30 @@
           <w:szCs w:val="22"/>
         </w:rPr>
         <w:t xml:space="preserve">Screening is done in Rayyan with its blind mode on until both reviewers have finished a stage; author and journal details are hidden. Before formal screening, the two reviewers independently screened a random calibration set of 50 of the 2,548 deduplicated records (random seed 20261004) and compared their decisions (Include, Maybe, Exclude): they agreed on 45 of 50 records (90.0%; Cohen's kappa 0.83), and all five disagreements were among the 11 records without an abstract. Author and journal details were visible to both reviewers during part of the calibration. A written screening guide, revised after the calibration, applies the eligibility criteria above without changing them. Its main rules are: when in doubt, choose Maybe; an Exclude decision at the title and abstract stage must carry one of six fixed reasons (not human; not wandering spleen; adults only; no original patient data; not a formal article; other); records without an abstract are judged on the title and may be rated Maybe or Exclude only; conference papers with an abstract only are excluded as not a formal article; theses with clinical data and series that mix children and adults are kept as Maybe for full-text assessment. Rayyan's artificial-intelligence functions, its automatic duplicate detection and automatic duplicate resolution are not used. Where one reviewer excludes and the other includes or marks Maybe, the two reviewers discuss the record and, if they do not agree, the adjudicator (JY) decides from an exported list outside Rayyan; each step is recorded and the completed list is kept with the review files. Differences between Include and Maybe, which both lead to full-text assessment, are counted and reported but not adjudicated. Agreement at the title and abstract stage will be reported as Cohen's kappa, in addition to the kappa for data extraction.</w:t>
+      </w:r>
+    </w:p>
+    <w:p>
+      <w:pPr>
+        <w:spacing w:after="120" w:line="300"/>
+        <w:jc w:val="both"/>
+      </w:pPr>
+      <w:r>
+        <w:rPr>
+          <w:rFonts w:ascii="Times New Roman" w:cs="Times New Roman" w:eastAsia="SimSun" w:hAnsi="Times New Roman"/>
+          <w:b/>
+          <w:bCs/>
+          <w:sz w:val="22"/>
+          <w:szCs w:val="22"/>
+        </w:rPr>
+        <w:t xml:space="preserve">Status of formal screening (added in version 1.4). </w:t>
+      </w:r>
+      <w:r>
+        <w:rPr>
+          <w:rFonts w:ascii="Times New Roman" w:cs="Times New Roman" w:eastAsia="SimSun" w:hAnsi="Times New Roman"/>
+          <w:sz w:val="22"/>
+          <w:szCs w:val="22"/>
+        </w:rPr>
+        <w:t xml:space="preserve">Formal screening in Rayyan has started and is not complete. According to the project log, the first reviewer recorded four formal decisions on 7 October 2026 in order to create four of the six exclusion reasons in Rayyan (a reason can only be created by applying it to a record); the second reviewer screens these four records independently, like all others. The second reviewer's first formal decisions were recorded between 7 and 11 October 2026. The written screening rules (the screening guide) had been confirmed by both reviewers and the adjudicator on 7 October 2026, before the second reviewer's first formal decision. The exact dates of each reviewer's first formal decision, and the number of records each reviewer had screened on the date of this amendment, will be taken from the Rayyan decision log when the title and abstract stage is complete and will be reported in the review.</w:t>
       </w:r>
     </w:p>
     <w:p>

</xml_diff>

<commit_message>
Protocol v1.5 and PROSPERO amendment note: screening as carried out, full-text changes, date rule, analysis consequences
Co-Authored-By: Claude Sonnet 5.5 <noreply@anthropic.com>
Claude-Session: https://claude.ai/code/session_01FRD7etKqYN8v2bbXeeLMRW
</commit_message>
<xml_diff>
--- a/Systematic review protocol - PROSPERO draft.docx
+++ b/Systematic review protocol - PROSPERO draft.docx
@@ -45,7 +45,7 @@
           <w:sz w:val="22"/>
           <w:szCs w:val="22"/>
         </w:rPr>
-        <w:t xml:space="preserve">Version 1.4, 11 October 2026. Prepared for the review team of Wuhan Children's Hospital.</w:t>
+        <w:t xml:space="preserve">Version 1.5, 18 October 2026. Prepared for the review team of Wuhan Children's Hospital.</w:t>
       </w:r>
     </w:p>
     <w:p>
@@ -69,7 +69,7 @@
           <w:sz w:val="20"/>
           <w:szCs w:val="20"/>
         </w:rPr>
-        <w:t xml:space="preserve">Version 1.0 (uploaded at registration as draft v0.1). Version 1.1: search strategies (Section 5, Appendices A and B) revised after review by a medical librarian, before the formal searches were run; eligibility criteria, exposures, outcomes and analysis are unchanged. Version 1.2 (4 October 2026): as-run details of the formal searches added to Appendices A and B; deduplication done with a documented script and checked in EndNote (Section 14, Appendix B); Embase and Google Scholar were not searched and citation searching was not completed (see Appendices A2, A8 and B); eligibility criteria, exposures, outcomes and analysis are unchanged. Version 1.3 (7 October 2026): the screening procedure actually set up (calibration result, screening guide rules, handling of disagreements, agreement reporting) added to Section 14, and the stage of review at amendment added to Section 1; eligibility criteria, exposures, outcomes and analysis are unchanged. Version 1.4 (11 October 2026): the stage of review at amendment corrected, because formal screening in Rayyan had already started (according to the project log, the first reviewer recorded four decisions on 7 October 2026 to create exclusion reasons, and the second reviewer's first decisions were recorded between 7 and 11 October 2026), and the status of formal screening added to Section 14; the screening procedure, eligibility criteria, exposures, outcomes and analysis are unchanged.</w:t>
+        <w:t xml:space="preserve">Version 1.0 (uploaded at registration as draft v0.1). Version 1.1: search strategies (Section 5, Appendices A and B) revised after review by a medical librarian, before the formal searches were run; eligibility criteria, exposures, outcomes and analysis are unchanged. Version 1.2 (4 October 2026): as-run details of the formal searches added to Appendices A and B; deduplication done with a documented script and checked in EndNote (Section 14, Appendix B); Embase and Google Scholar were not searched and citation searching was not completed (see Appendices A2, A8 and B); eligibility criteria, exposures, outcomes and analysis are unchanged. Version 1.3 (7 October 2026): the screening procedure actually set up (calibration result, screening guide rules, handling of disagreements, agreement reporting) added to Section 14, and the stage of review at amendment added to Section 1; eligibility criteria, exposures, outcomes and analysis are unchanged. Version 1.4 (11 October 2026): the stage of review at amendment corrected, because formal screening in Rayyan had already started (according to the project log, the first reviewer recorded four decisions on 7 October 2026 to create exclusion reasons, and the second reviewer's first decisions were recorded between 7 and 11 October 2026), and the status of formal screening added to Section 14; the screening procedure, eligibility criteria, exposures, outcomes and analysis are unchanged. Version 1.5 (18 October 2026): the title and abstract stage is complete, and Section 14 now describes how it was carried out, including the respects in which it departed from the plan (the second reviewer's first-round decisions, made with an AI coding agent, were not used; the re-screen was entered at a pace that does not allow it to be treated as an independent reading; the adjudicator judged every disagreement and a sample of agreed exclusions blind); the full-text stage is described, with changes decided before any full text was sought (reports published before 2000 are not sought; the second full-text reviewer is not the one registered; decision rules; full-text records are kept in a spreadsheet instead of Rayyan); the consequences of the date rule for the analysis plan (Sections 16 and 18) are stated; the stage of review is updated; and a screening log is added as Appendix D. Eligibility criteria other than the date rule, exposures, outcomes and the rest of the analysis plan are unchanged.</w:t>
       </w:r>
     </w:p>
     <w:p>
@@ -725,7 +725,7 @@
           <w:sz w:val="22"/>
           <w:szCs w:val="22"/>
         </w:rPr>
-        <w:t xml:space="preserve">Stage of review at the time of amendment (version 1.4, 11 October 2026)</w:t>
+        <w:t xml:space="preserve">Stage of review at the time of amendment (version 1.5, 18 October 2026)</w:t>
       </w:r>
     </w:p>
     <w:tbl>
@@ -926,7 +926,7 @@
                 <w:sz w:val="18"/>
                 <w:szCs w:val="18"/>
               </w:rPr>
-              <w:t xml:space="preserve">Piloting of the study selection process (calibration on 50 records)</w:t>
+              <w:t xml:space="preserve">Piloting of the study selection process (title and abstract stage: calibration on 50 records)</w:t>
             </w:r>
           </w:p>
         </w:tc>
@@ -1000,7 +1000,7 @@
                 <w:sz w:val="18"/>
                 <w:szCs w:val="18"/>
               </w:rPr>
-              <w:t xml:space="preserve">Formal screening of search results against eligibility criteria</w:t>
+              <w:t xml:space="preserve">Formal screening of search results against eligibility criteria (title and abstract stage complete; full-text stage not started)</w:t>
             </w:r>
           </w:p>
         </w:tc>
@@ -1278,6 +1278,20 @@
     </w:tbl>
     <w:p>
       <w:pPr>
+        <w:spacing w:after="120" w:before="80" w:line="300"/>
+        <w:jc w:val="both"/>
+      </w:pPr>
+      <w:r>
+        <w:rPr>
+          <w:rFonts w:ascii="Times New Roman" w:cs="Times New Roman" w:eastAsia="SimSun" w:hAnsi="Times New Roman"/>
+          <w:sz w:val="22"/>
+          <w:szCs w:val="22"/>
+        </w:rPr>
+        <w:t xml:space="preserve">Title and abstract screening of 2,548 records was completed on 17 October 2026 (Section 14, Appendix D). Full-text assessment has not started; a calibration on 20 reports has been prepared but not yet done. No data have been extracted.</w:t>
+      </w:r>
+    </w:p>
+    <w:p>
+      <w:pPr>
         <w:spacing w:after="80" w:before="200" w:line="300"/>
         <w:jc w:val="left"/>
       </w:pPr>
@@ -1303,7 +1317,7 @@
           <w:sz w:val="22"/>
           <w:szCs w:val="22"/>
         </w:rPr>
-        <w:t xml:space="preserve">Before this protocol was drafted, 53 reports (47 in English and 6 in Chinese) were collected by hand, and a data-extraction form was piloted on them (76 unique paediatric patients after removal of duplicate reports). The pilot suggested that the relation between time to surgery and splenic loss may differ between the duration of the index symptomatic episode and the total length of symptom history, and this informed the choice of primary exposure. Pilot data will not enter the final analysis: all reports, including the 53 piloted, will be screened and extracted afresh by two independent reviewers according to this protocol.</w:t>
+        <w:t xml:space="preserve">Before this protocol was drafted, 53 reports (47 in English and 6 in Chinese) were collected by hand, and a data-extraction form was piloted on them (76 unique paediatric patients after removal of duplicate reports). The pilot suggested that the relation between time to surgery and splenic loss may differ between the duration of the index symptomatic episode and the total length of symptom history, and this informed the choice of primary exposure. Pilot data will not enter the final analysis: all reports, including the 53 piloted, will be screened and extracted afresh by two independent reviewers according to this protocol (one piloted report, published in 1998, falls under the date rule added in version 1.5 and will not be extracted; see Section 14).</w:t>
       </w:r>
     </w:p>
     <w:p>
@@ -1861,15 +1875,15 @@
     <w:p>
       <w:pPr>
         <w:spacing w:after="120" w:before="120" w:line="300"/>
-        <w:jc w:val="left"/>
-      </w:pPr>
-      <w:r>
-        <w:rPr>
-          <w:rFonts w:ascii="Times New Roman" w:cs="Times New Roman" w:eastAsia="SimSun" w:hAnsi="Times New Roman"/>
-          <w:sz w:val="22"/>
-          <w:szCs w:val="22"/>
-        </w:rPr>
-        <w:t xml:space="preserve">Roles: independent reviewer 1, Jun Shu; independent reviewer 2, Fei Peng; adjudicator, Jun Yang; statistical analysis, Ji Wang.</w:t>
+        <w:jc w:val="both"/>
+      </w:pPr>
+      <w:r>
+        <w:rPr>
+          <w:rFonts w:ascii="Times New Roman" w:cs="Times New Roman" w:eastAsia="SimSun" w:hAnsi="Times New Roman"/>
+          <w:sz w:val="22"/>
+          <w:szCs w:val="22"/>
+        </w:rPr>
+        <w:t xml:space="preserve">Roles as registered: independent reviewer 1, Jun Shu; independent reviewer 2, Fei Peng; adjudicator, Jun Yang; statistical analysis, Ji Wang. Roles from version 1.5: title and abstract stage, reviewers Jun Shu and Fei Peng, with Jun Yang as adjudicator; full-text stage, reviewers Jun Shu and Hongqiang Bian, with Jun Yang as adjudicator; data extraction, the two reviewers will be named in the PROSPERO record before extraction starts; statistical analysis, Ji Wang. The change of second reviewer for the full-text stage was decided by the review team on 18 October 2026.</w:t>
       </w:r>
     </w:p>
     <w:p>
@@ -2520,7 +2534,7 @@
           <w:sz w:val="22"/>
           <w:szCs w:val="22"/>
         </w:rPr>
-        <w:t xml:space="preserve">Case reports, case series, cohort studies, letters, and reviews that describe original patients, provided that individual patient data are reported or supplied by the authors. Our institutional series of five children (ethics approval 2025R156-E01) will be pooled with the published cases. Excluded: reviews without new patients (used only for reference checking), conference abstracts, and editorials without patient data. Reports with full text in English or Chinese will be extracted; reports in other languages will be listed and counted but not extracted.</w:t>
+        <w:t xml:space="preserve">Case reports, case series, cohort studies, letters, and reviews that describe original patients, provided that individual patient data are reported or supplied by the authors. Our institutional series of five children (ethics approval 2025R156-E01) will be pooled with the published cases. Excluded: reviews without new patients (used only for reference checking), conference abstracts, and editorials without patient data. Reports with full text in English or Chinese will be extracted; reports in other languages will be listed and counted but not extracted. Added in version 1.5: reports published before 2000 will be listed and counted but not sought in full text (Section 14).</w:t>
       </w:r>
     </w:p>
     <w:p>
@@ -2804,7 +2818,7 @@
           <w:sz w:val="22"/>
           <w:szCs w:val="22"/>
         </w:rPr>
-        <w:t xml:space="preserve">Screening procedure as set up (added in version 1.3). </w:t>
+        <w:t xml:space="preserve">Screening procedure as set up (added in version 1.3; the independence of the two readings and the handling of disagreements described here were not carried out as written, see the next two paragraphs). </w:t>
       </w:r>
       <w:r>
         <w:rPr>
@@ -2828,15 +2842,15 @@
           <w:sz w:val="22"/>
           <w:szCs w:val="22"/>
         </w:rPr>
-        <w:t xml:space="preserve">Status of formal screening (added in version 1.4). </w:t>
-      </w:r>
-      <w:r>
-        <w:rPr>
-          <w:rFonts w:ascii="Times New Roman" w:cs="Times New Roman" w:eastAsia="SimSun" w:hAnsi="Times New Roman"/>
-          <w:sz w:val="22"/>
-          <w:szCs w:val="22"/>
-        </w:rPr>
-        <w:t xml:space="preserve">Formal screening in Rayyan has started and is not complete. According to the project log, the first reviewer recorded four formal decisions on 7 October 2026 in order to create four of the six exclusion reasons in Rayyan (a reason can only be created by applying it to a record); the second reviewer screens these four records independently, like all others. The second reviewer's first formal decisions were recorded between 7 and 11 October 2026. The written screening rules (the screening guide) had been confirmed by both reviewers and the adjudicator on 7 October 2026, before the second reviewer's first formal decision. The exact dates of each reviewer's first formal decision, and the number of records each reviewer had screened on the date of this amendment, will be taken from the Rayyan decision log when the title and abstract stage is complete and will be reported in the review.</w:t>
+        <w:t xml:space="preserve">Title and abstract screening as carried out (added in version 1.5; replaces the status paragraph of version 1.4). </w:t>
+      </w:r>
+      <w:r>
+        <w:rPr>
+          <w:rFonts w:ascii="Times New Roman" w:cs="Times New Roman" w:eastAsia="SimSun" w:hAnsi="Times New Roman"/>
+          <w:sz w:val="22"/>
+          <w:szCs w:val="22"/>
+        </w:rPr>
+        <w:t xml:space="preserve">The title and abstract stage of the 2,548 deduplicated records was completed on 17 October 2026. It departed from the plan in two respects, which are reported because they affect how the result should be read. (1) First round, 7–12 October 2026. The first reviewer recorded decisions between 7 and 12 October 2026, one at a time, at a median interval of 9.4 seconds. The second reviewer's account recorded about 2,370 of its 2,548 first decisions between 10 and 11 October 2026, at a median interval of about 2 seconds, in list order and partly as multi-record actions. The second reviewer reported that an AI coding agent (Codex) had been used to make these decisions. That was contrary to the written screening rules. These decisions were not used to decide which records go forward; they are kept as a separate dataset. (2) Re-screen, 17 October 2026, in a new blind Rayyan project. The second reviewer was asked to re-screen all 2,548 records by reading each title and abstract without any AI tool. The project log shows that the decisions were received at a median interval of 0.45 seconds (88% within one second; about 2,500 decisions within 76 minutes), which is not compatible with reading each title and abstract at the time of entry. The second reviewer reports that the records were read while clicking and that no AI tool was used; the log can neither confirm nor refute this. The re-screen is therefore not treated as a second independent reading. In addition, after the first project was unblinded on 12 October 2026 the second reviewer could have seen the first reviewer's decisions; whether this happened has not been established.</w:t>
       </w:r>
     </w:p>
     <w:p>
@@ -2847,10 +2861,289 @@
       <w:r>
         <w:rPr>
           <w:rFonts w:ascii="Times New Roman" w:cs="Times New Roman" w:eastAsia="SimSun" w:hAnsi="Times New Roman"/>
-          <w:sz w:val="22"/>
-          <w:szCs w:val="22"/>
-        </w:rPr>
-        <w:t xml:space="preserve">Two reviewers will independently extract data for every included patient with the form in Appendix C, after calibration on 10 reports. Agreement on the primary exposure and the primary outcome will be reported as Cohen's kappa. Where a report describes several patients only in aggregate, the corresponding author will be emailed twice, four weeks apart, to request individual data; if none are supplied, the report will be described narratively.</w:t>
+          <w:b/>
+          <w:bCs/>
+          <w:sz w:val="22"/>
+          <w:szCs w:val="22"/>
+        </w:rPr>
+        <w:t xml:space="preserve">How the list for full-text assessment was made (added in version 1.5). </w:t>
+      </w:r>
+      <w:r>
+        <w:rPr>
+          <w:rFonts w:ascii="Times New Roman" w:cs="Times New Roman" w:eastAsia="SimSun" w:hAnsi="Times New Roman"/>
+          <w:sz w:val="22"/>
+          <w:szCs w:val="22"/>
+        </w:rPr>
+        <w:t xml:space="preserve">On 16 October 2026, before any re-screen decision was recorded, the team fixed in writing that, in the comparison of the two reviewers, the first reviewer's 310 Exclude decisions that carried no exclusion reason would be treated as Maybe, as the screening guide requires; the recorded decisions were not edited. The adjudicator (JY) then judged, blind to both reviewers' decisions, (a) all 734 records on which one reviewer excluded and the other did not; (b) 192 records excluded by both reviewers that were flagged as possibly relevant, either by a word rule (93; a wandering- or torsion-related word together with a child-related word in the title or abstract) or because they had no abstract (99); and (c) a random sample of 60 of the other records excluded by both. A rule fixed before the adjudicator began said that if the adjudicator advanced more than 10% of the 192 flagged records, or at least two of the 60 sampled records, the adjudicator would also judge every other record excluded by both reviewers for which either reviewer's reason was ‘not wandering spleen’ or ‘adults only’. The first condition was met (42 of the 192 flagged records advanced; none of the 60 sampled), and the adjudicator judged a further 616 records, of which 12 advanced. The 184 records excluded by both reviewers as ‘non-human’ or ‘not a formal article’ were not re-judged. In total 1,064 of the 2,548 records go to full-text assessment (762 advanced by both reviewers; 248 of the 734 disagreements advanced by the adjudicator; 54 records excluded by both reviewers advanced by the adjudicator) and 1,484 were excluded at this stage (Appendix D). The list therefore rests on the reviewers' agreed advances and on the adjudicator's blind judgement of every disagreement and of checks on agreed exclusions, not on two independent readings of every record. The adjudicator is one person, and the adjudicator's judgements are not a reference standard. Agreement between the two reviewers will be reported with these caveats.</w:t>
+      </w:r>
+    </w:p>
+    <w:p>
+      <w:pPr>
+        <w:spacing w:after="60" w:line="300"/>
+        <w:jc w:val="both"/>
+      </w:pPr>
+      <w:r>
+        <w:rPr>
+          <w:rFonts w:ascii="Times New Roman" w:cs="Times New Roman" w:eastAsia="SimSun" w:hAnsi="Times New Roman"/>
+          <w:b/>
+          <w:bCs/>
+          <w:sz w:val="22"/>
+          <w:szCs w:val="22"/>
+        </w:rPr>
+        <w:t xml:space="preserve">Full-text assessment: changes decided before any full text was sought (added in version 1.5). </w:t>
+      </w:r>
+      <w:r>
+        <w:rPr>
+          <w:rFonts w:ascii="Times New Roman" w:cs="Times New Roman" w:eastAsia="SimSun" w:hAnsi="Times New Roman"/>
+          <w:sz w:val="22"/>
+          <w:szCs w:val="22"/>
+        </w:rPr>
+        <w:t xml:space="preserve">The following were decided on 17 and 18 October 2026, before any full text was sought and before any data were extracted.</w:t>
+      </w:r>
+    </w:p>
+    <w:p>
+      <w:pPr>
+        <w:spacing w:after="60" w:line="300"/>
+        <w:ind w:left="360"/>
+        <w:jc w:val="left"/>
+      </w:pPr>
+      <w:r>
+        <w:rPr>
+          <w:rFonts w:ascii="Times New Roman" w:cs="Times New Roman" w:eastAsia="SimSun" w:hAnsi="Times New Roman"/>
+          <w:sz w:val="22"/>
+          <w:szCs w:val="22"/>
+        </w:rPr>
+        <w:t xml:space="preserve">• </w:t>
+      </w:r>
+      <w:r>
+        <w:rPr>
+          <w:rFonts w:ascii="Times New Roman" w:cs="Times New Roman" w:eastAsia="SimSun" w:hAnsi="Times New Roman"/>
+          <w:b/>
+          <w:bCs/>
+          <w:sz w:val="22"/>
+          <w:szCs w:val="22"/>
+        </w:rPr>
+        <w:t xml:space="preserve">Publication date. </w:t>
+      </w:r>
+      <w:r>
+        <w:rPr>
+          <w:rFonts w:ascii="Times New Roman" w:cs="Times New Roman" w:eastAsia="SimSun" w:hAnsi="Times New Roman"/>
+          <w:sz w:val="22"/>
+          <w:szCs w:val="22"/>
+        </w:rPr>
+        <w:t xml:space="preserve">Reports published before 2000 are listed and counted but not sought in full text. This departs from the registered eligibility criteria, which set no date limit. The reason is feasibility: most of these reports have no abstract and are expected to be difficult to retrieve. It is not a judgement that older reports are less reliable. Of the 1,091 records on the full-text list, 485 fall under this rule (162 of them are also in languages other than English and Chinese). One of the 45 piloted reports with individual patient data (published 1998, one child) falls under the rule and will not be extracted; the effect on the results is unknown.</w:t>
+      </w:r>
+    </w:p>
+    <w:p>
+      <w:pPr>
+        <w:spacing w:after="60" w:line="300"/>
+        <w:ind w:left="360"/>
+        <w:jc w:val="left"/>
+      </w:pPr>
+      <w:r>
+        <w:rPr>
+          <w:rFonts w:ascii="Times New Roman" w:cs="Times New Roman" w:eastAsia="SimSun" w:hAnsi="Times New Roman"/>
+          <w:sz w:val="22"/>
+          <w:szCs w:val="22"/>
+        </w:rPr>
+        <w:t xml:space="preserve">• </w:t>
+      </w:r>
+      <w:r>
+        <w:rPr>
+          <w:rFonts w:ascii="Times New Roman" w:cs="Times New Roman" w:eastAsia="SimSun" w:hAnsi="Times New Roman"/>
+          <w:b/>
+          <w:bCs/>
+          <w:sz w:val="22"/>
+          <w:szCs w:val="22"/>
+        </w:rPr>
+        <w:t xml:space="preserve">Language. </w:t>
+      </w:r>
+      <w:r>
+        <w:rPr>
+          <w:rFonts w:ascii="Times New Roman" w:cs="Times New Roman" w:eastAsia="SimSun" w:hAnsi="Times New Roman"/>
+          <w:sz w:val="22"/>
+          <w:szCs w:val="22"/>
+        </w:rPr>
+        <w:t xml:space="preserve">Records published in 2000 or later in languages other than English and Chinese (66) are listed and counted, not retrieved, as registered.</w:t>
+      </w:r>
+    </w:p>
+    <w:p>
+      <w:pPr>
+        <w:spacing w:after="60" w:line="300"/>
+        <w:ind w:left="360"/>
+        <w:jc w:val="left"/>
+      </w:pPr>
+      <w:r>
+        <w:rPr>
+          <w:rFonts w:ascii="Times New Roman" w:cs="Times New Roman" w:eastAsia="SimSun" w:hAnsi="Times New Roman"/>
+          <w:sz w:val="22"/>
+          <w:szCs w:val="22"/>
+        </w:rPr>
+        <w:t xml:space="preserve">• </w:t>
+      </w:r>
+      <w:r>
+        <w:rPr>
+          <w:rFonts w:ascii="Times New Roman" w:cs="Times New Roman" w:eastAsia="SimSun" w:hAnsi="Times New Roman"/>
+          <w:b/>
+          <w:bCs/>
+          <w:sz w:val="22"/>
+          <w:szCs w:val="22"/>
+        </w:rPr>
+        <w:t xml:space="preserve">Records sought. </w:t>
+      </w:r>
+      <w:r>
+        <w:rPr>
+          <w:rFonts w:ascii="Times New Roman" w:cs="Times New Roman" w:eastAsia="SimSun" w:hAnsi="Times New Roman"/>
+          <w:sz w:val="22"/>
+          <w:szCs w:val="22"/>
+        </w:rPr>
+        <w:t xml:space="preserve">The full-text list has 1,091 records: the 1,064 above plus 27 records that the adjudicator excluded as ‘no original patient data’ but the second reviewer had advanced. These 27 are assessed in full text, as a departure from the rule that the adjudicator's decision settles a disagreement, because a judgement about study design made on an abstract can hide a case series. Of the 1,091, 540 are to be retrieved (439 in English, 101 in Chinese; 362 with an abstract), 485 are not sought (published before 2000) and 66 are in other languages.</w:t>
+      </w:r>
+    </w:p>
+    <w:p>
+      <w:pPr>
+        <w:spacing w:after="60" w:line="300"/>
+        <w:ind w:left="360"/>
+        <w:jc w:val="left"/>
+      </w:pPr>
+      <w:r>
+        <w:rPr>
+          <w:rFonts w:ascii="Times New Roman" w:cs="Times New Roman" w:eastAsia="SimSun" w:hAnsi="Times New Roman"/>
+          <w:sz w:val="22"/>
+          <w:szCs w:val="22"/>
+        </w:rPr>
+        <w:t xml:space="preserve">• </w:t>
+      </w:r>
+      <w:r>
+        <w:rPr>
+          <w:rFonts w:ascii="Times New Roman" w:cs="Times New Roman" w:eastAsia="SimSun" w:hAnsi="Times New Roman"/>
+          <w:b/>
+          <w:bCs/>
+          <w:sz w:val="22"/>
+          <w:szCs w:val="22"/>
+        </w:rPr>
+        <w:t xml:space="preserve">Reviewers and records. </w:t>
+      </w:r>
+      <w:r>
+        <w:rPr>
+          <w:rFonts w:ascii="Times New Roman" w:cs="Times New Roman" w:eastAsia="SimSun" w:hAnsi="Times New Roman"/>
+          <w:sz w:val="22"/>
+          <w:szCs w:val="22"/>
+        </w:rPr>
+        <w:t xml:space="preserve">Full-text assessment is done by Jun Shu and Hongqiang Bian, with Jun Yang as adjudicator; the second reviewer is therefore not the one registered. Each reviewer keeps a separate spreadsheet log (decision, reason, routes tried to obtain the full text, number of children with individual data) and a log of working times, instead of using Rayyan, and neither sees the other's file until both have finished. After the first 50 reports each reviewer gives the file to the adjudicator for a check of format and pace. Before formal full-text assessment both reviewers assess the same 20 reports, drawn at random with a fixed seed (20261018) and including at least three Chinese-language reports, two reviews, three series and some reports that describe torsion without stating the position of the spleen, and discuss the differences; only raw agreement is reported for these 20.</w:t>
+      </w:r>
+    </w:p>
+    <w:p>
+      <w:pPr>
+        <w:spacing w:after="60" w:line="300"/>
+        <w:ind w:left="360"/>
+        <w:jc w:val="left"/>
+      </w:pPr>
+      <w:r>
+        <w:rPr>
+          <w:rFonts w:ascii="Times New Roman" w:cs="Times New Roman" w:eastAsia="SimSun" w:hAnsi="Times New Roman"/>
+          <w:sz w:val="22"/>
+          <w:szCs w:val="22"/>
+        </w:rPr>
+        <w:t xml:space="preserve">• </w:t>
+      </w:r>
+      <w:r>
+        <w:rPr>
+          <w:rFonts w:ascii="Times New Roman" w:cs="Times New Roman" w:eastAsia="SimSun" w:hAnsi="Times New Roman"/>
+          <w:b/>
+          <w:bCs/>
+          <w:sz w:val="22"/>
+          <w:szCs w:val="22"/>
+        </w:rPr>
+        <w:t xml:space="preserve">Decision rules. </w:t>
+      </w:r>
+      <w:r>
+        <w:rPr>
+          <w:rFonts w:ascii="Times New Roman" w:cs="Times New Roman" w:eastAsia="SimSun" w:hAnsi="Times New Roman"/>
+          <w:sz w:val="22"/>
+          <w:szCs w:val="22"/>
+        </w:rPr>
+        <w:t xml:space="preserve">Each report receives one decision: Include, Exclude, or Pending IPD (a report that gives only aggregate data on children while individual data are requested). An Exclude decision carries one reason, chosen in a fixed order: published before 2000; other language; full text not obtained; not a formal article; no original patient data; non-human; not wandering spleen; adults only; aggregate data only; age not confirmed as under 18; other. Two Exclude decisions with different reasons are not a disagreement. Any other difference, including Include against Pending IPD, is settled by discussion and, failing agreement, by the adjudicator. A full text is declared unobtainable only if both reviewers have tried all routes (publisher or open-access page, library subscription, document delivery or inter-library loan, CNKI or Wanfang for Chinese reports, and contacting the corresponding author) and both have failed. A report in which the spleen is only herniated into the chest or displaced by a mass, without a diagnosis of wandering spleen or a mobile pedicle, is excluded as not wandering spleen. A report of a child with splenic pedicle torsion that does not state the position of the spleen or the state of its ligaments is included and flagged, unless the authors state that the spleen was in its normal position with intact ligaments, or give another cause. A report that describes patients only as children, without an age, is taken to concern patients younger than 18 years; a report that describes them only as adolescents is not.</w:t>
+      </w:r>
+    </w:p>
+    <w:p>
+      <w:pPr>
+        <w:spacing w:after="60" w:line="300"/>
+        <w:ind w:left="360"/>
+        <w:jc w:val="left"/>
+      </w:pPr>
+      <w:r>
+        <w:rPr>
+          <w:rFonts w:ascii="Times New Roman" w:cs="Times New Roman" w:eastAsia="SimSun" w:hAnsi="Times New Roman"/>
+          <w:sz w:val="22"/>
+          <w:szCs w:val="22"/>
+        </w:rPr>
+        <w:t xml:space="preserve">• </w:t>
+      </w:r>
+      <w:r>
+        <w:rPr>
+          <w:rFonts w:ascii="Times New Roman" w:cs="Times New Roman" w:eastAsia="SimSun" w:hAnsi="Times New Roman"/>
+          <w:b/>
+          <w:bCs/>
+          <w:sz w:val="22"/>
+          <w:szCs w:val="22"/>
+        </w:rPr>
+        <w:t xml:space="preserve">Requests for individual data. </w:t>
+      </w:r>
+      <w:r>
+        <w:rPr>
+          <w:rFonts w:ascii="Times New Roman" w:cs="Times New Roman" w:eastAsia="SimSun" w:hAnsi="Times New Roman"/>
+          <w:sz w:val="22"/>
+          <w:szCs w:val="22"/>
+        </w:rPr>
+        <w:t xml:space="preserve">Once the full-text assessment has identified the reports that give aggregate data only, the corresponding authors are emailed on the same day and again four weeks later. Four weeks after the second email, a report for which no individual data have arrived (at most eight weeks after the first email) is described narratively and is not included in the quantitative analysis. Only the items of Appendix C are requested, without names, hospital numbers, dates of birth or exact dates. Data supplied by authors are kept outside the public repository.</w:t>
+      </w:r>
+    </w:p>
+    <w:p>
+      <w:pPr>
+        <w:spacing w:after="60" w:line="300"/>
+        <w:ind w:left="360"/>
+        <w:jc w:val="left"/>
+      </w:pPr>
+      <w:r>
+        <w:rPr>
+          <w:rFonts w:ascii="Times New Roman" w:cs="Times New Roman" w:eastAsia="SimSun" w:hAnsi="Times New Roman"/>
+          <w:sz w:val="22"/>
+          <w:szCs w:val="22"/>
+        </w:rPr>
+        <w:t xml:space="preserve">• </w:t>
+      </w:r>
+      <w:r>
+        <w:rPr>
+          <w:rFonts w:ascii="Times New Roman" w:cs="Times New Roman" w:eastAsia="SimSun" w:hAnsi="Times New Roman"/>
+          <w:b/>
+          <w:bCs/>
+          <w:sz w:val="22"/>
+          <w:szCs w:val="22"/>
+        </w:rPr>
+        <w:t xml:space="preserve">Reviews and reference lists. </w:t>
+      </w:r>
+      <w:r>
+        <w:rPr>
+          <w:rFonts w:ascii="Times New Roman" w:cs="Times New Roman" w:eastAsia="SimSun" w:hAnsi="Times New Roman"/>
+          <w:sz w:val="22"/>
+          <w:szCs w:val="22"/>
+        </w:rPr>
+        <w:t xml:space="preserve">Cases listed in the tables of reviews are not extracted. A limited check of reference lists will be made for the previous reviews named in Appendix A8, except Allen and Andrews 1989, which falls under the date rule: their references are matched automatically against the 2,548 screened records, and only the references that do not match are read. Reference lists of other reviews are not checked; this is a limitation.</w:t>
+      </w:r>
+    </w:p>
+    <w:p>
+      <w:pPr>
+        <w:spacing w:after="120" w:line="300"/>
+        <w:jc w:val="both"/>
+      </w:pPr>
+      <w:r>
+        <w:rPr>
+          <w:rFonts w:ascii="Times New Roman" w:cs="Times New Roman" w:eastAsia="SimSun" w:hAnsi="Times New Roman"/>
+          <w:sz w:val="22"/>
+          <w:szCs w:val="22"/>
+        </w:rPr>
+        <w:t xml:space="preserve">Two reviewers will independently extract data for every included patient with the form in Appendix C, after calibration on 10 reports; they have not yet been chosen and will be named in the PROSPERO record before extraction starts. Agreement on the primary exposure and the primary outcome will be reported as Cohen's kappa. Where a report describes several patients only in aggregate, the corresponding author will be emailed twice, four weeks apart, to request individual data; if none are supplied, the report will be described narratively.</w:t>
       </w:r>
     </w:p>
     <w:p>
@@ -2958,7 +3251,7 @@
           <w:sz w:val="22"/>
           <w:szCs w:val="22"/>
         </w:rPr>
-        <w:t xml:space="preserve">One-stage logistic regression of a non-viable spleen on log2-transformed index-episode duration, with cluster-robust standard errors by report, adjusted for age (years) and period of publication (before 2000, 2000–2014, 2015 onward). Degree of torsion and infarction lie on the causal pathway and will not be adjusted for. If the number of events allows at least 10 events per model degree of freedom, non-linearity will be examined with a restricted cubic spline with three knots.</w:t>
+        <w:t xml:space="preserve">One-stage logistic regression of a non-viable spleen on log2-transformed index-episode duration, with cluster-robust standard errors by report, adjusted for age (years) and period of publication (2000–2014, 2015 onward; the category ‘before 2000’ of the registered plan no longer applies because reports published before 2000 are not sought, see Section 14). Degree of torsion and infarction lie on the causal pathway and will not be adjusted for. If the number of events allows at least 10 events per model degree of freedom, non-linearity will be examined with a restricted cubic spline with three knots.</w:t>
       </w:r>
     </w:p>
     <w:p>
@@ -3284,7 +3577,7 @@
           <w:sz w:val="22"/>
           <w:szCs w:val="22"/>
         </w:rPr>
-        <w:t xml:space="preserve">7. Excluding reports published before 2000.</w:t>
+        <w:t xml:space="preserve">7. Excluding reports published before 2000 (no longer applicable from version 1.5, because reports published before 2000 are not sought; Section 14).</w:t>
       </w:r>
     </w:p>
     <w:p>
@@ -3300,6 +3593,20 @@
           <w:szCs w:val="22"/>
         </w:rPr>
         <w:t xml:space="preserve">8. Mixed-effects logistic regression with a random intercept for each report.</w:t>
+      </w:r>
+    </w:p>
+    <w:p>
+      <w:pPr>
+        <w:spacing w:after="120" w:before="80" w:line="300"/>
+        <w:jc w:val="both"/>
+      </w:pPr>
+      <w:r>
+        <w:rPr>
+          <w:rFonts w:ascii="Times New Roman" w:cs="Times New Roman" w:eastAsia="SimSun" w:hAnsi="Times New Roman"/>
+          <w:sz w:val="22"/>
+          <w:szCs w:val="22"/>
+        </w:rPr>
+        <w:t xml:space="preserve">Additional analysis, not in the registered plan (added in version 1.5, and reported as such): omitting patients who were included on the basis of splenic pedicle torsion without a stated position of the spleen (the ‘flagged’ reports of Section 14).</w:t>
       </w:r>
     </w:p>
     <w:p>
@@ -4639,7 +4946,7 @@
           <w:sz w:val="20"/>
           <w:szCs w:val="20"/>
         </w:rPr>
-        <w:t xml:space="preserve">Status on 4 October 2026: the supplementary sources were not completed. (1) Google Scholar was not searched: Google returned its unusual-traffic block page and no results were seen. (2) Forward citation searching of Ganarin et al. 2021 was started on 4 October 2026 (Jun Shu): the cited-by lists in Web of Science and in Scopus each showed 13 documents, but the lists were not exported and therefore were not screened. (3) Backward citation searching of the reference lists of the previous reviews listed above was not done. (4) Backward citation searching of the included reports depends on the final included set and has not started. No record from these sources entered the screening set, which consists of the six database searches in A1 and A3 to A7. The omissions are reported as deviations from the registered protocol in the PROSPERO amendment, the Methods and the Limitations.</w:t>
+        <w:t xml:space="preserve">Status on 4 October 2026: the supplementary sources were not completed. (1) Google Scholar was not searched: Google returned its unusual-traffic block page and no results were seen. (2) Forward citation searching of Ganarin et al. 2021 was started on 4 October 2026 (Jun Shu): the cited-by lists in Web of Science and in Scopus each showed 13 documents, but the lists were not exported and therefore were not screened. (3) Backward citation searching of the reference lists of the previous reviews listed above was not done. (4) Backward citation searching of the included reports depends on the final included set and has not started. No record from these sources entered the screening set, which consists of the six database searches in A1 and A3 to A7. The omissions are reported as deviations from the registered protocol in the PROSPERO amendment, the Methods and the Limitations. Update of 18 October 2026: a limited check of the reference lists of the previous reviews listed above (except Allen and Andrews 1989, see Section 14) is planned for the full-text stage; it has not been done.</w:t>
       </w:r>
     </w:p>
     <w:p>
@@ -8971,6 +9278,1324 @@
         <w:t xml:space="preserve">9. When a report gives symptom duration at admission but not the timing of operation within the admission: an operation described as immediate or emergency adds nothing; an operation on hospital day N adds N days; otherwise the duration at admission is used and flagged as a lower bound.</w:t>
       </w:r>
     </w:p>
+    <w:p>
+      <w:pPr>
+        <w:spacing w:after="140" w:before="320" w:line="300"/>
+        <w:jc w:val="left"/>
+      </w:pPr>
+      <w:r>
+        <w:rPr>
+          <w:rFonts w:ascii="Times New Roman" w:cs="Times New Roman" w:eastAsia="SimSun" w:hAnsi="Times New Roman"/>
+          <w:b/>
+          <w:bCs/>
+          <w:sz w:val="26"/>
+          <w:szCs w:val="26"/>
+        </w:rPr>
+        <w:t xml:space="preserve">Appendix D. Screening log (as run, to 18 October 2026)</w:t>
+      </w:r>
+    </w:p>
+    <w:p>
+      <w:pPr>
+        <w:spacing w:after="120" w:line="300"/>
+        <w:jc w:val="both"/>
+      </w:pPr>
+      <w:r>
+        <w:rPr>
+          <w:rFonts w:ascii="Times New Roman" w:cs="Times New Roman" w:eastAsia="SimSun" w:hAnsi="Times New Roman"/>
+          <w:sz w:val="20"/>
+          <w:szCs w:val="20"/>
+        </w:rPr>
+        <w:t xml:space="preserve">Counts use the first reviewer's decisions with the rule of 16 October 2026 applied (310 Exclude decisions without a reason treated as Maybe) and the second reviewer's decisions of 17 October 2026 (Section 14).</w:t>
+      </w:r>
+    </w:p>
+    <w:tbl>
+      <w:tblPr>
+        <w:tblW w:type="dxa" w:w="8600"/>
+        <w:tblBorders>
+          <w:top w:val="single" w:color="auto" w:sz="4"/>
+          <w:left w:val="single" w:color="auto" w:sz="4"/>
+          <w:bottom w:val="single" w:color="auto" w:sz="4"/>
+          <w:right w:val="single" w:color="auto" w:sz="4"/>
+          <w:insideH w:val="single" w:color="auto" w:sz="4"/>
+          <w:insideV w:val="single" w:color="auto" w:sz="4"/>
+        </w:tblBorders>
+      </w:tblPr>
+      <w:tblGrid>
+        <w:gridCol w:w="4300"/>
+        <w:gridCol w:w="1000"/>
+        <w:gridCol w:w="3300"/>
+      </w:tblGrid>
+      <w:tr>
+        <w:trPr>
+          <w:tblHeader/>
+        </w:trPr>
+        <w:tc>
+          <w:tcPr>
+            <w:tcW w:type="dxa" w:w="4300"/>
+            <w:shd w:fill="E7E6E6" w:val="clear"/>
+            <w:tcMar>
+              <w:top w:type="dxa" w:w="40"/>
+              <w:left w:type="dxa" w:w="80"/>
+              <w:bottom w:type="dxa" w:w="40"/>
+              <w:right w:type="dxa" w:w="80"/>
+            </w:tcMar>
+          </w:tcPr>
+          <w:p>
+            <w:pPr>
+              <w:spacing w:after="0" w:line="240"/>
+            </w:pPr>
+            <w:r>
+              <w:rPr>
+                <w:rFonts w:ascii="Times New Roman" w:cs="Times New Roman" w:eastAsia="SimSun" w:hAnsi="Times New Roman"/>
+                <w:b/>
+                <w:bCs/>
+                <w:sz w:val="18"/>
+                <w:szCs w:val="18"/>
+              </w:rPr>
+              <w:t xml:space="preserve">Step</w:t>
+            </w:r>
+          </w:p>
+        </w:tc>
+        <w:tc>
+          <w:tcPr>
+            <w:tcW w:type="dxa" w:w="1000"/>
+            <w:shd w:fill="E7E6E6" w:val="clear"/>
+            <w:tcMar>
+              <w:top w:type="dxa" w:w="40"/>
+              <w:left w:type="dxa" w:w="80"/>
+              <w:bottom w:type="dxa" w:w="40"/>
+              <w:right w:type="dxa" w:w="80"/>
+            </w:tcMar>
+          </w:tcPr>
+          <w:p>
+            <w:pPr>
+              <w:spacing w:after="0" w:line="240"/>
+            </w:pPr>
+            <w:r>
+              <w:rPr>
+                <w:rFonts w:ascii="Times New Roman" w:cs="Times New Roman" w:eastAsia="SimSun" w:hAnsi="Times New Roman"/>
+                <w:b/>
+                <w:bCs/>
+                <w:sz w:val="18"/>
+                <w:szCs w:val="18"/>
+              </w:rPr>
+              <w:t xml:space="preserve">Records</w:t>
+            </w:r>
+          </w:p>
+        </w:tc>
+        <w:tc>
+          <w:tcPr>
+            <w:tcW w:type="dxa" w:w="3300"/>
+            <w:shd w:fill="E7E6E6" w:val="clear"/>
+            <w:tcMar>
+              <w:top w:type="dxa" w:w="40"/>
+              <w:left w:type="dxa" w:w="80"/>
+              <w:bottom w:type="dxa" w:w="40"/>
+              <w:right w:type="dxa" w:w="80"/>
+            </w:tcMar>
+          </w:tcPr>
+          <w:p>
+            <w:pPr>
+              <w:spacing w:after="0" w:line="240"/>
+            </w:pPr>
+            <w:r>
+              <w:rPr>
+                <w:rFonts w:ascii="Times New Roman" w:cs="Times New Roman" w:eastAsia="SimSun" w:hAnsi="Times New Roman"/>
+                <w:b/>
+                <w:bCs/>
+                <w:sz w:val="18"/>
+                <w:szCs w:val="18"/>
+              </w:rPr>
+              <w:t xml:space="preserve">Note</w:t>
+            </w:r>
+          </w:p>
+        </w:tc>
+      </w:tr>
+      <w:tr>
+        <w:tc>
+          <w:tcPr>
+            <w:tcW w:type="dxa" w:w="4300"/>
+            <w:tcMar>
+              <w:top w:type="dxa" w:w="40"/>
+              <w:left w:type="dxa" w:w="80"/>
+              <w:bottom w:type="dxa" w:w="40"/>
+              <w:right w:type="dxa" w:w="80"/>
+            </w:tcMar>
+          </w:tcPr>
+          <w:p>
+            <w:pPr>
+              <w:spacing w:after="0" w:line="240"/>
+            </w:pPr>
+            <w:r>
+              <w:rPr>
+                <w:rFonts w:ascii="Times New Roman" w:cs="Times New Roman" w:eastAsia="SimSun" w:hAnsi="Times New Roman"/>
+                <w:sz w:val="18"/>
+                <w:szCs w:val="18"/>
+              </w:rPr>
+              <w:t xml:space="preserve">Records identified in six databases</w:t>
+            </w:r>
+          </w:p>
+        </w:tc>
+        <w:tc>
+          <w:tcPr>
+            <w:tcW w:type="dxa" w:w="1000"/>
+            <w:tcMar>
+              <w:top w:type="dxa" w:w="40"/>
+              <w:left w:type="dxa" w:w="80"/>
+              <w:bottom w:type="dxa" w:w="40"/>
+              <w:right w:type="dxa" w:w="80"/>
+            </w:tcMar>
+          </w:tcPr>
+          <w:p>
+            <w:pPr>
+              <w:spacing w:after="0" w:line="240"/>
+            </w:pPr>
+            <w:r>
+              <w:rPr>
+                <w:rFonts w:ascii="Times New Roman" w:cs="Times New Roman" w:eastAsia="SimSun" w:hAnsi="Times New Roman"/>
+                <w:sz w:val="18"/>
+                <w:szCs w:val="18"/>
+              </w:rPr>
+              <w:t xml:space="preserve">4906</w:t>
+            </w:r>
+          </w:p>
+        </w:tc>
+        <w:tc>
+          <w:tcPr>
+            <w:tcW w:type="dxa" w:w="3300"/>
+            <w:tcMar>
+              <w:top w:type="dxa" w:w="40"/>
+              <w:left w:type="dxa" w:w="80"/>
+              <w:bottom w:type="dxa" w:w="40"/>
+              <w:right w:type="dxa" w:w="80"/>
+            </w:tcMar>
+          </w:tcPr>
+          <w:p>
+            <w:pPr>
+              <w:spacing w:after="0" w:line="240"/>
+            </w:pPr>
+            <w:r>
+              <w:rPr>
+                <w:rFonts w:ascii="Times New Roman" w:cs="Times New Roman" w:eastAsia="SimSun" w:hAnsi="Times New Roman"/>
+                <w:sz w:val="18"/>
+                <w:szCs w:val="18"/>
+              </w:rPr>
+              <w:t xml:space="preserve">Appendix B</w:t>
+            </w:r>
+          </w:p>
+        </w:tc>
+      </w:tr>
+      <w:tr>
+        <w:tc>
+          <w:tcPr>
+            <w:tcW w:type="dxa" w:w="4300"/>
+            <w:tcMar>
+              <w:top w:type="dxa" w:w="40"/>
+              <w:left w:type="dxa" w:w="80"/>
+              <w:bottom w:type="dxa" w:w="40"/>
+              <w:right w:type="dxa" w:w="80"/>
+            </w:tcMar>
+          </w:tcPr>
+          <w:p>
+            <w:pPr>
+              <w:spacing w:after="0" w:line="240"/>
+            </w:pPr>
+            <w:r>
+              <w:rPr>
+                <w:rFonts w:ascii="Times New Roman" w:cs="Times New Roman" w:eastAsia="SimSun" w:hAnsi="Times New Roman"/>
+                <w:sz w:val="18"/>
+                <w:szCs w:val="18"/>
+              </w:rPr>
+              <w:t xml:space="preserve">Duplicates removed</w:t>
+            </w:r>
+          </w:p>
+        </w:tc>
+        <w:tc>
+          <w:tcPr>
+            <w:tcW w:type="dxa" w:w="1000"/>
+            <w:tcMar>
+              <w:top w:type="dxa" w:w="40"/>
+              <w:left w:type="dxa" w:w="80"/>
+              <w:bottom w:type="dxa" w:w="40"/>
+              <w:right w:type="dxa" w:w="80"/>
+            </w:tcMar>
+          </w:tcPr>
+          <w:p>
+            <w:pPr>
+              <w:spacing w:after="0" w:line="240"/>
+            </w:pPr>
+            <w:r>
+              <w:rPr>
+                <w:rFonts w:ascii="Times New Roman" w:cs="Times New Roman" w:eastAsia="SimSun" w:hAnsi="Times New Roman"/>
+                <w:sz w:val="18"/>
+                <w:szCs w:val="18"/>
+              </w:rPr>
+              <w:t xml:space="preserve">2358</w:t>
+            </w:r>
+          </w:p>
+        </w:tc>
+        <w:tc>
+          <w:tcPr>
+            <w:tcW w:type="dxa" w:w="3300"/>
+            <w:tcMar>
+              <w:top w:type="dxa" w:w="40"/>
+              <w:left w:type="dxa" w:w="80"/>
+              <w:bottom w:type="dxa" w:w="40"/>
+              <w:right w:type="dxa" w:w="80"/>
+            </w:tcMar>
+          </w:tcPr>
+          <w:p>
+            <w:pPr>
+              <w:spacing w:after="0" w:line="240"/>
+            </w:pPr>
+            <w:r>
+              <w:rPr>
+                <w:rFonts w:ascii="Times New Roman" w:cs="Times New Roman" w:eastAsia="SimSun" w:hAnsi="Times New Roman"/>
+                <w:sz w:val="18"/>
+                <w:szCs w:val="18"/>
+              </w:rPr>
+              <w:t xml:space="preserve"/>
+            </w:r>
+          </w:p>
+        </w:tc>
+      </w:tr>
+      <w:tr>
+        <w:tc>
+          <w:tcPr>
+            <w:tcW w:type="dxa" w:w="4300"/>
+            <w:tcMar>
+              <w:top w:type="dxa" w:w="40"/>
+              <w:left w:type="dxa" w:w="80"/>
+              <w:bottom w:type="dxa" w:w="40"/>
+              <w:right w:type="dxa" w:w="80"/>
+            </w:tcMar>
+          </w:tcPr>
+          <w:p>
+            <w:pPr>
+              <w:spacing w:after="0" w:line="240"/>
+            </w:pPr>
+            <w:r>
+              <w:rPr>
+                <w:rFonts w:ascii="Times New Roman" w:cs="Times New Roman" w:eastAsia="SimSun" w:hAnsi="Times New Roman"/>
+                <w:sz w:val="18"/>
+                <w:szCs w:val="18"/>
+              </w:rPr>
+              <w:t xml:space="preserve">Records screened (title and abstract)</w:t>
+            </w:r>
+          </w:p>
+        </w:tc>
+        <w:tc>
+          <w:tcPr>
+            <w:tcW w:type="dxa" w:w="1000"/>
+            <w:tcMar>
+              <w:top w:type="dxa" w:w="40"/>
+              <w:left w:type="dxa" w:w="80"/>
+              <w:bottom w:type="dxa" w:w="40"/>
+              <w:right w:type="dxa" w:w="80"/>
+            </w:tcMar>
+          </w:tcPr>
+          <w:p>
+            <w:pPr>
+              <w:spacing w:after="0" w:line="240"/>
+            </w:pPr>
+            <w:r>
+              <w:rPr>
+                <w:rFonts w:ascii="Times New Roman" w:cs="Times New Roman" w:eastAsia="SimSun" w:hAnsi="Times New Roman"/>
+                <w:sz w:val="18"/>
+                <w:szCs w:val="18"/>
+              </w:rPr>
+              <w:t xml:space="preserve">2548</w:t>
+            </w:r>
+          </w:p>
+        </w:tc>
+        <w:tc>
+          <w:tcPr>
+            <w:tcW w:type="dxa" w:w="3300"/>
+            <w:tcMar>
+              <w:top w:type="dxa" w:w="40"/>
+              <w:left w:type="dxa" w:w="80"/>
+              <w:bottom w:type="dxa" w:w="40"/>
+              <w:right w:type="dxa" w:w="80"/>
+            </w:tcMar>
+          </w:tcPr>
+          <w:p>
+            <w:pPr>
+              <w:spacing w:after="0" w:line="240"/>
+            </w:pPr>
+            <w:r>
+              <w:rPr>
+                <w:rFonts w:ascii="Times New Roman" w:cs="Times New Roman" w:eastAsia="SimSun" w:hAnsi="Times New Roman"/>
+                <w:sz w:val="18"/>
+                <w:szCs w:val="18"/>
+              </w:rPr>
+              <w:t xml:space="preserve"/>
+            </w:r>
+          </w:p>
+        </w:tc>
+      </w:tr>
+      <w:tr>
+        <w:tc>
+          <w:tcPr>
+            <w:tcW w:type="dxa" w:w="4300"/>
+            <w:tcMar>
+              <w:top w:type="dxa" w:w="40"/>
+              <w:left w:type="dxa" w:w="80"/>
+              <w:bottom w:type="dxa" w:w="40"/>
+              <w:right w:type="dxa" w:w="80"/>
+            </w:tcMar>
+          </w:tcPr>
+          <w:p>
+            <w:pPr>
+              <w:spacing w:after="0" w:line="240"/>
+            </w:pPr>
+            <w:r>
+              <w:rPr>
+                <w:rFonts w:ascii="Times New Roman" w:cs="Times New Roman" w:eastAsia="SimSun" w:hAnsi="Times New Roman"/>
+                <w:sz w:val="18"/>
+                <w:szCs w:val="18"/>
+              </w:rPr>
+              <w:t xml:space="preserve">Advanced by both reviewers</w:t>
+            </w:r>
+          </w:p>
+        </w:tc>
+        <w:tc>
+          <w:tcPr>
+            <w:tcW w:type="dxa" w:w="1000"/>
+            <w:tcMar>
+              <w:top w:type="dxa" w:w="40"/>
+              <w:left w:type="dxa" w:w="80"/>
+              <w:bottom w:type="dxa" w:w="40"/>
+              <w:right w:type="dxa" w:w="80"/>
+            </w:tcMar>
+          </w:tcPr>
+          <w:p>
+            <w:pPr>
+              <w:spacing w:after="0" w:line="240"/>
+            </w:pPr>
+            <w:r>
+              <w:rPr>
+                <w:rFonts w:ascii="Times New Roman" w:cs="Times New Roman" w:eastAsia="SimSun" w:hAnsi="Times New Roman"/>
+                <w:sz w:val="18"/>
+                <w:szCs w:val="18"/>
+              </w:rPr>
+              <w:t xml:space="preserve">762</w:t>
+            </w:r>
+          </w:p>
+        </w:tc>
+        <w:tc>
+          <w:tcPr>
+            <w:tcW w:type="dxa" w:w="3300"/>
+            <w:tcMar>
+              <w:top w:type="dxa" w:w="40"/>
+              <w:left w:type="dxa" w:w="80"/>
+              <w:bottom w:type="dxa" w:w="40"/>
+              <w:right w:type="dxa" w:w="80"/>
+            </w:tcMar>
+          </w:tcPr>
+          <w:p>
+            <w:pPr>
+              <w:spacing w:after="0" w:line="240"/>
+            </w:pPr>
+            <w:r>
+              <w:rPr>
+                <w:rFonts w:ascii="Times New Roman" w:cs="Times New Roman" w:eastAsia="SimSun" w:hAnsi="Times New Roman"/>
+                <w:sz w:val="18"/>
+                <w:szCs w:val="18"/>
+              </w:rPr>
+              <w:t xml:space="preserve"/>
+            </w:r>
+          </w:p>
+        </w:tc>
+      </w:tr>
+      <w:tr>
+        <w:tc>
+          <w:tcPr>
+            <w:tcW w:type="dxa" w:w="4300"/>
+            <w:tcMar>
+              <w:top w:type="dxa" w:w="40"/>
+              <w:left w:type="dxa" w:w="80"/>
+              <w:bottom w:type="dxa" w:w="40"/>
+              <w:right w:type="dxa" w:w="80"/>
+            </w:tcMar>
+          </w:tcPr>
+          <w:p>
+            <w:pPr>
+              <w:spacing w:after="0" w:line="240"/>
+            </w:pPr>
+            <w:r>
+              <w:rPr>
+                <w:rFonts w:ascii="Times New Roman" w:cs="Times New Roman" w:eastAsia="SimSun" w:hAnsi="Times New Roman"/>
+                <w:sz w:val="18"/>
+                <w:szCs w:val="18"/>
+              </w:rPr>
+              <w:t xml:space="preserve">Disagreements (one reviewer excluded, the other did not)</w:t>
+            </w:r>
+          </w:p>
+        </w:tc>
+        <w:tc>
+          <w:tcPr>
+            <w:tcW w:type="dxa" w:w="1000"/>
+            <w:tcMar>
+              <w:top w:type="dxa" w:w="40"/>
+              <w:left w:type="dxa" w:w="80"/>
+              <w:bottom w:type="dxa" w:w="40"/>
+              <w:right w:type="dxa" w:w="80"/>
+            </w:tcMar>
+          </w:tcPr>
+          <w:p>
+            <w:pPr>
+              <w:spacing w:after="0" w:line="240"/>
+            </w:pPr>
+            <w:r>
+              <w:rPr>
+                <w:rFonts w:ascii="Times New Roman" w:cs="Times New Roman" w:eastAsia="SimSun" w:hAnsi="Times New Roman"/>
+                <w:sz w:val="18"/>
+                <w:szCs w:val="18"/>
+              </w:rPr>
+              <w:t xml:space="preserve">734</w:t>
+            </w:r>
+          </w:p>
+        </w:tc>
+        <w:tc>
+          <w:tcPr>
+            <w:tcW w:type="dxa" w:w="3300"/>
+            <w:tcMar>
+              <w:top w:type="dxa" w:w="40"/>
+              <w:left w:type="dxa" w:w="80"/>
+              <w:bottom w:type="dxa" w:w="40"/>
+              <w:right w:type="dxa" w:w="80"/>
+            </w:tcMar>
+          </w:tcPr>
+          <w:p>
+            <w:pPr>
+              <w:spacing w:after="0" w:line="240"/>
+            </w:pPr>
+            <w:r>
+              <w:rPr>
+                <w:rFonts w:ascii="Times New Roman" w:cs="Times New Roman" w:eastAsia="SimSun" w:hAnsi="Times New Roman"/>
+                <w:sz w:val="18"/>
+                <w:szCs w:val="18"/>
+              </w:rPr>
+              <w:t xml:space="preserve">Adjudicator: 248 advanced, 486 excluded</w:t>
+            </w:r>
+          </w:p>
+        </w:tc>
+      </w:tr>
+      <w:tr>
+        <w:tc>
+          <w:tcPr>
+            <w:tcW w:type="dxa" w:w="4300"/>
+            <w:tcMar>
+              <w:top w:type="dxa" w:w="40"/>
+              <w:left w:type="dxa" w:w="80"/>
+              <w:bottom w:type="dxa" w:w="40"/>
+              <w:right w:type="dxa" w:w="80"/>
+            </w:tcMar>
+          </w:tcPr>
+          <w:p>
+            <w:pPr>
+              <w:spacing w:after="0" w:line="240"/>
+            </w:pPr>
+            <w:r>
+              <w:rPr>
+                <w:rFonts w:ascii="Times New Roman" w:cs="Times New Roman" w:eastAsia="SimSun" w:hAnsi="Times New Roman"/>
+                <w:sz w:val="18"/>
+                <w:szCs w:val="18"/>
+              </w:rPr>
+              <w:t xml:space="preserve">Excluded by both, flagged by a word rule or lacking an abstract</w:t>
+            </w:r>
+          </w:p>
+        </w:tc>
+        <w:tc>
+          <w:tcPr>
+            <w:tcW w:type="dxa" w:w="1000"/>
+            <w:tcMar>
+              <w:top w:type="dxa" w:w="40"/>
+              <w:left w:type="dxa" w:w="80"/>
+              <w:bottom w:type="dxa" w:w="40"/>
+              <w:right w:type="dxa" w:w="80"/>
+            </w:tcMar>
+          </w:tcPr>
+          <w:p>
+            <w:pPr>
+              <w:spacing w:after="0" w:line="240"/>
+            </w:pPr>
+            <w:r>
+              <w:rPr>
+                <w:rFonts w:ascii="Times New Roman" w:cs="Times New Roman" w:eastAsia="SimSun" w:hAnsi="Times New Roman"/>
+                <w:sz w:val="18"/>
+                <w:szCs w:val="18"/>
+              </w:rPr>
+              <w:t xml:space="preserve">192</w:t>
+            </w:r>
+          </w:p>
+        </w:tc>
+        <w:tc>
+          <w:tcPr>
+            <w:tcW w:type="dxa" w:w="3300"/>
+            <w:tcMar>
+              <w:top w:type="dxa" w:w="40"/>
+              <w:left w:type="dxa" w:w="80"/>
+              <w:bottom w:type="dxa" w:w="40"/>
+              <w:right w:type="dxa" w:w="80"/>
+            </w:tcMar>
+          </w:tcPr>
+          <w:p>
+            <w:pPr>
+              <w:spacing w:after="0" w:line="240"/>
+            </w:pPr>
+            <w:r>
+              <w:rPr>
+                <w:rFonts w:ascii="Times New Roman" w:cs="Times New Roman" w:eastAsia="SimSun" w:hAnsi="Times New Roman"/>
+                <w:sz w:val="18"/>
+                <w:szCs w:val="18"/>
+              </w:rPr>
+              <w:t xml:space="preserve">93 + 99; adjudicator advanced 42 (3 + 39)</w:t>
+            </w:r>
+          </w:p>
+        </w:tc>
+      </w:tr>
+      <w:tr>
+        <w:tc>
+          <w:tcPr>
+            <w:tcW w:type="dxa" w:w="4300"/>
+            <w:tcMar>
+              <w:top w:type="dxa" w:w="40"/>
+              <w:left w:type="dxa" w:w="80"/>
+              <w:bottom w:type="dxa" w:w="40"/>
+              <w:right w:type="dxa" w:w="80"/>
+            </w:tcMar>
+          </w:tcPr>
+          <w:p>
+            <w:pPr>
+              <w:spacing w:after="0" w:line="240"/>
+            </w:pPr>
+            <w:r>
+              <w:rPr>
+                <w:rFonts w:ascii="Times New Roman" w:cs="Times New Roman" w:eastAsia="SimSun" w:hAnsi="Times New Roman"/>
+                <w:sz w:val="18"/>
+                <w:szCs w:val="18"/>
+              </w:rPr>
+              <w:t xml:space="preserve">Excluded by both, random sample</w:t>
+            </w:r>
+          </w:p>
+        </w:tc>
+        <w:tc>
+          <w:tcPr>
+            <w:tcW w:type="dxa" w:w="1000"/>
+            <w:tcMar>
+              <w:top w:type="dxa" w:w="40"/>
+              <w:left w:type="dxa" w:w="80"/>
+              <w:bottom w:type="dxa" w:w="40"/>
+              <w:right w:type="dxa" w:w="80"/>
+            </w:tcMar>
+          </w:tcPr>
+          <w:p>
+            <w:pPr>
+              <w:spacing w:after="0" w:line="240"/>
+            </w:pPr>
+            <w:r>
+              <w:rPr>
+                <w:rFonts w:ascii="Times New Roman" w:cs="Times New Roman" w:eastAsia="SimSun" w:hAnsi="Times New Roman"/>
+                <w:sz w:val="18"/>
+                <w:szCs w:val="18"/>
+              </w:rPr>
+              <w:t xml:space="preserve">60</w:t>
+            </w:r>
+          </w:p>
+        </w:tc>
+        <w:tc>
+          <w:tcPr>
+            <w:tcW w:type="dxa" w:w="3300"/>
+            <w:tcMar>
+              <w:top w:type="dxa" w:w="40"/>
+              <w:left w:type="dxa" w:w="80"/>
+              <w:bottom w:type="dxa" w:w="40"/>
+              <w:right w:type="dxa" w:w="80"/>
+            </w:tcMar>
+          </w:tcPr>
+          <w:p>
+            <w:pPr>
+              <w:spacing w:after="0" w:line="240"/>
+            </w:pPr>
+            <w:r>
+              <w:rPr>
+                <w:rFonts w:ascii="Times New Roman" w:cs="Times New Roman" w:eastAsia="SimSun" w:hAnsi="Times New Roman"/>
+                <w:sz w:val="18"/>
+                <w:szCs w:val="18"/>
+              </w:rPr>
+              <w:t xml:space="preserve">Adjudicator advanced none</w:t>
+            </w:r>
+          </w:p>
+        </w:tc>
+      </w:tr>
+      <w:tr>
+        <w:tc>
+          <w:tcPr>
+            <w:tcW w:type="dxa" w:w="4300"/>
+            <w:tcMar>
+              <w:top w:type="dxa" w:w="40"/>
+              <w:left w:type="dxa" w:w="80"/>
+              <w:bottom w:type="dxa" w:w="40"/>
+              <w:right w:type="dxa" w:w="80"/>
+            </w:tcMar>
+          </w:tcPr>
+          <w:p>
+            <w:pPr>
+              <w:spacing w:after="0" w:line="240"/>
+            </w:pPr>
+            <w:r>
+              <w:rPr>
+                <w:rFonts w:ascii="Times New Roman" w:cs="Times New Roman" w:eastAsia="SimSun" w:hAnsi="Times New Roman"/>
+                <w:sz w:val="18"/>
+                <w:szCs w:val="18"/>
+              </w:rPr>
+              <w:t xml:space="preserve">Excluded by both, further judged after the pre-fixed rule was met</w:t>
+            </w:r>
+          </w:p>
+        </w:tc>
+        <w:tc>
+          <w:tcPr>
+            <w:tcW w:type="dxa" w:w="1000"/>
+            <w:tcMar>
+              <w:top w:type="dxa" w:w="40"/>
+              <w:left w:type="dxa" w:w="80"/>
+              <w:bottom w:type="dxa" w:w="40"/>
+              <w:right w:type="dxa" w:w="80"/>
+            </w:tcMar>
+          </w:tcPr>
+          <w:p>
+            <w:pPr>
+              <w:spacing w:after="0" w:line="240"/>
+            </w:pPr>
+            <w:r>
+              <w:rPr>
+                <w:rFonts w:ascii="Times New Roman" w:cs="Times New Roman" w:eastAsia="SimSun" w:hAnsi="Times New Roman"/>
+                <w:sz w:val="18"/>
+                <w:szCs w:val="18"/>
+              </w:rPr>
+              <w:t xml:space="preserve">616</w:t>
+            </w:r>
+          </w:p>
+        </w:tc>
+        <w:tc>
+          <w:tcPr>
+            <w:tcW w:type="dxa" w:w="3300"/>
+            <w:tcMar>
+              <w:top w:type="dxa" w:w="40"/>
+              <w:left w:type="dxa" w:w="80"/>
+              <w:bottom w:type="dxa" w:w="40"/>
+              <w:right w:type="dxa" w:w="80"/>
+            </w:tcMar>
+          </w:tcPr>
+          <w:p>
+            <w:pPr>
+              <w:spacing w:after="0" w:line="240"/>
+            </w:pPr>
+            <w:r>
+              <w:rPr>
+                <w:rFonts w:ascii="Times New Roman" w:cs="Times New Roman" w:eastAsia="SimSun" w:hAnsi="Times New Roman"/>
+                <w:sz w:val="18"/>
+                <w:szCs w:val="18"/>
+              </w:rPr>
+              <w:t xml:space="preserve">Adjudicator advanced 12</w:t>
+            </w:r>
+          </w:p>
+        </w:tc>
+      </w:tr>
+      <w:tr>
+        <w:tc>
+          <w:tcPr>
+            <w:tcW w:type="dxa" w:w="4300"/>
+            <w:tcMar>
+              <w:top w:type="dxa" w:w="40"/>
+              <w:left w:type="dxa" w:w="80"/>
+              <w:bottom w:type="dxa" w:w="40"/>
+              <w:right w:type="dxa" w:w="80"/>
+            </w:tcMar>
+          </w:tcPr>
+          <w:p>
+            <w:pPr>
+              <w:spacing w:after="0" w:line="240"/>
+            </w:pPr>
+            <w:r>
+              <w:rPr>
+                <w:rFonts w:ascii="Times New Roman" w:cs="Times New Roman" w:eastAsia="SimSun" w:hAnsi="Times New Roman"/>
+                <w:sz w:val="18"/>
+                <w:szCs w:val="18"/>
+              </w:rPr>
+              <w:t xml:space="preserve">Excluded by both as non-human or not a formal article, not re-judged</w:t>
+            </w:r>
+          </w:p>
+        </w:tc>
+        <w:tc>
+          <w:tcPr>
+            <w:tcW w:type="dxa" w:w="1000"/>
+            <w:tcMar>
+              <w:top w:type="dxa" w:w="40"/>
+              <w:left w:type="dxa" w:w="80"/>
+              <w:bottom w:type="dxa" w:w="40"/>
+              <w:right w:type="dxa" w:w="80"/>
+            </w:tcMar>
+          </w:tcPr>
+          <w:p>
+            <w:pPr>
+              <w:spacing w:after="0" w:line="240"/>
+            </w:pPr>
+            <w:r>
+              <w:rPr>
+                <w:rFonts w:ascii="Times New Roman" w:cs="Times New Roman" w:eastAsia="SimSun" w:hAnsi="Times New Roman"/>
+                <w:sz w:val="18"/>
+                <w:szCs w:val="18"/>
+              </w:rPr>
+              <w:t xml:space="preserve">184</w:t>
+            </w:r>
+          </w:p>
+        </w:tc>
+        <w:tc>
+          <w:tcPr>
+            <w:tcW w:type="dxa" w:w="3300"/>
+            <w:tcMar>
+              <w:top w:type="dxa" w:w="40"/>
+              <w:left w:type="dxa" w:w="80"/>
+              <w:bottom w:type="dxa" w:w="40"/>
+              <w:right w:type="dxa" w:w="80"/>
+            </w:tcMar>
+          </w:tcPr>
+          <w:p>
+            <w:pPr>
+              <w:spacing w:after="0" w:line="240"/>
+            </w:pPr>
+            <w:r>
+              <w:rPr>
+                <w:rFonts w:ascii="Times New Roman" w:cs="Times New Roman" w:eastAsia="SimSun" w:hAnsi="Times New Roman"/>
+                <w:sz w:val="18"/>
+                <w:szCs w:val="18"/>
+              </w:rPr>
+              <w:t xml:space="preserve"/>
+            </w:r>
+          </w:p>
+        </w:tc>
+      </w:tr>
+      <w:tr>
+        <w:tc>
+          <w:tcPr>
+            <w:tcW w:type="dxa" w:w="4300"/>
+            <w:tcMar>
+              <w:top w:type="dxa" w:w="40"/>
+              <w:left w:type="dxa" w:w="80"/>
+              <w:bottom w:type="dxa" w:w="40"/>
+              <w:right w:type="dxa" w:w="80"/>
+            </w:tcMar>
+          </w:tcPr>
+          <w:p>
+            <w:pPr>
+              <w:spacing w:after="0" w:line="240"/>
+            </w:pPr>
+            <w:r>
+              <w:rPr>
+                <w:rFonts w:ascii="Times New Roman" w:cs="Times New Roman" w:eastAsia="SimSun" w:hAnsi="Times New Roman"/>
+                <w:sz w:val="18"/>
+                <w:szCs w:val="18"/>
+              </w:rPr>
+              <w:t xml:space="preserve">Advanced to full-text assessment</w:t>
+            </w:r>
+          </w:p>
+        </w:tc>
+        <w:tc>
+          <w:tcPr>
+            <w:tcW w:type="dxa" w:w="1000"/>
+            <w:tcMar>
+              <w:top w:type="dxa" w:w="40"/>
+              <w:left w:type="dxa" w:w="80"/>
+              <w:bottom w:type="dxa" w:w="40"/>
+              <w:right w:type="dxa" w:w="80"/>
+            </w:tcMar>
+          </w:tcPr>
+          <w:p>
+            <w:pPr>
+              <w:spacing w:after="0" w:line="240"/>
+            </w:pPr>
+            <w:r>
+              <w:rPr>
+                <w:rFonts w:ascii="Times New Roman" w:cs="Times New Roman" w:eastAsia="SimSun" w:hAnsi="Times New Roman"/>
+                <w:sz w:val="18"/>
+                <w:szCs w:val="18"/>
+              </w:rPr>
+              <w:t xml:space="preserve">1064</w:t>
+            </w:r>
+          </w:p>
+        </w:tc>
+        <w:tc>
+          <w:tcPr>
+            <w:tcW w:type="dxa" w:w="3300"/>
+            <w:tcMar>
+              <w:top w:type="dxa" w:w="40"/>
+              <w:left w:type="dxa" w:w="80"/>
+              <w:bottom w:type="dxa" w:w="40"/>
+              <w:right w:type="dxa" w:w="80"/>
+            </w:tcMar>
+          </w:tcPr>
+          <w:p>
+            <w:pPr>
+              <w:spacing w:after="0" w:line="240"/>
+            </w:pPr>
+            <w:r>
+              <w:rPr>
+                <w:rFonts w:ascii="Times New Roman" w:cs="Times New Roman" w:eastAsia="SimSun" w:hAnsi="Times New Roman"/>
+                <w:sz w:val="18"/>
+                <w:szCs w:val="18"/>
+              </w:rPr>
+              <w:t xml:space="preserve">762 + 248 + 42 + 12</w:t>
+            </w:r>
+          </w:p>
+        </w:tc>
+      </w:tr>
+      <w:tr>
+        <w:tc>
+          <w:tcPr>
+            <w:tcW w:type="dxa" w:w="4300"/>
+            <w:tcMar>
+              <w:top w:type="dxa" w:w="40"/>
+              <w:left w:type="dxa" w:w="80"/>
+              <w:bottom w:type="dxa" w:w="40"/>
+              <w:right w:type="dxa" w:w="80"/>
+            </w:tcMar>
+          </w:tcPr>
+          <w:p>
+            <w:pPr>
+              <w:spacing w:after="0" w:line="240"/>
+            </w:pPr>
+            <w:r>
+              <w:rPr>
+                <w:rFonts w:ascii="Times New Roman" w:cs="Times New Roman" w:eastAsia="SimSun" w:hAnsi="Times New Roman"/>
+                <w:sz w:val="18"/>
+                <w:szCs w:val="18"/>
+              </w:rPr>
+              <w:t xml:space="preserve">Excluded at title and abstract stage</w:t>
+            </w:r>
+          </w:p>
+        </w:tc>
+        <w:tc>
+          <w:tcPr>
+            <w:tcW w:type="dxa" w:w="1000"/>
+            <w:tcMar>
+              <w:top w:type="dxa" w:w="40"/>
+              <w:left w:type="dxa" w:w="80"/>
+              <w:bottom w:type="dxa" w:w="40"/>
+              <w:right w:type="dxa" w:w="80"/>
+            </w:tcMar>
+          </w:tcPr>
+          <w:p>
+            <w:pPr>
+              <w:spacing w:after="0" w:line="240"/>
+            </w:pPr>
+            <w:r>
+              <w:rPr>
+                <w:rFonts w:ascii="Times New Roman" w:cs="Times New Roman" w:eastAsia="SimSun" w:hAnsi="Times New Roman"/>
+                <w:sz w:val="18"/>
+                <w:szCs w:val="18"/>
+              </w:rPr>
+              <w:t xml:space="preserve">1484</w:t>
+            </w:r>
+          </w:p>
+        </w:tc>
+        <w:tc>
+          <w:tcPr>
+            <w:tcW w:type="dxa" w:w="3300"/>
+            <w:tcMar>
+              <w:top w:type="dxa" w:w="40"/>
+              <w:left w:type="dxa" w:w="80"/>
+              <w:bottom w:type="dxa" w:w="40"/>
+              <w:right w:type="dxa" w:w="80"/>
+            </w:tcMar>
+          </w:tcPr>
+          <w:p>
+            <w:pPr>
+              <w:spacing w:after="0" w:line="240"/>
+            </w:pPr>
+            <w:r>
+              <w:rPr>
+                <w:rFonts w:ascii="Times New Roman" w:cs="Times New Roman" w:eastAsia="SimSun" w:hAnsi="Times New Roman"/>
+                <w:sz w:val="18"/>
+                <w:szCs w:val="18"/>
+              </w:rPr>
+              <w:t xml:space="preserve"/>
+            </w:r>
+          </w:p>
+        </w:tc>
+      </w:tr>
+      <w:tr>
+        <w:tc>
+          <w:tcPr>
+            <w:tcW w:type="dxa" w:w="4300"/>
+            <w:tcMar>
+              <w:top w:type="dxa" w:w="40"/>
+              <w:left w:type="dxa" w:w="80"/>
+              <w:bottom w:type="dxa" w:w="40"/>
+              <w:right w:type="dxa" w:w="80"/>
+            </w:tcMar>
+          </w:tcPr>
+          <w:p>
+            <w:pPr>
+              <w:spacing w:after="0" w:line="240"/>
+            </w:pPr>
+            <w:r>
+              <w:rPr>
+                <w:rFonts w:ascii="Times New Roman" w:cs="Times New Roman" w:eastAsia="SimSun" w:hAnsi="Times New Roman"/>
+                <w:sz w:val="18"/>
+                <w:szCs w:val="18"/>
+              </w:rPr>
+              <w:t xml:space="preserve">Added: excluded by the adjudicator as ‘no original patient data’, advanced by the second reviewer</w:t>
+            </w:r>
+          </w:p>
+        </w:tc>
+        <w:tc>
+          <w:tcPr>
+            <w:tcW w:type="dxa" w:w="1000"/>
+            <w:tcMar>
+              <w:top w:type="dxa" w:w="40"/>
+              <w:left w:type="dxa" w:w="80"/>
+              <w:bottom w:type="dxa" w:w="40"/>
+              <w:right w:type="dxa" w:w="80"/>
+            </w:tcMar>
+          </w:tcPr>
+          <w:p>
+            <w:pPr>
+              <w:spacing w:after="0" w:line="240"/>
+            </w:pPr>
+            <w:r>
+              <w:rPr>
+                <w:rFonts w:ascii="Times New Roman" w:cs="Times New Roman" w:eastAsia="SimSun" w:hAnsi="Times New Roman"/>
+                <w:sz w:val="18"/>
+                <w:szCs w:val="18"/>
+              </w:rPr>
+              <w:t xml:space="preserve">27</w:t>
+            </w:r>
+          </w:p>
+        </w:tc>
+        <w:tc>
+          <w:tcPr>
+            <w:tcW w:type="dxa" w:w="3300"/>
+            <w:tcMar>
+              <w:top w:type="dxa" w:w="40"/>
+              <w:left w:type="dxa" w:w="80"/>
+              <w:bottom w:type="dxa" w:w="40"/>
+              <w:right w:type="dxa" w:w="80"/>
+            </w:tcMar>
+          </w:tcPr>
+          <w:p>
+            <w:pPr>
+              <w:spacing w:after="0" w:line="240"/>
+            </w:pPr>
+            <w:r>
+              <w:rPr>
+                <w:rFonts w:ascii="Times New Roman" w:cs="Times New Roman" w:eastAsia="SimSun" w:hAnsi="Times New Roman"/>
+                <w:sz w:val="18"/>
+                <w:szCs w:val="18"/>
+              </w:rPr>
+              <w:t xml:space="preserve">Assessed in full text (Section 14)</w:t>
+            </w:r>
+          </w:p>
+        </w:tc>
+      </w:tr>
+      <w:tr>
+        <w:tc>
+          <w:tcPr>
+            <w:tcW w:type="dxa" w:w="4300"/>
+            <w:tcMar>
+              <w:top w:type="dxa" w:w="40"/>
+              <w:left w:type="dxa" w:w="80"/>
+              <w:bottom w:type="dxa" w:w="40"/>
+              <w:right w:type="dxa" w:w="80"/>
+            </w:tcMar>
+          </w:tcPr>
+          <w:p>
+            <w:pPr>
+              <w:spacing w:after="0" w:line="240"/>
+            </w:pPr>
+            <w:r>
+              <w:rPr>
+                <w:rFonts w:ascii="Times New Roman" w:cs="Times New Roman" w:eastAsia="SimSun" w:hAnsi="Times New Roman"/>
+                <w:sz w:val="18"/>
+                <w:szCs w:val="18"/>
+              </w:rPr>
+              <w:t xml:space="preserve">Records on the full-text list</w:t>
+            </w:r>
+          </w:p>
+        </w:tc>
+        <w:tc>
+          <w:tcPr>
+            <w:tcW w:type="dxa" w:w="1000"/>
+            <w:tcMar>
+              <w:top w:type="dxa" w:w="40"/>
+              <w:left w:type="dxa" w:w="80"/>
+              <w:bottom w:type="dxa" w:w="40"/>
+              <w:right w:type="dxa" w:w="80"/>
+            </w:tcMar>
+          </w:tcPr>
+          <w:p>
+            <w:pPr>
+              <w:spacing w:after="0" w:line="240"/>
+            </w:pPr>
+            <w:r>
+              <w:rPr>
+                <w:rFonts w:ascii="Times New Roman" w:cs="Times New Roman" w:eastAsia="SimSun" w:hAnsi="Times New Roman"/>
+                <w:sz w:val="18"/>
+                <w:szCs w:val="18"/>
+              </w:rPr>
+              <w:t xml:space="preserve">1091</w:t>
+            </w:r>
+          </w:p>
+        </w:tc>
+        <w:tc>
+          <w:tcPr>
+            <w:tcW w:type="dxa" w:w="3300"/>
+            <w:tcMar>
+              <w:top w:type="dxa" w:w="40"/>
+              <w:left w:type="dxa" w:w="80"/>
+              <w:bottom w:type="dxa" w:w="40"/>
+              <w:right w:type="dxa" w:w="80"/>
+            </w:tcMar>
+          </w:tcPr>
+          <w:p>
+            <w:pPr>
+              <w:spacing w:after="0" w:line="240"/>
+            </w:pPr>
+            <w:r>
+              <w:rPr>
+                <w:rFonts w:ascii="Times New Roman" w:cs="Times New Roman" w:eastAsia="SimSun" w:hAnsi="Times New Roman"/>
+                <w:sz w:val="18"/>
+                <w:szCs w:val="18"/>
+              </w:rPr>
+              <w:t xml:space="preserve">1064 + 27</w:t>
+            </w:r>
+          </w:p>
+        </w:tc>
+      </w:tr>
+      <w:tr>
+        <w:tc>
+          <w:tcPr>
+            <w:tcW w:type="dxa" w:w="4300"/>
+            <w:tcMar>
+              <w:top w:type="dxa" w:w="40"/>
+              <w:left w:type="dxa" w:w="80"/>
+              <w:bottom w:type="dxa" w:w="40"/>
+              <w:right w:type="dxa" w:w="80"/>
+            </w:tcMar>
+          </w:tcPr>
+          <w:p>
+            <w:pPr>
+              <w:spacing w:after="0" w:line="240"/>
+            </w:pPr>
+            <w:r>
+              <w:rPr>
+                <w:rFonts w:ascii="Times New Roman" w:cs="Times New Roman" w:eastAsia="SimSun" w:hAnsi="Times New Roman"/>
+                <w:sz w:val="18"/>
+                <w:szCs w:val="18"/>
+              </w:rPr>
+              <w:t xml:space="preserve">   Not sought: published before 2000</w:t>
+            </w:r>
+          </w:p>
+        </w:tc>
+        <w:tc>
+          <w:tcPr>
+            <w:tcW w:type="dxa" w:w="1000"/>
+            <w:tcMar>
+              <w:top w:type="dxa" w:w="40"/>
+              <w:left w:type="dxa" w:w="80"/>
+              <w:bottom w:type="dxa" w:w="40"/>
+              <w:right w:type="dxa" w:w="80"/>
+            </w:tcMar>
+          </w:tcPr>
+          <w:p>
+            <w:pPr>
+              <w:spacing w:after="0" w:line="240"/>
+            </w:pPr>
+            <w:r>
+              <w:rPr>
+                <w:rFonts w:ascii="Times New Roman" w:cs="Times New Roman" w:eastAsia="SimSun" w:hAnsi="Times New Roman"/>
+                <w:sz w:val="18"/>
+                <w:szCs w:val="18"/>
+              </w:rPr>
+              <w:t xml:space="preserve">485</w:t>
+            </w:r>
+          </w:p>
+        </w:tc>
+        <w:tc>
+          <w:tcPr>
+            <w:tcW w:type="dxa" w:w="3300"/>
+            <w:tcMar>
+              <w:top w:type="dxa" w:w="40"/>
+              <w:left w:type="dxa" w:w="80"/>
+              <w:bottom w:type="dxa" w:w="40"/>
+              <w:right w:type="dxa" w:w="80"/>
+            </w:tcMar>
+          </w:tcPr>
+          <w:p>
+            <w:pPr>
+              <w:spacing w:after="0" w:line="240"/>
+            </w:pPr>
+            <w:r>
+              <w:rPr>
+                <w:rFonts w:ascii="Times New Roman" w:cs="Times New Roman" w:eastAsia="SimSun" w:hAnsi="Times New Roman"/>
+                <w:sz w:val="18"/>
+                <w:szCs w:val="18"/>
+              </w:rPr>
+              <w:t xml:space="preserve">Date rule (Section 14)</w:t>
+            </w:r>
+          </w:p>
+        </w:tc>
+      </w:tr>
+      <w:tr>
+        <w:tc>
+          <w:tcPr>
+            <w:tcW w:type="dxa" w:w="4300"/>
+            <w:tcMar>
+              <w:top w:type="dxa" w:w="40"/>
+              <w:left w:type="dxa" w:w="80"/>
+              <w:bottom w:type="dxa" w:w="40"/>
+              <w:right w:type="dxa" w:w="80"/>
+            </w:tcMar>
+          </w:tcPr>
+          <w:p>
+            <w:pPr>
+              <w:spacing w:after="0" w:line="240"/>
+            </w:pPr>
+            <w:r>
+              <w:rPr>
+                <w:rFonts w:ascii="Times New Roman" w:cs="Times New Roman" w:eastAsia="SimSun" w:hAnsi="Times New Roman"/>
+                <w:sz w:val="18"/>
+                <w:szCs w:val="18"/>
+              </w:rPr>
+              <w:t xml:space="preserve">   Not retrieved: other language, published 2000 or later</w:t>
+            </w:r>
+          </w:p>
+        </w:tc>
+        <w:tc>
+          <w:tcPr>
+            <w:tcW w:type="dxa" w:w="1000"/>
+            <w:tcMar>
+              <w:top w:type="dxa" w:w="40"/>
+              <w:left w:type="dxa" w:w="80"/>
+              <w:bottom w:type="dxa" w:w="40"/>
+              <w:right w:type="dxa" w:w="80"/>
+            </w:tcMar>
+          </w:tcPr>
+          <w:p>
+            <w:pPr>
+              <w:spacing w:after="0" w:line="240"/>
+            </w:pPr>
+            <w:r>
+              <w:rPr>
+                <w:rFonts w:ascii="Times New Roman" w:cs="Times New Roman" w:eastAsia="SimSun" w:hAnsi="Times New Roman"/>
+                <w:sz w:val="18"/>
+                <w:szCs w:val="18"/>
+              </w:rPr>
+              <w:t xml:space="preserve">66</w:t>
+            </w:r>
+          </w:p>
+        </w:tc>
+        <w:tc>
+          <w:tcPr>
+            <w:tcW w:type="dxa" w:w="3300"/>
+            <w:tcMar>
+              <w:top w:type="dxa" w:w="40"/>
+              <w:left w:type="dxa" w:w="80"/>
+              <w:bottom w:type="dxa" w:w="40"/>
+              <w:right w:type="dxa" w:w="80"/>
+            </w:tcMar>
+          </w:tcPr>
+          <w:p>
+            <w:pPr>
+              <w:spacing w:after="0" w:line="240"/>
+            </w:pPr>
+            <w:r>
+              <w:rPr>
+                <w:rFonts w:ascii="Times New Roman" w:cs="Times New Roman" w:eastAsia="SimSun" w:hAnsi="Times New Roman"/>
+                <w:sz w:val="18"/>
+                <w:szCs w:val="18"/>
+              </w:rPr>
+              <w:t xml:space="preserve">Listed and counted</w:t>
+            </w:r>
+          </w:p>
+        </w:tc>
+      </w:tr>
+      <w:tr>
+        <w:tc>
+          <w:tcPr>
+            <w:tcW w:type="dxa" w:w="4300"/>
+            <w:tcMar>
+              <w:top w:type="dxa" w:w="40"/>
+              <w:left w:type="dxa" w:w="80"/>
+              <w:bottom w:type="dxa" w:w="40"/>
+              <w:right w:type="dxa" w:w="80"/>
+            </w:tcMar>
+          </w:tcPr>
+          <w:p>
+            <w:pPr>
+              <w:spacing w:after="0" w:line="240"/>
+            </w:pPr>
+            <w:r>
+              <w:rPr>
+                <w:rFonts w:ascii="Times New Roman" w:cs="Times New Roman" w:eastAsia="SimSun" w:hAnsi="Times New Roman"/>
+                <w:sz w:val="18"/>
+                <w:szCs w:val="18"/>
+              </w:rPr>
+              <w:t xml:space="preserve">   To be retrieved</w:t>
+            </w:r>
+          </w:p>
+        </w:tc>
+        <w:tc>
+          <w:tcPr>
+            <w:tcW w:type="dxa" w:w="1000"/>
+            <w:tcMar>
+              <w:top w:type="dxa" w:w="40"/>
+              <w:left w:type="dxa" w:w="80"/>
+              <w:bottom w:type="dxa" w:w="40"/>
+              <w:right w:type="dxa" w:w="80"/>
+            </w:tcMar>
+          </w:tcPr>
+          <w:p>
+            <w:pPr>
+              <w:spacing w:after="0" w:line="240"/>
+            </w:pPr>
+            <w:r>
+              <w:rPr>
+                <w:rFonts w:ascii="Times New Roman" w:cs="Times New Roman" w:eastAsia="SimSun" w:hAnsi="Times New Roman"/>
+                <w:sz w:val="18"/>
+                <w:szCs w:val="18"/>
+              </w:rPr>
+              <w:t xml:space="preserve">540</w:t>
+            </w:r>
+          </w:p>
+        </w:tc>
+        <w:tc>
+          <w:tcPr>
+            <w:tcW w:type="dxa" w:w="3300"/>
+            <w:tcMar>
+              <w:top w:type="dxa" w:w="40"/>
+              <w:left w:type="dxa" w:w="80"/>
+              <w:bottom w:type="dxa" w:w="40"/>
+              <w:right w:type="dxa" w:w="80"/>
+            </w:tcMar>
+          </w:tcPr>
+          <w:p>
+            <w:pPr>
+              <w:spacing w:after="0" w:line="240"/>
+            </w:pPr>
+            <w:r>
+              <w:rPr>
+                <w:rFonts w:ascii="Times New Roman" w:cs="Times New Roman" w:eastAsia="SimSun" w:hAnsi="Times New Roman"/>
+                <w:sz w:val="18"/>
+                <w:szCs w:val="18"/>
+              </w:rPr>
+              <w:t xml:space="preserve">439 English, 101 Chinese; 362 with an abstract</w:t>
+            </w:r>
+          </w:p>
+        </w:tc>
+      </w:tr>
+    </w:tbl>
     <w:sectPr>
       <w:pgSz w:w="11906" w:h="16838" w:orient="portrait"/>
       <w:pgMar w:top="1300" w:right="1300" w:bottom="1300" w:left="1300" w:header="708" w:footer="708" w:gutter="0"/>

</xml_diff>